<commit_message>
Updated Documentation Section 4 and References
</commit_message>
<xml_diff>
--- a/Documentaions/24090531-Hyndavi-Yasarapu FPR.docx
+++ b/Documentaions/24090531-Hyndavi-Yasarapu FPR.docx
@@ -3323,6 +3323,7 @@
         <w:keepLines w:val="0"/>
         <w:widowControl/>
         <w:numPr>
+          <w:ilvl w:val="0"/>
           <w:numId w:val="0"/>
         </w:numPr>
         <w:suppressLineNumbers w:val="0"/>
@@ -3424,6 +3425,34 @@
         </w:rPr>
         <w:t>From reactive blacklist-based methods to interpretable rule-based heuristics to high-accuracy machine learning and hybrid systems, the literature clearly shows a trend. The best machine learning algorithm for URL-based phishing detection is always Random Forest, but hybrid approaches routinely outperform single techniques. The current project fills important research needs in the areas of integrated comparison, dataset standardisation, hybrid strategy evaluation, and real-time performance assessment.</w:t>
       </w:r>
+    </w:p>
+    <w:p>
+      <w:pPr>
+        <w:jc w:val="both"/>
+        <w:rPr>
+          <w:rFonts w:hint="default" w:ascii="Times New Roman" w:hAnsi="Times New Roman" w:eastAsia="Arial" w:cs="Times New Roman"/>
+          <w:b/>
+          <w:bCs/>
+          <w:color w:val="auto"/>
+          <w:sz w:val="28"/>
+          <w:szCs w:val="28"/>
+          <w:lang w:val="en-GB"/>
+        </w:rPr>
+      </w:pPr>
+    </w:p>
+    <w:p>
+      <w:pPr>
+        <w:jc w:val="both"/>
+        <w:rPr>
+          <w:rFonts w:hint="default" w:ascii="Times New Roman" w:hAnsi="Times New Roman" w:eastAsia="Arial" w:cs="Times New Roman"/>
+          <w:b/>
+          <w:bCs/>
+          <w:color w:val="auto"/>
+          <w:sz w:val="28"/>
+          <w:szCs w:val="28"/>
+          <w:lang w:val="en-GB"/>
+        </w:rPr>
+      </w:pPr>
     </w:p>
     <w:p>
       <w:pPr>
@@ -3691,8 +3720,6 @@
         <w:rPr>
           <w:rFonts w:hint="default" w:ascii="Times New Roman" w:hAnsi="Times New Roman" w:cs="Times New Roman"/>
           <w:color w:val="auto"/>
-          <w:sz w:val="24"/>
-          <w:szCs w:val="24"/>
         </w:rPr>
       </w:pPr>
       <w:r>
@@ -3742,41 +3769,6 @@
         </w:rPr>
         <w:t>Each component may be created, tested, and assessed separately before integration thanks to the modular architecture. The comparative assessment framework, which is essential to the study design, is supported, unit testing is made easier, and performance bottlenecks may be systematically identified.</w:t>
       </w:r>
-    </w:p>
-    <w:p>
-      <w:pPr>
-        <w:pStyle w:val="3"/>
-        <w:spacing w:before="300" w:after="120"/>
-        <w:rPr>
-          <w:rFonts w:hint="default" w:ascii="Times New Roman" w:hAnsi="Times New Roman" w:eastAsia="Arial" w:cs="Times New Roman"/>
-          <w:b/>
-          <w:bCs/>
-          <w:color w:val="auto"/>
-          <w:sz w:val="28"/>
-          <w:szCs w:val="28"/>
-        </w:rPr>
-      </w:pPr>
-    </w:p>
-    <w:p>
-      <w:pPr>
-        <w:pStyle w:val="3"/>
-        <w:spacing w:before="300" w:after="120"/>
-        <w:rPr>
-          <w:rFonts w:hint="default" w:ascii="Times New Roman" w:hAnsi="Times New Roman" w:eastAsia="Arial" w:cs="Times New Roman"/>
-          <w:b/>
-          <w:bCs/>
-          <w:color w:val="auto"/>
-          <w:sz w:val="28"/>
-          <w:szCs w:val="28"/>
-        </w:rPr>
-      </w:pPr>
-    </w:p>
-    <w:p>
-      <w:pPr>
-        <w:rPr>
-          <w:rFonts w:hint="default"/>
-        </w:rPr>
-      </w:pPr>
     </w:p>
     <w:p>
       <w:pPr>
@@ -3941,6 +3933,7 @@
         <w:keepLines w:val="0"/>
         <w:widowControl/>
         <w:numPr>
+          <w:ilvl w:val="0"/>
           <w:numId w:val="0"/>
         </w:numPr>
         <w:suppressLineNumbers w:val="0"/>
@@ -4135,14 +4128,16 @@
         <w:rPr>
           <w:rFonts w:hint="default" w:ascii="Times New Roman" w:hAnsi="Times New Roman" w:cs="Times New Roman"/>
           <w:color w:val="auto"/>
-        </w:rPr>
-      </w:pPr>
-      <w:r>
-        <w:rPr>
-          <w:rFonts w:hint="default" w:ascii="Times New Roman" w:hAnsi="Times New Roman" w:eastAsia="Arial" w:cs="Times New Roman"/>
-          <w:color w:val="auto"/>
-          <w:sz w:val="22"/>
-          <w:szCs w:val="22"/>
+          <w:sz w:val="24"/>
+          <w:szCs w:val="24"/>
+        </w:rPr>
+      </w:pPr>
+      <w:r>
+        <w:rPr>
+          <w:rFonts w:hint="default" w:ascii="Times New Roman" w:hAnsi="Times New Roman" w:eastAsia="Arial" w:cs="Times New Roman"/>
+          <w:color w:val="auto"/>
+          <w:sz w:val="24"/>
+          <w:szCs w:val="24"/>
         </w:rPr>
         <w:t>URL-based features are computable directly from the URL string without network access, making them the fastest feature category and the most suitable for real-time deployment. Ten features are extracted:</w:t>
       </w:r>
@@ -4213,7 +4208,7 @@
             <w:pPr>
               <w:rPr>
                 <w:rFonts w:hint="default" w:ascii="Times New Roman" w:hAnsi="Times New Roman" w:cs="Times New Roman"/>
-                <w:color w:val="FFFFFF"/>
+                <w:color w:val="auto"/>
               </w:rPr>
             </w:pPr>
             <w:r>
@@ -4221,7 +4216,7 @@
                 <w:rFonts w:hint="default" w:ascii="Times New Roman" w:hAnsi="Times New Roman" w:eastAsia="Arial" w:cs="Times New Roman"/>
                 <w:b/>
                 <w:bCs/>
-                <w:color w:val="FFFFFF"/>
+                <w:color w:val="auto"/>
                 <w:sz w:val="20"/>
                 <w:szCs w:val="20"/>
               </w:rPr>
@@ -4249,7 +4244,7 @@
             <w:pPr>
               <w:rPr>
                 <w:rFonts w:hint="default" w:ascii="Times New Roman" w:hAnsi="Times New Roman" w:cs="Times New Roman"/>
-                <w:color w:val="FFFFFF"/>
+                <w:color w:val="auto"/>
               </w:rPr>
             </w:pPr>
             <w:r>
@@ -4257,7 +4252,7 @@
                 <w:rFonts w:hint="default" w:ascii="Times New Roman" w:hAnsi="Times New Roman" w:eastAsia="Arial" w:cs="Times New Roman"/>
                 <w:b/>
                 <w:bCs/>
-                <w:color w:val="FFFFFF"/>
+                <w:color w:val="auto"/>
                 <w:sz w:val="20"/>
                 <w:szCs w:val="20"/>
               </w:rPr>
@@ -4285,7 +4280,7 @@
             <w:pPr>
               <w:rPr>
                 <w:rFonts w:hint="default" w:ascii="Times New Roman" w:hAnsi="Times New Roman" w:cs="Times New Roman"/>
-                <w:color w:val="FFFFFF"/>
+                <w:color w:val="auto"/>
               </w:rPr>
             </w:pPr>
             <w:r>
@@ -4293,7 +4288,7 @@
                 <w:rFonts w:hint="default" w:ascii="Times New Roman" w:hAnsi="Times New Roman" w:eastAsia="Arial" w:cs="Times New Roman"/>
                 <w:b/>
                 <w:bCs/>
-                <w:color w:val="FFFFFF"/>
+                <w:color w:val="auto"/>
                 <w:sz w:val="20"/>
                 <w:szCs w:val="20"/>
               </w:rPr>
@@ -4339,13 +4334,13 @@
             <w:pPr>
               <w:rPr>
                 <w:rFonts w:hint="default" w:ascii="Times New Roman" w:hAnsi="Times New Roman" w:cs="Times New Roman"/>
-                <w:color w:val="000000"/>
+                <w:color w:val="auto"/>
               </w:rPr>
             </w:pPr>
             <w:r>
               <w:rPr>
                 <w:rFonts w:hint="default" w:ascii="Times New Roman" w:hAnsi="Times New Roman" w:eastAsia="Arial" w:cs="Times New Roman"/>
-                <w:color w:val="000000"/>
+                <w:color w:val="auto"/>
                 <w:sz w:val="20"/>
                 <w:szCs w:val="20"/>
               </w:rPr>
@@ -4373,13 +4368,13 @@
             <w:pPr>
               <w:rPr>
                 <w:rFonts w:hint="default" w:ascii="Times New Roman" w:hAnsi="Times New Roman" w:cs="Times New Roman"/>
-                <w:color w:val="000000"/>
+                <w:color w:val="auto"/>
               </w:rPr>
             </w:pPr>
             <w:r>
               <w:rPr>
                 <w:rFonts w:hint="default" w:ascii="Times New Roman" w:hAnsi="Times New Roman" w:eastAsia="Arial" w:cs="Times New Roman"/>
-                <w:color w:val="000000"/>
+                <w:color w:val="auto"/>
                 <w:sz w:val="20"/>
                 <w:szCs w:val="20"/>
               </w:rPr>
@@ -4407,13 +4402,13 @@
             <w:pPr>
               <w:rPr>
                 <w:rFonts w:hint="default" w:ascii="Times New Roman" w:hAnsi="Times New Roman" w:cs="Times New Roman"/>
-                <w:color w:val="000000"/>
+                <w:color w:val="auto"/>
               </w:rPr>
             </w:pPr>
             <w:r>
               <w:rPr>
                 <w:rFonts w:hint="default" w:ascii="Times New Roman" w:hAnsi="Times New Roman" w:eastAsia="Arial" w:cs="Times New Roman"/>
-                <w:color w:val="000000"/>
+                <w:color w:val="auto"/>
                 <w:sz w:val="20"/>
                 <w:szCs w:val="20"/>
               </w:rPr>
@@ -4459,13 +4454,13 @@
             <w:pPr>
               <w:rPr>
                 <w:rFonts w:hint="default" w:ascii="Times New Roman" w:hAnsi="Times New Roman" w:cs="Times New Roman"/>
-                <w:color w:val="000000"/>
+                <w:color w:val="auto"/>
               </w:rPr>
             </w:pPr>
             <w:r>
               <w:rPr>
                 <w:rFonts w:hint="default" w:ascii="Times New Roman" w:hAnsi="Times New Roman" w:eastAsia="Arial" w:cs="Times New Roman"/>
-                <w:color w:val="000000"/>
+                <w:color w:val="auto"/>
                 <w:sz w:val="20"/>
                 <w:szCs w:val="20"/>
               </w:rPr>
@@ -4493,13 +4488,13 @@
             <w:pPr>
               <w:rPr>
                 <w:rFonts w:hint="default" w:ascii="Times New Roman" w:hAnsi="Times New Roman" w:cs="Times New Roman"/>
-                <w:color w:val="000000"/>
+                <w:color w:val="auto"/>
               </w:rPr>
             </w:pPr>
             <w:r>
               <w:rPr>
                 <w:rFonts w:hint="default" w:ascii="Times New Roman" w:hAnsi="Times New Roman" w:eastAsia="Arial" w:cs="Times New Roman"/>
-                <w:color w:val="000000"/>
+                <w:color w:val="auto"/>
                 <w:sz w:val="20"/>
                 <w:szCs w:val="20"/>
               </w:rPr>
@@ -4527,13 +4522,13 @@
             <w:pPr>
               <w:rPr>
                 <w:rFonts w:hint="default" w:ascii="Times New Roman" w:hAnsi="Times New Roman" w:cs="Times New Roman"/>
-                <w:color w:val="000000"/>
+                <w:color w:val="auto"/>
               </w:rPr>
             </w:pPr>
             <w:r>
               <w:rPr>
                 <w:rFonts w:hint="default" w:ascii="Times New Roman" w:hAnsi="Times New Roman" w:eastAsia="Arial" w:cs="Times New Roman"/>
-                <w:color w:val="000000"/>
+                <w:color w:val="auto"/>
                 <w:sz w:val="20"/>
                 <w:szCs w:val="20"/>
               </w:rPr>
@@ -4579,13 +4574,13 @@
             <w:pPr>
               <w:rPr>
                 <w:rFonts w:hint="default" w:ascii="Times New Roman" w:hAnsi="Times New Roman" w:cs="Times New Roman"/>
-                <w:color w:val="000000"/>
+                <w:color w:val="auto"/>
               </w:rPr>
             </w:pPr>
             <w:r>
               <w:rPr>
                 <w:rFonts w:hint="default" w:ascii="Times New Roman" w:hAnsi="Times New Roman" w:eastAsia="Arial" w:cs="Times New Roman"/>
-                <w:color w:val="000000"/>
+                <w:color w:val="auto"/>
                 <w:sz w:val="20"/>
                 <w:szCs w:val="20"/>
               </w:rPr>
@@ -4613,13 +4608,13 @@
             <w:pPr>
               <w:rPr>
                 <w:rFonts w:hint="default" w:ascii="Times New Roman" w:hAnsi="Times New Roman" w:cs="Times New Roman"/>
-                <w:color w:val="000000"/>
+                <w:color w:val="auto"/>
               </w:rPr>
             </w:pPr>
             <w:r>
               <w:rPr>
                 <w:rFonts w:hint="default" w:ascii="Times New Roman" w:hAnsi="Times New Roman" w:eastAsia="Arial" w:cs="Times New Roman"/>
-                <w:color w:val="000000"/>
+                <w:color w:val="auto"/>
                 <w:sz w:val="20"/>
                 <w:szCs w:val="20"/>
               </w:rPr>
@@ -4647,13 +4642,13 @@
             <w:pPr>
               <w:rPr>
                 <w:rFonts w:hint="default" w:ascii="Times New Roman" w:hAnsi="Times New Roman" w:cs="Times New Roman"/>
-                <w:color w:val="000000"/>
+                <w:color w:val="auto"/>
               </w:rPr>
             </w:pPr>
             <w:r>
               <w:rPr>
                 <w:rFonts w:hint="default" w:ascii="Times New Roman" w:hAnsi="Times New Roman" w:eastAsia="Arial" w:cs="Times New Roman"/>
-                <w:color w:val="000000"/>
+                <w:color w:val="auto"/>
                 <w:sz w:val="20"/>
                 <w:szCs w:val="20"/>
               </w:rPr>
@@ -4699,13 +4694,13 @@
             <w:pPr>
               <w:rPr>
                 <w:rFonts w:hint="default" w:ascii="Times New Roman" w:hAnsi="Times New Roman" w:cs="Times New Roman"/>
-                <w:color w:val="000000"/>
+                <w:color w:val="auto"/>
               </w:rPr>
             </w:pPr>
             <w:r>
               <w:rPr>
                 <w:rFonts w:hint="default" w:ascii="Times New Roman" w:hAnsi="Times New Roman" w:eastAsia="Arial" w:cs="Times New Roman"/>
-                <w:color w:val="000000"/>
+                <w:color w:val="auto"/>
                 <w:sz w:val="20"/>
                 <w:szCs w:val="20"/>
               </w:rPr>
@@ -4733,13 +4728,13 @@
             <w:pPr>
               <w:rPr>
                 <w:rFonts w:hint="default" w:ascii="Times New Roman" w:hAnsi="Times New Roman" w:cs="Times New Roman"/>
-                <w:color w:val="000000"/>
+                <w:color w:val="auto"/>
               </w:rPr>
             </w:pPr>
             <w:r>
               <w:rPr>
                 <w:rFonts w:hint="default" w:ascii="Times New Roman" w:hAnsi="Times New Roman" w:eastAsia="Arial" w:cs="Times New Roman"/>
-                <w:color w:val="000000"/>
+                <w:color w:val="auto"/>
                 <w:sz w:val="20"/>
                 <w:szCs w:val="20"/>
               </w:rPr>
@@ -4767,13 +4762,13 @@
             <w:pPr>
               <w:rPr>
                 <w:rFonts w:hint="default" w:ascii="Times New Roman" w:hAnsi="Times New Roman" w:cs="Times New Roman"/>
-                <w:color w:val="000000"/>
+                <w:color w:val="auto"/>
               </w:rPr>
             </w:pPr>
             <w:r>
               <w:rPr>
                 <w:rFonts w:hint="default" w:ascii="Times New Roman" w:hAnsi="Times New Roman" w:eastAsia="Arial" w:cs="Times New Roman"/>
-                <w:color w:val="000000"/>
+                <w:color w:val="auto"/>
                 <w:sz w:val="20"/>
                 <w:szCs w:val="20"/>
               </w:rPr>
@@ -4819,13 +4814,13 @@
             <w:pPr>
               <w:rPr>
                 <w:rFonts w:hint="default" w:ascii="Times New Roman" w:hAnsi="Times New Roman" w:cs="Times New Roman"/>
-                <w:color w:val="000000"/>
+                <w:color w:val="auto"/>
               </w:rPr>
             </w:pPr>
             <w:r>
               <w:rPr>
                 <w:rFonts w:hint="default" w:ascii="Times New Roman" w:hAnsi="Times New Roman" w:eastAsia="Arial" w:cs="Times New Roman"/>
-                <w:color w:val="000000"/>
+                <w:color w:val="auto"/>
                 <w:sz w:val="20"/>
                 <w:szCs w:val="20"/>
               </w:rPr>
@@ -4853,13 +4848,13 @@
             <w:pPr>
               <w:rPr>
                 <w:rFonts w:hint="default" w:ascii="Times New Roman" w:hAnsi="Times New Roman" w:cs="Times New Roman"/>
-                <w:color w:val="000000"/>
+                <w:color w:val="auto"/>
               </w:rPr>
             </w:pPr>
             <w:r>
               <w:rPr>
                 <w:rFonts w:hint="default" w:ascii="Times New Roman" w:hAnsi="Times New Roman" w:eastAsia="Arial" w:cs="Times New Roman"/>
-                <w:color w:val="000000"/>
+                <w:color w:val="auto"/>
                 <w:sz w:val="20"/>
                 <w:szCs w:val="20"/>
               </w:rPr>
@@ -4887,13 +4882,13 @@
             <w:pPr>
               <w:rPr>
                 <w:rFonts w:hint="default" w:ascii="Times New Roman" w:hAnsi="Times New Roman" w:cs="Times New Roman"/>
-                <w:color w:val="000000"/>
+                <w:color w:val="auto"/>
               </w:rPr>
             </w:pPr>
             <w:r>
               <w:rPr>
                 <w:rFonts w:hint="default" w:ascii="Times New Roman" w:hAnsi="Times New Roman" w:eastAsia="Arial" w:cs="Times New Roman"/>
-                <w:color w:val="000000"/>
+                <w:color w:val="auto"/>
                 <w:sz w:val="20"/>
                 <w:szCs w:val="20"/>
               </w:rPr>
@@ -4939,13 +4934,13 @@
             <w:pPr>
               <w:rPr>
                 <w:rFonts w:hint="default" w:ascii="Times New Roman" w:hAnsi="Times New Roman" w:cs="Times New Roman"/>
-                <w:color w:val="000000"/>
+                <w:color w:val="auto"/>
               </w:rPr>
             </w:pPr>
             <w:r>
               <w:rPr>
                 <w:rFonts w:hint="default" w:ascii="Times New Roman" w:hAnsi="Times New Roman" w:eastAsia="Arial" w:cs="Times New Roman"/>
-                <w:color w:val="000000"/>
+                <w:color w:val="auto"/>
                 <w:sz w:val="20"/>
                 <w:szCs w:val="20"/>
               </w:rPr>
@@ -4973,13 +4968,13 @@
             <w:pPr>
               <w:rPr>
                 <w:rFonts w:hint="default" w:ascii="Times New Roman" w:hAnsi="Times New Roman" w:cs="Times New Roman"/>
-                <w:color w:val="000000"/>
+                <w:color w:val="auto"/>
               </w:rPr>
             </w:pPr>
             <w:r>
               <w:rPr>
                 <w:rFonts w:hint="default" w:ascii="Times New Roman" w:hAnsi="Times New Roman" w:eastAsia="Arial" w:cs="Times New Roman"/>
-                <w:color w:val="000000"/>
+                <w:color w:val="auto"/>
                 <w:sz w:val="20"/>
                 <w:szCs w:val="20"/>
               </w:rPr>
@@ -5007,13 +5002,13 @@
             <w:pPr>
               <w:rPr>
                 <w:rFonts w:hint="default" w:ascii="Times New Roman" w:hAnsi="Times New Roman" w:cs="Times New Roman"/>
-                <w:color w:val="000000"/>
+                <w:color w:val="auto"/>
               </w:rPr>
             </w:pPr>
             <w:r>
               <w:rPr>
                 <w:rFonts w:hint="default" w:ascii="Times New Roman" w:hAnsi="Times New Roman" w:eastAsia="Arial" w:cs="Times New Roman"/>
-                <w:color w:val="000000"/>
+                <w:color w:val="auto"/>
                 <w:sz w:val="20"/>
                 <w:szCs w:val="20"/>
               </w:rPr>
@@ -5059,13 +5054,13 @@
             <w:pPr>
               <w:rPr>
                 <w:rFonts w:hint="default" w:ascii="Times New Roman" w:hAnsi="Times New Roman" w:cs="Times New Roman"/>
-                <w:color w:val="000000"/>
+                <w:color w:val="auto"/>
               </w:rPr>
             </w:pPr>
             <w:r>
               <w:rPr>
                 <w:rFonts w:hint="default" w:ascii="Times New Roman" w:hAnsi="Times New Roman" w:eastAsia="Arial" w:cs="Times New Roman"/>
-                <w:color w:val="000000"/>
+                <w:color w:val="auto"/>
                 <w:sz w:val="20"/>
                 <w:szCs w:val="20"/>
               </w:rPr>
@@ -5093,13 +5088,13 @@
             <w:pPr>
               <w:rPr>
                 <w:rFonts w:hint="default" w:ascii="Times New Roman" w:hAnsi="Times New Roman" w:cs="Times New Roman"/>
-                <w:color w:val="000000"/>
+                <w:color w:val="auto"/>
               </w:rPr>
             </w:pPr>
             <w:r>
               <w:rPr>
                 <w:rFonts w:hint="default" w:ascii="Times New Roman" w:hAnsi="Times New Roman" w:eastAsia="Arial" w:cs="Times New Roman"/>
-                <w:color w:val="000000"/>
+                <w:color w:val="auto"/>
                 <w:sz w:val="20"/>
                 <w:szCs w:val="20"/>
               </w:rPr>
@@ -5127,13 +5122,13 @@
             <w:pPr>
               <w:rPr>
                 <w:rFonts w:hint="default" w:ascii="Times New Roman" w:hAnsi="Times New Roman" w:cs="Times New Roman"/>
-                <w:color w:val="000000"/>
+                <w:color w:val="auto"/>
               </w:rPr>
             </w:pPr>
             <w:r>
               <w:rPr>
                 <w:rFonts w:hint="default" w:ascii="Times New Roman" w:hAnsi="Times New Roman" w:eastAsia="Arial" w:cs="Times New Roman"/>
-                <w:color w:val="000000"/>
+                <w:color w:val="auto"/>
                 <w:sz w:val="20"/>
                 <w:szCs w:val="20"/>
               </w:rPr>
@@ -5179,13 +5174,13 @@
             <w:pPr>
               <w:rPr>
                 <w:rFonts w:hint="default" w:ascii="Times New Roman" w:hAnsi="Times New Roman" w:cs="Times New Roman"/>
-                <w:color w:val="000000"/>
+                <w:color w:val="auto"/>
               </w:rPr>
             </w:pPr>
             <w:r>
               <w:rPr>
                 <w:rFonts w:hint="default" w:ascii="Times New Roman" w:hAnsi="Times New Roman" w:eastAsia="Arial" w:cs="Times New Roman"/>
-                <w:color w:val="000000"/>
+                <w:color w:val="auto"/>
                 <w:sz w:val="20"/>
                 <w:szCs w:val="20"/>
               </w:rPr>
@@ -5213,13 +5208,13 @@
             <w:pPr>
               <w:rPr>
                 <w:rFonts w:hint="default" w:ascii="Times New Roman" w:hAnsi="Times New Roman" w:cs="Times New Roman"/>
-                <w:color w:val="000000"/>
+                <w:color w:val="auto"/>
               </w:rPr>
             </w:pPr>
             <w:r>
               <w:rPr>
                 <w:rFonts w:hint="default" w:ascii="Times New Roman" w:hAnsi="Times New Roman" w:eastAsia="Arial" w:cs="Times New Roman"/>
-                <w:color w:val="000000"/>
+                <w:color w:val="auto"/>
                 <w:sz w:val="20"/>
                 <w:szCs w:val="20"/>
               </w:rPr>
@@ -5247,13 +5242,13 @@
             <w:pPr>
               <w:rPr>
                 <w:rFonts w:hint="default" w:ascii="Times New Roman" w:hAnsi="Times New Roman" w:cs="Times New Roman"/>
-                <w:color w:val="000000"/>
+                <w:color w:val="auto"/>
               </w:rPr>
             </w:pPr>
             <w:r>
               <w:rPr>
                 <w:rFonts w:hint="default" w:ascii="Times New Roman" w:hAnsi="Times New Roman" w:eastAsia="Arial" w:cs="Times New Roman"/>
-                <w:color w:val="000000"/>
+                <w:color w:val="auto"/>
                 <w:sz w:val="20"/>
                 <w:szCs w:val="20"/>
               </w:rPr>
@@ -5299,13 +5294,13 @@
             <w:pPr>
               <w:rPr>
                 <w:rFonts w:hint="default" w:ascii="Times New Roman" w:hAnsi="Times New Roman" w:cs="Times New Roman"/>
-                <w:color w:val="000000"/>
+                <w:color w:val="auto"/>
               </w:rPr>
             </w:pPr>
             <w:r>
               <w:rPr>
                 <w:rFonts w:hint="default" w:ascii="Times New Roman" w:hAnsi="Times New Roman" w:eastAsia="Arial" w:cs="Times New Roman"/>
-                <w:color w:val="000000"/>
+                <w:color w:val="auto"/>
                 <w:sz w:val="20"/>
                 <w:szCs w:val="20"/>
               </w:rPr>
@@ -5333,13 +5328,13 @@
             <w:pPr>
               <w:rPr>
                 <w:rFonts w:hint="default" w:ascii="Times New Roman" w:hAnsi="Times New Roman" w:cs="Times New Roman"/>
-                <w:color w:val="000000"/>
+                <w:color w:val="auto"/>
               </w:rPr>
             </w:pPr>
             <w:r>
               <w:rPr>
                 <w:rFonts w:hint="default" w:ascii="Times New Roman" w:hAnsi="Times New Roman" w:eastAsia="Arial" w:cs="Times New Roman"/>
-                <w:color w:val="000000"/>
+                <w:color w:val="auto"/>
                 <w:sz w:val="20"/>
                 <w:szCs w:val="20"/>
               </w:rPr>
@@ -5367,13 +5362,13 @@
             <w:pPr>
               <w:rPr>
                 <w:rFonts w:hint="default" w:ascii="Times New Roman" w:hAnsi="Times New Roman" w:cs="Times New Roman"/>
-                <w:color w:val="000000"/>
+                <w:color w:val="auto"/>
               </w:rPr>
             </w:pPr>
             <w:r>
               <w:rPr>
                 <w:rFonts w:hint="default" w:ascii="Times New Roman" w:hAnsi="Times New Roman" w:eastAsia="Arial" w:cs="Times New Roman"/>
-                <w:color w:val="000000"/>
+                <w:color w:val="auto"/>
                 <w:sz w:val="20"/>
                 <w:szCs w:val="20"/>
               </w:rPr>
@@ -5419,13 +5414,13 @@
             <w:pPr>
               <w:rPr>
                 <w:rFonts w:hint="default" w:ascii="Times New Roman" w:hAnsi="Times New Roman" w:cs="Times New Roman"/>
-                <w:color w:val="000000"/>
+                <w:color w:val="auto"/>
               </w:rPr>
             </w:pPr>
             <w:r>
               <w:rPr>
                 <w:rFonts w:hint="default" w:ascii="Times New Roman" w:hAnsi="Times New Roman" w:eastAsia="Arial" w:cs="Times New Roman"/>
-                <w:color w:val="000000"/>
+                <w:color w:val="auto"/>
                 <w:sz w:val="20"/>
                 <w:szCs w:val="20"/>
               </w:rPr>
@@ -5453,13 +5448,13 @@
             <w:pPr>
               <w:rPr>
                 <w:rFonts w:hint="default" w:ascii="Times New Roman" w:hAnsi="Times New Roman" w:cs="Times New Roman"/>
-                <w:color w:val="000000"/>
+                <w:color w:val="auto"/>
               </w:rPr>
             </w:pPr>
             <w:r>
               <w:rPr>
                 <w:rFonts w:hint="default" w:ascii="Times New Roman" w:hAnsi="Times New Roman" w:eastAsia="Arial" w:cs="Times New Roman"/>
-                <w:color w:val="000000"/>
+                <w:color w:val="auto"/>
                 <w:sz w:val="20"/>
                 <w:szCs w:val="20"/>
               </w:rPr>
@@ -5487,13 +5482,13 @@
             <w:pPr>
               <w:rPr>
                 <w:rFonts w:hint="default" w:ascii="Times New Roman" w:hAnsi="Times New Roman" w:cs="Times New Roman"/>
-                <w:color w:val="000000"/>
+                <w:color w:val="auto"/>
               </w:rPr>
             </w:pPr>
             <w:r>
               <w:rPr>
                 <w:rFonts w:hint="default" w:ascii="Times New Roman" w:hAnsi="Times New Roman" w:eastAsia="Arial" w:cs="Times New Roman"/>
-                <w:color w:val="000000"/>
+                <w:color w:val="auto"/>
                 <w:sz w:val="20"/>
                 <w:szCs w:val="20"/>
               </w:rPr>
@@ -5552,14 +5547,16 @@
         <w:rPr>
           <w:rFonts w:hint="default" w:ascii="Times New Roman" w:hAnsi="Times New Roman" w:cs="Times New Roman"/>
           <w:color w:val="auto"/>
-        </w:rPr>
-      </w:pPr>
-      <w:r>
-        <w:rPr>
-          <w:rFonts w:hint="default" w:ascii="Times New Roman" w:hAnsi="Times New Roman" w:eastAsia="Arial" w:cs="Times New Roman"/>
-          <w:color w:val="auto"/>
-          <w:sz w:val="22"/>
-          <w:szCs w:val="22"/>
+          <w:sz w:val="24"/>
+          <w:szCs w:val="24"/>
+        </w:rPr>
+      </w:pPr>
+      <w:r>
+        <w:rPr>
+          <w:rFonts w:hint="default" w:ascii="Times New Roman" w:hAnsi="Times New Roman" w:eastAsia="Arial" w:cs="Times New Roman"/>
+          <w:color w:val="auto"/>
+          <w:sz w:val="24"/>
+          <w:szCs w:val="24"/>
         </w:rPr>
         <w:t>Domain-based features require network requests — WHOIS queries for domain age and DNS lookups for record presence — adding latency of 2–3 seconds per URL. Caching of results for previously queried domains substantially reduces this overhead in practice. Three domain-based features are extracted: has_https (binary, 1 if the URL uses HTTPS), domain_age_days (integer, domain registration age via WHOIS; -1 if unavailable due to lookup failure), and has_dns_record (binary, 1 if a valid DNS record exists for the domain).</w:t>
       </w:r>
@@ -5592,14 +5589,16 @@
         <w:rPr>
           <w:rFonts w:hint="default" w:ascii="Times New Roman" w:hAnsi="Times New Roman" w:cs="Times New Roman"/>
           <w:color w:val="auto"/>
-        </w:rPr>
-      </w:pPr>
-      <w:r>
-        <w:rPr>
-          <w:rFonts w:hint="default" w:ascii="Times New Roman" w:hAnsi="Times New Roman" w:eastAsia="Arial" w:cs="Times New Roman"/>
-          <w:color w:val="auto"/>
-          <w:sz w:val="22"/>
-          <w:szCs w:val="22"/>
+          <w:sz w:val="24"/>
+          <w:szCs w:val="24"/>
+        </w:rPr>
+      </w:pPr>
+      <w:r>
+        <w:rPr>
+          <w:rFonts w:hint="default" w:ascii="Times New Roman" w:hAnsi="Times New Roman" w:eastAsia="Arial" w:cs="Times New Roman"/>
+          <w:color w:val="auto"/>
+          <w:sz w:val="24"/>
+          <w:szCs w:val="24"/>
         </w:rPr>
         <w:t>Content-based features require downloading and parsing the target webpage's HTML, adding 3–5 seconds per URL depending on server response time and content complexity. Seven features are extracted from parsed HTML: num_external_links, num_internal_links, has_form, num_scripts, num_iframes, has_login_form (1 if a password-type input field is present), and suspicious_keywords_count (frequency of terms such as 'login', 'verify', 'account', 'secure', 'update' in page text).</w:t>
       </w:r>
@@ -5611,14 +5610,16 @@
         <w:rPr>
           <w:rFonts w:hint="default" w:ascii="Times New Roman" w:hAnsi="Times New Roman" w:cs="Times New Roman"/>
           <w:color w:val="auto"/>
-        </w:rPr>
-      </w:pPr>
-      <w:r>
-        <w:rPr>
-          <w:rFonts w:hint="default" w:ascii="Times New Roman" w:hAnsi="Times New Roman" w:eastAsia="Arial" w:cs="Times New Roman"/>
-          <w:color w:val="auto"/>
-          <w:sz w:val="22"/>
-          <w:szCs w:val="22"/>
+          <w:sz w:val="24"/>
+          <w:szCs w:val="24"/>
+        </w:rPr>
+      </w:pPr>
+      <w:r>
+        <w:rPr>
+          <w:rFonts w:hint="default" w:ascii="Times New Roman" w:hAnsi="Times New Roman" w:eastAsia="Arial" w:cs="Times New Roman"/>
+          <w:color w:val="auto"/>
+          <w:sz w:val="24"/>
+          <w:szCs w:val="24"/>
         </w:rPr>
         <w:t>To manage the latency of content extraction, a configurable timeout of 5 seconds is applied to each HTTP request. URLs where the request times out or returns an error are assigned default feature values (0 for binary features, -1 for count features) rather than being excluded, preserving sample completeness at the cost of some feature accuracy for inaccessible URLs.</w:t>
       </w:r>
@@ -5651,14 +5652,16 @@
         <w:rPr>
           <w:rFonts w:hint="default" w:ascii="Times New Roman" w:hAnsi="Times New Roman" w:cs="Times New Roman"/>
           <w:color w:val="auto"/>
-        </w:rPr>
-      </w:pPr>
-      <w:r>
-        <w:rPr>
-          <w:rFonts w:hint="default" w:ascii="Times New Roman" w:hAnsi="Times New Roman" w:eastAsia="Arial" w:cs="Times New Roman"/>
-          <w:color w:val="auto"/>
-          <w:sz w:val="22"/>
-          <w:szCs w:val="22"/>
+          <w:sz w:val="24"/>
+          <w:szCs w:val="24"/>
+        </w:rPr>
+      </w:pPr>
+      <w:r>
+        <w:rPr>
+          <w:rFonts w:hint="default" w:ascii="Times New Roman" w:hAnsi="Times New Roman" w:eastAsia="Arial" w:cs="Times New Roman"/>
+          <w:color w:val="auto"/>
+          <w:sz w:val="24"/>
+          <w:szCs w:val="24"/>
         </w:rPr>
         <w:t>Lexical features capture statistical properties of the URL string without domain knowledge: digit_count (number of digits), letter_count (number of alphabetic characters), special_char_count (number of special characters), entropy (Shannon entropy of the URL string, measuring character distribution randomness — phishing URLs tend towards higher entropy due to random-looking subdomains and path components), digit_ratio, letter_ratio, and special_char_ratio (proportional versions of the count features, normalised by URL length).</w:t>
       </w:r>
@@ -5785,12 +5788,6 @@
             <w:insideH w:val="single" w:color="auto" w:sz="4" w:space="0"/>
             <w:insideV w:val="single" w:color="auto" w:sz="4" w:space="0"/>
           </w:tblBorders>
-          <w:tblCellMar>
-            <w:top w:w="0" w:type="dxa"/>
-            <w:left w:w="10" w:type="dxa"/>
-            <w:bottom w:w="0" w:type="dxa"/>
-            <w:right w:w="10" w:type="dxa"/>
-          </w:tblCellMar>
         </w:tblPrEx>
         <w:trPr>
           <w:tblHeader/>
@@ -5815,7 +5812,7 @@
             <w:pPr>
               <w:rPr>
                 <w:rFonts w:hint="default" w:ascii="Times New Roman" w:hAnsi="Times New Roman" w:cs="Times New Roman"/>
-                <w:color w:val="FFFFFF"/>
+                <w:color w:val="auto"/>
               </w:rPr>
             </w:pPr>
             <w:r>
@@ -5823,7 +5820,7 @@
                 <w:rFonts w:hint="default" w:ascii="Times New Roman" w:hAnsi="Times New Roman" w:eastAsia="Arial" w:cs="Times New Roman"/>
                 <w:b/>
                 <w:bCs/>
-                <w:color w:val="FFFFFF"/>
+                <w:color w:val="auto"/>
                 <w:sz w:val="20"/>
                 <w:szCs w:val="20"/>
               </w:rPr>
@@ -5851,7 +5848,7 @@
             <w:pPr>
               <w:rPr>
                 <w:rFonts w:hint="default" w:ascii="Times New Roman" w:hAnsi="Times New Roman" w:cs="Times New Roman"/>
-                <w:color w:val="FFFFFF"/>
+                <w:color w:val="auto"/>
               </w:rPr>
             </w:pPr>
             <w:r>
@@ -5859,7 +5856,7 @@
                 <w:rFonts w:hint="default" w:ascii="Times New Roman" w:hAnsi="Times New Roman" w:eastAsia="Arial" w:cs="Times New Roman"/>
                 <w:b/>
                 <w:bCs/>
-                <w:color w:val="FFFFFF"/>
+                <w:color w:val="auto"/>
                 <w:sz w:val="20"/>
                 <w:szCs w:val="20"/>
               </w:rPr>
@@ -5887,7 +5884,7 @@
             <w:pPr>
               <w:rPr>
                 <w:rFonts w:hint="default" w:ascii="Times New Roman" w:hAnsi="Times New Roman" w:cs="Times New Roman"/>
-                <w:color w:val="FFFFFF"/>
+                <w:color w:val="auto"/>
               </w:rPr>
             </w:pPr>
             <w:r>
@@ -5895,7 +5892,7 @@
                 <w:rFonts w:hint="default" w:ascii="Times New Roman" w:hAnsi="Times New Roman" w:eastAsia="Arial" w:cs="Times New Roman"/>
                 <w:b/>
                 <w:bCs/>
-                <w:color w:val="FFFFFF"/>
+                <w:color w:val="auto"/>
                 <w:sz w:val="20"/>
                 <w:szCs w:val="20"/>
               </w:rPr>
@@ -5923,7 +5920,7 @@
             <w:pPr>
               <w:rPr>
                 <w:rFonts w:hint="default" w:ascii="Times New Roman" w:hAnsi="Times New Roman" w:cs="Times New Roman"/>
-                <w:color w:val="FFFFFF"/>
+                <w:color w:val="auto"/>
               </w:rPr>
             </w:pPr>
             <w:r>
@@ -5931,7 +5928,7 @@
                 <w:rFonts w:hint="default" w:ascii="Times New Roman" w:hAnsi="Times New Roman" w:eastAsia="Arial" w:cs="Times New Roman"/>
                 <w:b/>
                 <w:bCs/>
-                <w:color w:val="FFFFFF"/>
+                <w:color w:val="auto"/>
                 <w:sz w:val="20"/>
                 <w:szCs w:val="20"/>
               </w:rPr>
@@ -5977,13 +5974,13 @@
             <w:pPr>
               <w:rPr>
                 <w:rFonts w:hint="default" w:ascii="Times New Roman" w:hAnsi="Times New Roman" w:cs="Times New Roman"/>
-                <w:color w:val="000000"/>
+                <w:color w:val="auto"/>
               </w:rPr>
             </w:pPr>
             <w:r>
               <w:rPr>
                 <w:rFonts w:hint="default" w:ascii="Times New Roman" w:hAnsi="Times New Roman" w:eastAsia="Arial" w:cs="Times New Roman"/>
-                <w:color w:val="000000"/>
+                <w:color w:val="auto"/>
                 <w:sz w:val="20"/>
                 <w:szCs w:val="20"/>
               </w:rPr>
@@ -6011,13 +6008,13 @@
             <w:pPr>
               <w:rPr>
                 <w:rFonts w:hint="default" w:ascii="Times New Roman" w:hAnsi="Times New Roman" w:cs="Times New Roman"/>
-                <w:color w:val="000000"/>
+                <w:color w:val="auto"/>
               </w:rPr>
             </w:pPr>
             <w:r>
               <w:rPr>
                 <w:rFonts w:hint="default" w:ascii="Times New Roman" w:hAnsi="Times New Roman" w:eastAsia="Arial" w:cs="Times New Roman"/>
-                <w:color w:val="000000"/>
+                <w:color w:val="auto"/>
                 <w:sz w:val="20"/>
                 <w:szCs w:val="20"/>
               </w:rPr>
@@ -6045,13 +6042,13 @@
             <w:pPr>
               <w:rPr>
                 <w:rFonts w:hint="default" w:ascii="Times New Roman" w:hAnsi="Times New Roman" w:cs="Times New Roman"/>
-                <w:color w:val="000000"/>
+                <w:color w:val="auto"/>
               </w:rPr>
             </w:pPr>
             <w:r>
               <w:rPr>
                 <w:rFonts w:hint="default" w:ascii="Times New Roman" w:hAnsi="Times New Roman" w:eastAsia="Arial" w:cs="Times New Roman"/>
-                <w:color w:val="000000"/>
+                <w:color w:val="auto"/>
                 <w:sz w:val="20"/>
                 <w:szCs w:val="20"/>
               </w:rPr>
@@ -6079,13 +6076,13 @@
             <w:pPr>
               <w:rPr>
                 <w:rFonts w:hint="default" w:ascii="Times New Roman" w:hAnsi="Times New Roman" w:cs="Times New Roman"/>
-                <w:color w:val="000000"/>
+                <w:color w:val="auto"/>
               </w:rPr>
             </w:pPr>
             <w:r>
               <w:rPr>
                 <w:rFonts w:hint="default" w:ascii="Times New Roman" w:hAnsi="Times New Roman" w:eastAsia="Arial" w:cs="Times New Roman"/>
-                <w:color w:val="000000"/>
+                <w:color w:val="auto"/>
                 <w:sz w:val="20"/>
                 <w:szCs w:val="20"/>
               </w:rPr>
@@ -6131,13 +6128,13 @@
             <w:pPr>
               <w:rPr>
                 <w:rFonts w:hint="default" w:ascii="Times New Roman" w:hAnsi="Times New Roman" w:cs="Times New Roman"/>
-                <w:color w:val="000000"/>
+                <w:color w:val="auto"/>
               </w:rPr>
             </w:pPr>
             <w:r>
               <w:rPr>
                 <w:rFonts w:hint="default" w:ascii="Times New Roman" w:hAnsi="Times New Roman" w:eastAsia="Arial" w:cs="Times New Roman"/>
-                <w:color w:val="000000"/>
+                <w:color w:val="auto"/>
                 <w:sz w:val="20"/>
                 <w:szCs w:val="20"/>
               </w:rPr>
@@ -6165,13 +6162,13 @@
             <w:pPr>
               <w:rPr>
                 <w:rFonts w:hint="default" w:ascii="Times New Roman" w:hAnsi="Times New Roman" w:cs="Times New Roman"/>
-                <w:color w:val="000000"/>
+                <w:color w:val="auto"/>
               </w:rPr>
             </w:pPr>
             <w:r>
               <w:rPr>
                 <w:rFonts w:hint="default" w:ascii="Times New Roman" w:hAnsi="Times New Roman" w:eastAsia="Arial" w:cs="Times New Roman"/>
-                <w:color w:val="000000"/>
+                <w:color w:val="auto"/>
                 <w:sz w:val="20"/>
                 <w:szCs w:val="20"/>
               </w:rPr>
@@ -6199,13 +6196,13 @@
             <w:pPr>
               <w:rPr>
                 <w:rFonts w:hint="default" w:ascii="Times New Roman" w:hAnsi="Times New Roman" w:cs="Times New Roman"/>
-                <w:color w:val="000000"/>
+                <w:color w:val="auto"/>
               </w:rPr>
             </w:pPr>
             <w:r>
               <w:rPr>
                 <w:rFonts w:hint="default" w:ascii="Times New Roman" w:hAnsi="Times New Roman" w:eastAsia="Arial" w:cs="Times New Roman"/>
-                <w:color w:val="000000"/>
+                <w:color w:val="auto"/>
                 <w:sz w:val="20"/>
                 <w:szCs w:val="20"/>
               </w:rPr>
@@ -6233,13 +6230,13 @@
             <w:pPr>
               <w:rPr>
                 <w:rFonts w:hint="default" w:ascii="Times New Roman" w:hAnsi="Times New Roman" w:cs="Times New Roman"/>
-                <w:color w:val="000000"/>
+                <w:color w:val="auto"/>
               </w:rPr>
             </w:pPr>
             <w:r>
               <w:rPr>
                 <w:rFonts w:hint="default" w:ascii="Times New Roman" w:hAnsi="Times New Roman" w:eastAsia="Arial" w:cs="Times New Roman"/>
-                <w:color w:val="000000"/>
+                <w:color w:val="auto"/>
                 <w:sz w:val="20"/>
                 <w:szCs w:val="20"/>
               </w:rPr>
@@ -6285,13 +6282,13 @@
             <w:pPr>
               <w:rPr>
                 <w:rFonts w:hint="default" w:ascii="Times New Roman" w:hAnsi="Times New Roman" w:cs="Times New Roman"/>
-                <w:color w:val="000000"/>
+                <w:color w:val="auto"/>
               </w:rPr>
             </w:pPr>
             <w:r>
               <w:rPr>
                 <w:rFonts w:hint="default" w:ascii="Times New Roman" w:hAnsi="Times New Roman" w:eastAsia="Arial" w:cs="Times New Roman"/>
-                <w:color w:val="000000"/>
+                <w:color w:val="auto"/>
                 <w:sz w:val="20"/>
                 <w:szCs w:val="20"/>
               </w:rPr>
@@ -6319,13 +6316,13 @@
             <w:pPr>
               <w:rPr>
                 <w:rFonts w:hint="default" w:ascii="Times New Roman" w:hAnsi="Times New Roman" w:cs="Times New Roman"/>
-                <w:color w:val="000000"/>
+                <w:color w:val="auto"/>
               </w:rPr>
             </w:pPr>
             <w:r>
               <w:rPr>
                 <w:rFonts w:hint="default" w:ascii="Times New Roman" w:hAnsi="Times New Roman" w:eastAsia="Arial" w:cs="Times New Roman"/>
-                <w:color w:val="000000"/>
+                <w:color w:val="auto"/>
                 <w:sz w:val="20"/>
                 <w:szCs w:val="20"/>
               </w:rPr>
@@ -6353,13 +6350,13 @@
             <w:pPr>
               <w:rPr>
                 <w:rFonts w:hint="default" w:ascii="Times New Roman" w:hAnsi="Times New Roman" w:cs="Times New Roman"/>
-                <w:color w:val="000000"/>
+                <w:color w:val="auto"/>
               </w:rPr>
             </w:pPr>
             <w:r>
               <w:rPr>
                 <w:rFonts w:hint="default" w:ascii="Times New Roman" w:hAnsi="Times New Roman" w:eastAsia="Arial" w:cs="Times New Roman"/>
-                <w:color w:val="000000"/>
+                <w:color w:val="auto"/>
                 <w:sz w:val="20"/>
                 <w:szCs w:val="20"/>
               </w:rPr>
@@ -6387,13 +6384,13 @@
             <w:pPr>
               <w:rPr>
                 <w:rFonts w:hint="default" w:ascii="Times New Roman" w:hAnsi="Times New Roman" w:cs="Times New Roman"/>
-                <w:color w:val="000000"/>
+                <w:color w:val="auto"/>
               </w:rPr>
             </w:pPr>
             <w:r>
               <w:rPr>
                 <w:rFonts w:hint="default" w:ascii="Times New Roman" w:hAnsi="Times New Roman" w:eastAsia="Arial" w:cs="Times New Roman"/>
-                <w:color w:val="000000"/>
+                <w:color w:val="auto"/>
                 <w:sz w:val="20"/>
                 <w:szCs w:val="20"/>
               </w:rPr>
@@ -6439,13 +6436,13 @@
             <w:pPr>
               <w:rPr>
                 <w:rFonts w:hint="default" w:ascii="Times New Roman" w:hAnsi="Times New Roman" w:cs="Times New Roman"/>
-                <w:color w:val="000000"/>
+                <w:color w:val="auto"/>
               </w:rPr>
             </w:pPr>
             <w:r>
               <w:rPr>
                 <w:rFonts w:hint="default" w:ascii="Times New Roman" w:hAnsi="Times New Roman" w:eastAsia="Arial" w:cs="Times New Roman"/>
-                <w:color w:val="000000"/>
+                <w:color w:val="auto"/>
                 <w:sz w:val="20"/>
                 <w:szCs w:val="20"/>
               </w:rPr>
@@ -6473,13 +6470,13 @@
             <w:pPr>
               <w:rPr>
                 <w:rFonts w:hint="default" w:ascii="Times New Roman" w:hAnsi="Times New Roman" w:cs="Times New Roman"/>
-                <w:color w:val="000000"/>
+                <w:color w:val="auto"/>
               </w:rPr>
             </w:pPr>
             <w:r>
               <w:rPr>
                 <w:rFonts w:hint="default" w:ascii="Times New Roman" w:hAnsi="Times New Roman" w:eastAsia="Arial" w:cs="Times New Roman"/>
-                <w:color w:val="000000"/>
+                <w:color w:val="auto"/>
                 <w:sz w:val="20"/>
                 <w:szCs w:val="20"/>
               </w:rPr>
@@ -6507,13 +6504,13 @@
             <w:pPr>
               <w:rPr>
                 <w:rFonts w:hint="default" w:ascii="Times New Roman" w:hAnsi="Times New Roman" w:cs="Times New Roman"/>
-                <w:color w:val="000000"/>
+                <w:color w:val="auto"/>
               </w:rPr>
             </w:pPr>
             <w:r>
               <w:rPr>
                 <w:rFonts w:hint="default" w:ascii="Times New Roman" w:hAnsi="Times New Roman" w:eastAsia="Arial" w:cs="Times New Roman"/>
-                <w:color w:val="000000"/>
+                <w:color w:val="auto"/>
                 <w:sz w:val="20"/>
                 <w:szCs w:val="20"/>
               </w:rPr>
@@ -6541,13 +6538,13 @@
             <w:pPr>
               <w:rPr>
                 <w:rFonts w:hint="default" w:ascii="Times New Roman" w:hAnsi="Times New Roman" w:cs="Times New Roman"/>
-                <w:color w:val="000000"/>
+                <w:color w:val="auto"/>
               </w:rPr>
             </w:pPr>
             <w:r>
               <w:rPr>
                 <w:rFonts w:hint="default" w:ascii="Times New Roman" w:hAnsi="Times New Roman" w:eastAsia="Arial" w:cs="Times New Roman"/>
-                <w:color w:val="000000"/>
+                <w:color w:val="auto"/>
                 <w:sz w:val="20"/>
                 <w:szCs w:val="20"/>
               </w:rPr>
@@ -6593,13 +6590,13 @@
             <w:pPr>
               <w:rPr>
                 <w:rFonts w:hint="default" w:ascii="Times New Roman" w:hAnsi="Times New Roman" w:cs="Times New Roman"/>
-                <w:color w:val="000000"/>
+                <w:color w:val="auto"/>
               </w:rPr>
             </w:pPr>
             <w:r>
               <w:rPr>
                 <w:rFonts w:hint="default" w:ascii="Times New Roman" w:hAnsi="Times New Roman" w:eastAsia="Arial" w:cs="Times New Roman"/>
-                <w:color w:val="000000"/>
+                <w:color w:val="auto"/>
                 <w:sz w:val="20"/>
                 <w:szCs w:val="20"/>
               </w:rPr>
@@ -6627,13 +6624,13 @@
             <w:pPr>
               <w:rPr>
                 <w:rFonts w:hint="default" w:ascii="Times New Roman" w:hAnsi="Times New Roman" w:cs="Times New Roman"/>
-                <w:color w:val="000000"/>
+                <w:color w:val="auto"/>
               </w:rPr>
             </w:pPr>
             <w:r>
               <w:rPr>
                 <w:rFonts w:hint="default" w:ascii="Times New Roman" w:hAnsi="Times New Roman" w:eastAsia="Arial" w:cs="Times New Roman"/>
-                <w:color w:val="000000"/>
+                <w:color w:val="auto"/>
                 <w:sz w:val="20"/>
                 <w:szCs w:val="20"/>
               </w:rPr>
@@ -6661,13 +6658,13 @@
             <w:pPr>
               <w:rPr>
                 <w:rFonts w:hint="default" w:ascii="Times New Roman" w:hAnsi="Times New Roman" w:cs="Times New Roman"/>
-                <w:color w:val="000000"/>
+                <w:color w:val="auto"/>
               </w:rPr>
             </w:pPr>
             <w:r>
               <w:rPr>
                 <w:rFonts w:hint="default" w:ascii="Times New Roman" w:hAnsi="Times New Roman" w:eastAsia="Arial" w:cs="Times New Roman"/>
-                <w:color w:val="000000"/>
+                <w:color w:val="auto"/>
                 <w:sz w:val="20"/>
                 <w:szCs w:val="20"/>
               </w:rPr>
@@ -6695,13 +6692,13 @@
             <w:pPr>
               <w:rPr>
                 <w:rFonts w:hint="default" w:ascii="Times New Roman" w:hAnsi="Times New Roman" w:cs="Times New Roman"/>
-                <w:color w:val="000000"/>
+                <w:color w:val="auto"/>
               </w:rPr>
             </w:pPr>
             <w:r>
               <w:rPr>
                 <w:rFonts w:hint="default" w:ascii="Times New Roman" w:hAnsi="Times New Roman" w:eastAsia="Arial" w:cs="Times New Roman"/>
-                <w:color w:val="000000"/>
+                <w:color w:val="auto"/>
                 <w:sz w:val="20"/>
                 <w:szCs w:val="20"/>
               </w:rPr>
@@ -6747,13 +6744,13 @@
             <w:pPr>
               <w:rPr>
                 <w:rFonts w:hint="default" w:ascii="Times New Roman" w:hAnsi="Times New Roman" w:cs="Times New Roman"/>
-                <w:color w:val="000000"/>
+                <w:color w:val="auto"/>
               </w:rPr>
             </w:pPr>
             <w:r>
               <w:rPr>
                 <w:rFonts w:hint="default" w:ascii="Times New Roman" w:hAnsi="Times New Roman" w:eastAsia="Arial" w:cs="Times New Roman"/>
-                <w:color w:val="000000"/>
+                <w:color w:val="auto"/>
                 <w:sz w:val="20"/>
                 <w:szCs w:val="20"/>
               </w:rPr>
@@ -6781,13 +6778,13 @@
             <w:pPr>
               <w:rPr>
                 <w:rFonts w:hint="default" w:ascii="Times New Roman" w:hAnsi="Times New Roman" w:cs="Times New Roman"/>
-                <w:color w:val="000000"/>
+                <w:color w:val="auto"/>
               </w:rPr>
             </w:pPr>
             <w:r>
               <w:rPr>
                 <w:rFonts w:hint="default" w:ascii="Times New Roman" w:hAnsi="Times New Roman" w:eastAsia="Arial" w:cs="Times New Roman"/>
-                <w:color w:val="000000"/>
+                <w:color w:val="auto"/>
                 <w:sz w:val="20"/>
                 <w:szCs w:val="20"/>
               </w:rPr>
@@ -6815,13 +6812,13 @@
             <w:pPr>
               <w:rPr>
                 <w:rFonts w:hint="default" w:ascii="Times New Roman" w:hAnsi="Times New Roman" w:cs="Times New Roman"/>
-                <w:color w:val="000000"/>
+                <w:color w:val="auto"/>
               </w:rPr>
             </w:pPr>
             <w:r>
               <w:rPr>
                 <w:rFonts w:hint="default" w:ascii="Times New Roman" w:hAnsi="Times New Roman" w:eastAsia="Arial" w:cs="Times New Roman"/>
-                <w:color w:val="000000"/>
+                <w:color w:val="auto"/>
                 <w:sz w:val="20"/>
                 <w:szCs w:val="20"/>
               </w:rPr>
@@ -6849,13 +6846,13 @@
             <w:pPr>
               <w:rPr>
                 <w:rFonts w:hint="default" w:ascii="Times New Roman" w:hAnsi="Times New Roman" w:cs="Times New Roman"/>
-                <w:color w:val="000000"/>
+                <w:color w:val="auto"/>
               </w:rPr>
             </w:pPr>
             <w:r>
               <w:rPr>
                 <w:rFonts w:hint="default" w:ascii="Times New Roman" w:hAnsi="Times New Roman" w:eastAsia="Arial" w:cs="Times New Roman"/>
-                <w:color w:val="000000"/>
+                <w:color w:val="auto"/>
                 <w:sz w:val="20"/>
                 <w:szCs w:val="20"/>
               </w:rPr>
@@ -6901,13 +6898,13 @@
             <w:pPr>
               <w:rPr>
                 <w:rFonts w:hint="default" w:ascii="Times New Roman" w:hAnsi="Times New Roman" w:cs="Times New Roman"/>
-                <w:color w:val="000000"/>
+                <w:color w:val="auto"/>
               </w:rPr>
             </w:pPr>
             <w:r>
               <w:rPr>
                 <w:rFonts w:hint="default" w:ascii="Times New Roman" w:hAnsi="Times New Roman" w:eastAsia="Arial" w:cs="Times New Roman"/>
-                <w:color w:val="000000"/>
+                <w:color w:val="auto"/>
                 <w:sz w:val="20"/>
                 <w:szCs w:val="20"/>
               </w:rPr>
@@ -6935,13 +6932,13 @@
             <w:pPr>
               <w:rPr>
                 <w:rFonts w:hint="default" w:ascii="Times New Roman" w:hAnsi="Times New Roman" w:cs="Times New Roman"/>
-                <w:color w:val="000000"/>
+                <w:color w:val="auto"/>
               </w:rPr>
             </w:pPr>
             <w:r>
               <w:rPr>
                 <w:rFonts w:hint="default" w:ascii="Times New Roman" w:hAnsi="Times New Roman" w:eastAsia="Arial" w:cs="Times New Roman"/>
-                <w:color w:val="000000"/>
+                <w:color w:val="auto"/>
                 <w:sz w:val="20"/>
                 <w:szCs w:val="20"/>
               </w:rPr>
@@ -6969,13 +6966,13 @@
             <w:pPr>
               <w:rPr>
                 <w:rFonts w:hint="default" w:ascii="Times New Roman" w:hAnsi="Times New Roman" w:cs="Times New Roman"/>
-                <w:color w:val="000000"/>
+                <w:color w:val="auto"/>
               </w:rPr>
             </w:pPr>
             <w:r>
               <w:rPr>
                 <w:rFonts w:hint="default" w:ascii="Times New Roman" w:hAnsi="Times New Roman" w:eastAsia="Arial" w:cs="Times New Roman"/>
-                <w:color w:val="000000"/>
+                <w:color w:val="auto"/>
                 <w:sz w:val="20"/>
                 <w:szCs w:val="20"/>
               </w:rPr>
@@ -7003,13 +7000,13 @@
             <w:pPr>
               <w:rPr>
                 <w:rFonts w:hint="default" w:ascii="Times New Roman" w:hAnsi="Times New Roman" w:cs="Times New Roman"/>
-                <w:color w:val="000000"/>
+                <w:color w:val="auto"/>
               </w:rPr>
             </w:pPr>
             <w:r>
               <w:rPr>
                 <w:rFonts w:hint="default" w:ascii="Times New Roman" w:hAnsi="Times New Roman" w:eastAsia="Arial" w:cs="Times New Roman"/>
-                <w:color w:val="000000"/>
+                <w:color w:val="auto"/>
                 <w:sz w:val="20"/>
                 <w:szCs w:val="20"/>
               </w:rPr>
@@ -7055,13 +7052,13 @@
             <w:pPr>
               <w:rPr>
                 <w:rFonts w:hint="default" w:ascii="Times New Roman" w:hAnsi="Times New Roman" w:cs="Times New Roman"/>
-                <w:color w:val="000000"/>
+                <w:color w:val="auto"/>
               </w:rPr>
             </w:pPr>
             <w:r>
               <w:rPr>
                 <w:rFonts w:hint="default" w:ascii="Times New Roman" w:hAnsi="Times New Roman" w:eastAsia="Arial" w:cs="Times New Roman"/>
-                <w:color w:val="000000"/>
+                <w:color w:val="auto"/>
                 <w:sz w:val="20"/>
                 <w:szCs w:val="20"/>
               </w:rPr>
@@ -7089,13 +7086,13 @@
             <w:pPr>
               <w:rPr>
                 <w:rFonts w:hint="default" w:ascii="Times New Roman" w:hAnsi="Times New Roman" w:cs="Times New Roman"/>
-                <w:color w:val="000000"/>
+                <w:color w:val="auto"/>
               </w:rPr>
             </w:pPr>
             <w:r>
               <w:rPr>
                 <w:rFonts w:hint="default" w:ascii="Times New Roman" w:hAnsi="Times New Roman" w:eastAsia="Arial" w:cs="Times New Roman"/>
-                <w:color w:val="000000"/>
+                <w:color w:val="auto"/>
                 <w:sz w:val="20"/>
                 <w:szCs w:val="20"/>
               </w:rPr>
@@ -7123,13 +7120,13 @@
             <w:pPr>
               <w:rPr>
                 <w:rFonts w:hint="default" w:ascii="Times New Roman" w:hAnsi="Times New Roman" w:cs="Times New Roman"/>
-                <w:color w:val="000000"/>
+                <w:color w:val="auto"/>
               </w:rPr>
             </w:pPr>
             <w:r>
               <w:rPr>
                 <w:rFonts w:hint="default" w:ascii="Times New Roman" w:hAnsi="Times New Roman" w:eastAsia="Arial" w:cs="Times New Roman"/>
-                <w:color w:val="000000"/>
+                <w:color w:val="auto"/>
                 <w:sz w:val="20"/>
                 <w:szCs w:val="20"/>
               </w:rPr>
@@ -7157,13 +7154,13 @@
             <w:pPr>
               <w:rPr>
                 <w:rFonts w:hint="default" w:ascii="Times New Roman" w:hAnsi="Times New Roman" w:cs="Times New Roman"/>
-                <w:color w:val="000000"/>
+                <w:color w:val="auto"/>
               </w:rPr>
             </w:pPr>
             <w:r>
               <w:rPr>
                 <w:rFonts w:hint="default" w:ascii="Times New Roman" w:hAnsi="Times New Roman" w:eastAsia="Arial" w:cs="Times New Roman"/>
-                <w:color w:val="000000"/>
+                <w:color w:val="auto"/>
                 <w:sz w:val="20"/>
                 <w:szCs w:val="20"/>
               </w:rPr>
@@ -7209,13 +7206,13 @@
             <w:pPr>
               <w:rPr>
                 <w:rFonts w:hint="default" w:ascii="Times New Roman" w:hAnsi="Times New Roman" w:cs="Times New Roman"/>
-                <w:color w:val="000000"/>
+                <w:color w:val="auto"/>
               </w:rPr>
             </w:pPr>
             <w:r>
               <w:rPr>
                 <w:rFonts w:hint="default" w:ascii="Times New Roman" w:hAnsi="Times New Roman" w:eastAsia="Arial" w:cs="Times New Roman"/>
-                <w:color w:val="000000"/>
+                <w:color w:val="auto"/>
                 <w:sz w:val="20"/>
                 <w:szCs w:val="20"/>
               </w:rPr>
@@ -7243,13 +7240,13 @@
             <w:pPr>
               <w:rPr>
                 <w:rFonts w:hint="default" w:ascii="Times New Roman" w:hAnsi="Times New Roman" w:cs="Times New Roman"/>
-                <w:color w:val="000000"/>
+                <w:color w:val="auto"/>
               </w:rPr>
             </w:pPr>
             <w:r>
               <w:rPr>
                 <w:rFonts w:hint="default" w:ascii="Times New Roman" w:hAnsi="Times New Roman" w:eastAsia="Arial" w:cs="Times New Roman"/>
-                <w:color w:val="000000"/>
+                <w:color w:val="auto"/>
                 <w:sz w:val="20"/>
                 <w:szCs w:val="20"/>
               </w:rPr>
@@ -7277,13 +7274,13 @@
             <w:pPr>
               <w:rPr>
                 <w:rFonts w:hint="default" w:ascii="Times New Roman" w:hAnsi="Times New Roman" w:cs="Times New Roman"/>
-                <w:color w:val="000000"/>
+                <w:color w:val="auto"/>
               </w:rPr>
             </w:pPr>
             <w:r>
               <w:rPr>
                 <w:rFonts w:hint="default" w:ascii="Times New Roman" w:hAnsi="Times New Roman" w:eastAsia="Arial" w:cs="Times New Roman"/>
-                <w:color w:val="000000"/>
+                <w:color w:val="auto"/>
                 <w:sz w:val="20"/>
                 <w:szCs w:val="20"/>
               </w:rPr>
@@ -7311,13 +7308,13 @@
             <w:pPr>
               <w:rPr>
                 <w:rFonts w:hint="default" w:ascii="Times New Roman" w:hAnsi="Times New Roman" w:cs="Times New Roman"/>
-                <w:color w:val="000000"/>
+                <w:color w:val="auto"/>
               </w:rPr>
             </w:pPr>
             <w:r>
               <w:rPr>
                 <w:rFonts w:hint="default" w:ascii="Times New Roman" w:hAnsi="Times New Roman" w:eastAsia="Arial" w:cs="Times New Roman"/>
-                <w:color w:val="000000"/>
+                <w:color w:val="auto"/>
                 <w:sz w:val="20"/>
                 <w:szCs w:val="20"/>
               </w:rPr>
@@ -7363,13 +7360,13 @@
             <w:pPr>
               <w:rPr>
                 <w:rFonts w:hint="default" w:ascii="Times New Roman" w:hAnsi="Times New Roman" w:cs="Times New Roman"/>
-                <w:color w:val="000000"/>
+                <w:color w:val="auto"/>
               </w:rPr>
             </w:pPr>
             <w:r>
               <w:rPr>
                 <w:rFonts w:hint="default" w:ascii="Times New Roman" w:hAnsi="Times New Roman" w:eastAsia="Arial" w:cs="Times New Roman"/>
-                <w:color w:val="000000"/>
+                <w:color w:val="auto"/>
                 <w:sz w:val="20"/>
                 <w:szCs w:val="20"/>
               </w:rPr>
@@ -7397,13 +7394,13 @@
             <w:pPr>
               <w:rPr>
                 <w:rFonts w:hint="default" w:ascii="Times New Roman" w:hAnsi="Times New Roman" w:cs="Times New Roman"/>
-                <w:color w:val="000000"/>
+                <w:color w:val="auto"/>
               </w:rPr>
             </w:pPr>
             <w:r>
               <w:rPr>
                 <w:rFonts w:hint="default" w:ascii="Times New Roman" w:hAnsi="Times New Roman" w:eastAsia="Arial" w:cs="Times New Roman"/>
-                <w:color w:val="000000"/>
+                <w:color w:val="auto"/>
                 <w:sz w:val="20"/>
                 <w:szCs w:val="20"/>
               </w:rPr>
@@ -7431,13 +7428,13 @@
             <w:pPr>
               <w:rPr>
                 <w:rFonts w:hint="default" w:ascii="Times New Roman" w:hAnsi="Times New Roman" w:cs="Times New Roman"/>
-                <w:color w:val="000000"/>
+                <w:color w:val="auto"/>
               </w:rPr>
             </w:pPr>
             <w:r>
               <w:rPr>
                 <w:rFonts w:hint="default" w:ascii="Times New Roman" w:hAnsi="Times New Roman" w:eastAsia="Arial" w:cs="Times New Roman"/>
-                <w:color w:val="000000"/>
+                <w:color w:val="auto"/>
                 <w:sz w:val="20"/>
                 <w:szCs w:val="20"/>
               </w:rPr>
@@ -7465,13 +7462,13 @@
             <w:pPr>
               <w:rPr>
                 <w:rFonts w:hint="default" w:ascii="Times New Roman" w:hAnsi="Times New Roman" w:cs="Times New Roman"/>
-                <w:color w:val="000000"/>
+                <w:color w:val="auto"/>
               </w:rPr>
             </w:pPr>
             <w:r>
               <w:rPr>
                 <w:rFonts w:hint="default" w:ascii="Times New Roman" w:hAnsi="Times New Roman" w:eastAsia="Arial" w:cs="Times New Roman"/>
-                <w:color w:val="000000"/>
+                <w:color w:val="auto"/>
                 <w:sz w:val="20"/>
                 <w:szCs w:val="20"/>
               </w:rPr>
@@ -7517,13 +7514,13 @@
             <w:pPr>
               <w:rPr>
                 <w:rFonts w:hint="default" w:ascii="Times New Roman" w:hAnsi="Times New Roman" w:cs="Times New Roman"/>
-                <w:color w:val="000000"/>
+                <w:color w:val="auto"/>
               </w:rPr>
             </w:pPr>
             <w:r>
               <w:rPr>
                 <w:rFonts w:hint="default" w:ascii="Times New Roman" w:hAnsi="Times New Roman" w:eastAsia="Arial" w:cs="Times New Roman"/>
-                <w:color w:val="000000"/>
+                <w:color w:val="auto"/>
                 <w:sz w:val="20"/>
                 <w:szCs w:val="20"/>
               </w:rPr>
@@ -7551,13 +7548,13 @@
             <w:pPr>
               <w:rPr>
                 <w:rFonts w:hint="default" w:ascii="Times New Roman" w:hAnsi="Times New Roman" w:cs="Times New Roman"/>
-                <w:color w:val="000000"/>
+                <w:color w:val="auto"/>
               </w:rPr>
             </w:pPr>
             <w:r>
               <w:rPr>
                 <w:rFonts w:hint="default" w:ascii="Times New Roman" w:hAnsi="Times New Roman" w:eastAsia="Arial" w:cs="Times New Roman"/>
-                <w:color w:val="000000"/>
+                <w:color w:val="auto"/>
                 <w:sz w:val="20"/>
                 <w:szCs w:val="20"/>
               </w:rPr>
@@ -7585,13 +7582,13 @@
             <w:pPr>
               <w:rPr>
                 <w:rFonts w:hint="default" w:ascii="Times New Roman" w:hAnsi="Times New Roman" w:cs="Times New Roman"/>
-                <w:color w:val="000000"/>
+                <w:color w:val="auto"/>
               </w:rPr>
             </w:pPr>
             <w:r>
               <w:rPr>
                 <w:rFonts w:hint="default" w:ascii="Times New Roman" w:hAnsi="Times New Roman" w:eastAsia="Arial" w:cs="Times New Roman"/>
-                <w:color w:val="000000"/>
+                <w:color w:val="auto"/>
                 <w:sz w:val="20"/>
                 <w:szCs w:val="20"/>
               </w:rPr>
@@ -7619,13 +7616,13 @@
             <w:pPr>
               <w:rPr>
                 <w:rFonts w:hint="default" w:ascii="Times New Roman" w:hAnsi="Times New Roman" w:cs="Times New Roman"/>
-                <w:color w:val="000000"/>
+                <w:color w:val="auto"/>
               </w:rPr>
             </w:pPr>
             <w:r>
               <w:rPr>
                 <w:rFonts w:hint="default" w:ascii="Times New Roman" w:hAnsi="Times New Roman" w:eastAsia="Arial" w:cs="Times New Roman"/>
-                <w:color w:val="000000"/>
+                <w:color w:val="auto"/>
                 <w:sz w:val="20"/>
                 <w:szCs w:val="20"/>
               </w:rPr>
@@ -7671,13 +7668,13 @@
             <w:pPr>
               <w:rPr>
                 <w:rFonts w:hint="default" w:ascii="Times New Roman" w:hAnsi="Times New Roman" w:cs="Times New Roman"/>
-                <w:color w:val="000000"/>
+                <w:color w:val="auto"/>
               </w:rPr>
             </w:pPr>
             <w:r>
               <w:rPr>
                 <w:rFonts w:hint="default" w:ascii="Times New Roman" w:hAnsi="Times New Roman" w:eastAsia="Arial" w:cs="Times New Roman"/>
-                <w:color w:val="000000"/>
+                <w:color w:val="auto"/>
                 <w:sz w:val="20"/>
                 <w:szCs w:val="20"/>
               </w:rPr>
@@ -7705,13 +7702,13 @@
             <w:pPr>
               <w:rPr>
                 <w:rFonts w:hint="default" w:ascii="Times New Roman" w:hAnsi="Times New Roman" w:cs="Times New Roman"/>
-                <w:color w:val="000000"/>
+                <w:color w:val="auto"/>
               </w:rPr>
             </w:pPr>
             <w:r>
               <w:rPr>
                 <w:rFonts w:hint="default" w:ascii="Times New Roman" w:hAnsi="Times New Roman" w:eastAsia="Arial" w:cs="Times New Roman"/>
-                <w:color w:val="000000"/>
+                <w:color w:val="auto"/>
                 <w:sz w:val="20"/>
                 <w:szCs w:val="20"/>
               </w:rPr>
@@ -7739,13 +7736,13 @@
             <w:pPr>
               <w:rPr>
                 <w:rFonts w:hint="default" w:ascii="Times New Roman" w:hAnsi="Times New Roman" w:cs="Times New Roman"/>
-                <w:color w:val="000000"/>
+                <w:color w:val="auto"/>
               </w:rPr>
             </w:pPr>
             <w:r>
               <w:rPr>
                 <w:rFonts w:hint="default" w:ascii="Times New Roman" w:hAnsi="Times New Roman" w:eastAsia="Arial" w:cs="Times New Roman"/>
-                <w:color w:val="000000"/>
+                <w:color w:val="auto"/>
                 <w:sz w:val="20"/>
                 <w:szCs w:val="20"/>
               </w:rPr>
@@ -7773,13 +7770,13 @@
             <w:pPr>
               <w:rPr>
                 <w:rFonts w:hint="default" w:ascii="Times New Roman" w:hAnsi="Times New Roman" w:cs="Times New Roman"/>
-                <w:color w:val="000000"/>
+                <w:color w:val="auto"/>
               </w:rPr>
             </w:pPr>
             <w:r>
               <w:rPr>
                 <w:rFonts w:hint="default" w:ascii="Times New Roman" w:hAnsi="Times New Roman" w:eastAsia="Arial" w:cs="Times New Roman"/>
-                <w:color w:val="000000"/>
+                <w:color w:val="auto"/>
                 <w:sz w:val="20"/>
                 <w:szCs w:val="20"/>
               </w:rPr>
@@ -7825,13 +7822,13 @@
             <w:pPr>
               <w:rPr>
                 <w:rFonts w:hint="default" w:ascii="Times New Roman" w:hAnsi="Times New Roman" w:cs="Times New Roman"/>
-                <w:color w:val="000000"/>
+                <w:color w:val="auto"/>
               </w:rPr>
             </w:pPr>
             <w:r>
               <w:rPr>
                 <w:rFonts w:hint="default" w:ascii="Times New Roman" w:hAnsi="Times New Roman" w:eastAsia="Arial" w:cs="Times New Roman"/>
-                <w:color w:val="000000"/>
+                <w:color w:val="auto"/>
                 <w:sz w:val="20"/>
                 <w:szCs w:val="20"/>
               </w:rPr>
@@ -7859,13 +7856,13 @@
             <w:pPr>
               <w:rPr>
                 <w:rFonts w:hint="default" w:ascii="Times New Roman" w:hAnsi="Times New Roman" w:cs="Times New Roman"/>
-                <w:color w:val="000000"/>
+                <w:color w:val="auto"/>
               </w:rPr>
             </w:pPr>
             <w:r>
               <w:rPr>
                 <w:rFonts w:hint="default" w:ascii="Times New Roman" w:hAnsi="Times New Roman" w:eastAsia="Arial" w:cs="Times New Roman"/>
-                <w:color w:val="000000"/>
+                <w:color w:val="auto"/>
                 <w:sz w:val="20"/>
                 <w:szCs w:val="20"/>
               </w:rPr>
@@ -7893,13 +7890,13 @@
             <w:pPr>
               <w:rPr>
                 <w:rFonts w:hint="default" w:ascii="Times New Roman" w:hAnsi="Times New Roman" w:cs="Times New Roman"/>
-                <w:color w:val="000000"/>
+                <w:color w:val="auto"/>
               </w:rPr>
             </w:pPr>
             <w:r>
               <w:rPr>
                 <w:rFonts w:hint="default" w:ascii="Times New Roman" w:hAnsi="Times New Roman" w:eastAsia="Arial" w:cs="Times New Roman"/>
-                <w:color w:val="000000"/>
+                <w:color w:val="auto"/>
                 <w:sz w:val="20"/>
                 <w:szCs w:val="20"/>
               </w:rPr>
@@ -7927,13 +7924,13 @@
             <w:pPr>
               <w:rPr>
                 <w:rFonts w:hint="default" w:ascii="Times New Roman" w:hAnsi="Times New Roman" w:cs="Times New Roman"/>
-                <w:color w:val="000000"/>
+                <w:color w:val="auto"/>
               </w:rPr>
             </w:pPr>
             <w:r>
               <w:rPr>
                 <w:rFonts w:hint="default" w:ascii="Times New Roman" w:hAnsi="Times New Roman" w:eastAsia="Arial" w:cs="Times New Roman"/>
-                <w:color w:val="000000"/>
+                <w:color w:val="auto"/>
                 <w:sz w:val="20"/>
                 <w:szCs w:val="20"/>
               </w:rPr>
@@ -7979,13 +7976,13 @@
             <w:pPr>
               <w:rPr>
                 <w:rFonts w:hint="default" w:ascii="Times New Roman" w:hAnsi="Times New Roman" w:cs="Times New Roman"/>
-                <w:color w:val="000000"/>
+                <w:color w:val="auto"/>
               </w:rPr>
             </w:pPr>
             <w:r>
               <w:rPr>
                 <w:rFonts w:hint="default" w:ascii="Times New Roman" w:hAnsi="Times New Roman" w:eastAsia="Arial" w:cs="Times New Roman"/>
-                <w:color w:val="000000"/>
+                <w:color w:val="auto"/>
                 <w:sz w:val="20"/>
                 <w:szCs w:val="20"/>
               </w:rPr>
@@ -8013,13 +8010,13 @@
             <w:pPr>
               <w:rPr>
                 <w:rFonts w:hint="default" w:ascii="Times New Roman" w:hAnsi="Times New Roman" w:cs="Times New Roman"/>
-                <w:color w:val="000000"/>
+                <w:color w:val="auto"/>
               </w:rPr>
             </w:pPr>
             <w:r>
               <w:rPr>
                 <w:rFonts w:hint="default" w:ascii="Times New Roman" w:hAnsi="Times New Roman" w:eastAsia="Arial" w:cs="Times New Roman"/>
-                <w:color w:val="000000"/>
+                <w:color w:val="auto"/>
                 <w:sz w:val="20"/>
                 <w:szCs w:val="20"/>
               </w:rPr>
@@ -8047,13 +8044,13 @@
             <w:pPr>
               <w:rPr>
                 <w:rFonts w:hint="default" w:ascii="Times New Roman" w:hAnsi="Times New Roman" w:cs="Times New Roman"/>
-                <w:color w:val="000000"/>
+                <w:color w:val="auto"/>
               </w:rPr>
             </w:pPr>
             <w:r>
               <w:rPr>
                 <w:rFonts w:hint="default" w:ascii="Times New Roman" w:hAnsi="Times New Roman" w:eastAsia="Arial" w:cs="Times New Roman"/>
-                <w:color w:val="000000"/>
+                <w:color w:val="auto"/>
                 <w:sz w:val="20"/>
                 <w:szCs w:val="20"/>
               </w:rPr>
@@ -8081,13 +8078,13 @@
             <w:pPr>
               <w:rPr>
                 <w:rFonts w:hint="default" w:ascii="Times New Roman" w:hAnsi="Times New Roman" w:cs="Times New Roman"/>
-                <w:color w:val="000000"/>
+                <w:color w:val="auto"/>
               </w:rPr>
             </w:pPr>
             <w:r>
               <w:rPr>
                 <w:rFonts w:hint="default" w:ascii="Times New Roman" w:hAnsi="Times New Roman" w:eastAsia="Arial" w:cs="Times New Roman"/>
-                <w:color w:val="000000"/>
+                <w:color w:val="auto"/>
                 <w:sz w:val="20"/>
                 <w:szCs w:val="20"/>
               </w:rPr>
@@ -8133,13 +8130,13 @@
             <w:pPr>
               <w:rPr>
                 <w:rFonts w:hint="default" w:ascii="Times New Roman" w:hAnsi="Times New Roman" w:cs="Times New Roman"/>
-                <w:color w:val="000000"/>
+                <w:color w:val="auto"/>
               </w:rPr>
             </w:pPr>
             <w:r>
               <w:rPr>
                 <w:rFonts w:hint="default" w:ascii="Times New Roman" w:hAnsi="Times New Roman" w:eastAsia="Arial" w:cs="Times New Roman"/>
-                <w:color w:val="000000"/>
+                <w:color w:val="auto"/>
                 <w:sz w:val="20"/>
                 <w:szCs w:val="20"/>
               </w:rPr>
@@ -8167,13 +8164,13 @@
             <w:pPr>
               <w:rPr>
                 <w:rFonts w:hint="default" w:ascii="Times New Roman" w:hAnsi="Times New Roman" w:cs="Times New Roman"/>
-                <w:color w:val="000000"/>
+                <w:color w:val="auto"/>
               </w:rPr>
             </w:pPr>
             <w:r>
               <w:rPr>
                 <w:rFonts w:hint="default" w:ascii="Times New Roman" w:hAnsi="Times New Roman" w:eastAsia="Arial" w:cs="Times New Roman"/>
-                <w:color w:val="000000"/>
+                <w:color w:val="auto"/>
                 <w:sz w:val="20"/>
                 <w:szCs w:val="20"/>
               </w:rPr>
@@ -8201,13 +8198,13 @@
             <w:pPr>
               <w:rPr>
                 <w:rFonts w:hint="default" w:ascii="Times New Roman" w:hAnsi="Times New Roman" w:cs="Times New Roman"/>
-                <w:color w:val="000000"/>
+                <w:color w:val="auto"/>
               </w:rPr>
             </w:pPr>
             <w:r>
               <w:rPr>
                 <w:rFonts w:hint="default" w:ascii="Times New Roman" w:hAnsi="Times New Roman" w:eastAsia="Arial" w:cs="Times New Roman"/>
-                <w:color w:val="000000"/>
+                <w:color w:val="auto"/>
                 <w:sz w:val="20"/>
                 <w:szCs w:val="20"/>
               </w:rPr>
@@ -8235,13 +8232,13 @@
             <w:pPr>
               <w:rPr>
                 <w:rFonts w:hint="default" w:ascii="Times New Roman" w:hAnsi="Times New Roman" w:cs="Times New Roman"/>
-                <w:color w:val="000000"/>
+                <w:color w:val="auto"/>
               </w:rPr>
             </w:pPr>
             <w:r>
               <w:rPr>
                 <w:rFonts w:hint="default" w:ascii="Times New Roman" w:hAnsi="Times New Roman" w:eastAsia="Arial" w:cs="Times New Roman"/>
-                <w:color w:val="000000"/>
+                <w:color w:val="auto"/>
                 <w:sz w:val="20"/>
                 <w:szCs w:val="20"/>
               </w:rPr>
@@ -8591,14 +8588,16 @@
         <w:rPr>
           <w:rFonts w:hint="default" w:ascii="Times New Roman" w:hAnsi="Times New Roman" w:cs="Times New Roman"/>
           <w:color w:val="auto"/>
-        </w:rPr>
-      </w:pPr>
-      <w:r>
-        <w:rPr>
-          <w:rFonts w:hint="default" w:ascii="Times New Roman" w:hAnsi="Times New Roman" w:eastAsia="Arial" w:cs="Times New Roman"/>
-          <w:color w:val="auto"/>
-          <w:sz w:val="22"/>
-          <w:szCs w:val="22"/>
+          <w:sz w:val="24"/>
+          <w:szCs w:val="24"/>
+        </w:rPr>
+      </w:pPr>
+      <w:r>
+        <w:rPr>
+          <w:rFonts w:hint="default" w:ascii="Times New Roman" w:hAnsi="Times New Roman" w:eastAsia="Arial" w:cs="Times New Roman"/>
+          <w:color w:val="auto"/>
+          <w:sz w:val="24"/>
+          <w:szCs w:val="24"/>
         </w:rPr>
         <w:t>All implementation was conducted in Python 3.10. Machine learning was implemented using scikit-learn 1.3.0, with class imbalance handling via imbalanced-learn 0.11.0 (SMOTE). Data processing used pandas 2.0.3 and numpy 1.24.3. Feature extraction used urllib.parse (standard library), tldextract 3.4.4 for domain analysis, BeautifulSoup4 4.12.2 for HTML parsing, and python-whois 0.8.0 for WHOIS lookups. Visualisation used matplotlib 3.7.2 and seaborn 0.12.2. Version control was maintained via Git with a GitHub repository. Development was tracked in OneNote with biweekly sprint records.</w:t>
       </w:r>
@@ -8674,15 +8673,1626 @@
     </w:p>
     <w:p>
       <w:pPr>
-        <w:rPr>
-          <w:rFonts w:hint="default" w:ascii="Times New Roman" w:hAnsi="Times New Roman" w:cs="Times New Roman"/>
-          <w:color w:val="auto"/>
-        </w:rPr>
-      </w:pPr>
-    </w:p>
-    <w:p>
-      <w:pPr>
-        <w:jc w:val="both"/>
+        <w:pStyle w:val="2"/>
+        <w:spacing w:before="400" w:after="160"/>
+        <w:rPr>
+          <w:rFonts w:hint="default" w:ascii="Times New Roman" w:hAnsi="Times New Roman" w:eastAsia="Arial" w:cs="Times New Roman"/>
+          <w:b/>
+          <w:bCs/>
+          <w:color w:val="auto"/>
+          <w:sz w:val="36"/>
+          <w:szCs w:val="36"/>
+        </w:rPr>
+      </w:pPr>
+    </w:p>
+    <w:p>
+      <w:pPr>
+        <w:rPr>
+          <w:rFonts w:hint="default" w:ascii="Times New Roman" w:hAnsi="Times New Roman" w:eastAsia="Arial" w:cs="Times New Roman"/>
+          <w:b/>
+          <w:bCs/>
+          <w:color w:val="auto"/>
+          <w:sz w:val="36"/>
+          <w:szCs w:val="36"/>
+        </w:rPr>
+      </w:pPr>
+    </w:p>
+    <w:p>
+      <w:pPr>
+        <w:rPr>
+          <w:rFonts w:hint="default" w:ascii="Times New Roman" w:hAnsi="Times New Roman" w:eastAsia="Arial" w:cs="Times New Roman"/>
+          <w:b/>
+          <w:bCs/>
+          <w:color w:val="auto"/>
+          <w:sz w:val="36"/>
+          <w:szCs w:val="36"/>
+        </w:rPr>
+      </w:pPr>
+    </w:p>
+    <w:p>
+      <w:pPr>
+        <w:rPr>
+          <w:rFonts w:hint="default" w:ascii="Times New Roman" w:hAnsi="Times New Roman" w:eastAsia="Arial" w:cs="Times New Roman"/>
+          <w:b/>
+          <w:bCs/>
+          <w:color w:val="auto"/>
+          <w:sz w:val="36"/>
+          <w:szCs w:val="36"/>
+        </w:rPr>
+      </w:pPr>
+    </w:p>
+    <w:p>
+      <w:pPr>
+        <w:rPr>
+          <w:rFonts w:hint="default" w:ascii="Times New Roman" w:hAnsi="Times New Roman" w:eastAsia="Arial" w:cs="Times New Roman"/>
+          <w:b/>
+          <w:bCs/>
+          <w:color w:val="auto"/>
+          <w:sz w:val="36"/>
+          <w:szCs w:val="36"/>
+        </w:rPr>
+      </w:pPr>
+    </w:p>
+    <w:p>
+      <w:pPr>
+        <w:rPr>
+          <w:rFonts w:hint="default" w:ascii="Times New Roman" w:hAnsi="Times New Roman" w:eastAsia="Arial" w:cs="Times New Roman"/>
+          <w:b/>
+          <w:bCs/>
+          <w:color w:val="auto"/>
+          <w:sz w:val="36"/>
+          <w:szCs w:val="36"/>
+        </w:rPr>
+      </w:pPr>
+    </w:p>
+    <w:p>
+      <w:pPr>
+        <w:rPr>
+          <w:rFonts w:hint="default" w:ascii="Times New Roman" w:hAnsi="Times New Roman" w:eastAsia="Arial" w:cs="Times New Roman"/>
+          <w:b/>
+          <w:bCs/>
+          <w:color w:val="auto"/>
+          <w:sz w:val="36"/>
+          <w:szCs w:val="36"/>
+        </w:rPr>
+      </w:pPr>
+    </w:p>
+    <w:p>
+      <w:pPr>
+        <w:rPr>
+          <w:rFonts w:hint="default" w:ascii="Times New Roman" w:hAnsi="Times New Roman" w:eastAsia="Arial" w:cs="Times New Roman"/>
+          <w:b/>
+          <w:bCs/>
+          <w:color w:val="auto"/>
+          <w:sz w:val="36"/>
+          <w:szCs w:val="36"/>
+        </w:rPr>
+      </w:pPr>
+    </w:p>
+    <w:p>
+      <w:pPr>
+        <w:rPr>
+          <w:rFonts w:hint="default" w:ascii="Times New Roman" w:hAnsi="Times New Roman" w:eastAsia="Arial" w:cs="Times New Roman"/>
+          <w:b/>
+          <w:bCs/>
+          <w:color w:val="auto"/>
+          <w:sz w:val="36"/>
+          <w:szCs w:val="36"/>
+        </w:rPr>
+      </w:pPr>
+    </w:p>
+    <w:p>
+      <w:pPr>
+        <w:rPr>
+          <w:rFonts w:hint="default" w:ascii="Times New Roman" w:hAnsi="Times New Roman" w:eastAsia="Arial" w:cs="Times New Roman"/>
+          <w:b/>
+          <w:bCs/>
+          <w:color w:val="auto"/>
+          <w:sz w:val="36"/>
+          <w:szCs w:val="36"/>
+        </w:rPr>
+      </w:pPr>
+    </w:p>
+    <w:p>
+      <w:pPr>
+        <w:rPr>
+          <w:rFonts w:hint="default" w:ascii="Times New Roman" w:hAnsi="Times New Roman" w:eastAsia="Arial" w:cs="Times New Roman"/>
+          <w:b/>
+          <w:bCs/>
+          <w:color w:val="auto"/>
+          <w:sz w:val="36"/>
+          <w:szCs w:val="36"/>
+        </w:rPr>
+      </w:pPr>
+    </w:p>
+    <w:p>
+      <w:pPr>
+        <w:rPr>
+          <w:rFonts w:hint="default" w:ascii="Times New Roman" w:hAnsi="Times New Roman" w:eastAsia="Arial" w:cs="Times New Roman"/>
+          <w:b/>
+          <w:bCs/>
+          <w:color w:val="auto"/>
+          <w:sz w:val="36"/>
+          <w:szCs w:val="36"/>
+        </w:rPr>
+      </w:pPr>
+    </w:p>
+    <w:p>
+      <w:pPr>
+        <w:rPr>
+          <w:rFonts w:hint="default" w:ascii="Times New Roman" w:hAnsi="Times New Roman" w:eastAsia="Arial" w:cs="Times New Roman"/>
+          <w:b/>
+          <w:bCs/>
+          <w:color w:val="auto"/>
+          <w:sz w:val="36"/>
+          <w:szCs w:val="36"/>
+        </w:rPr>
+      </w:pPr>
+    </w:p>
+    <w:p>
+      <w:pPr>
+        <w:rPr>
+          <w:rFonts w:hint="default" w:ascii="Times New Roman" w:hAnsi="Times New Roman" w:eastAsia="Arial" w:cs="Times New Roman"/>
+          <w:b/>
+          <w:bCs/>
+          <w:color w:val="auto"/>
+          <w:sz w:val="36"/>
+          <w:szCs w:val="36"/>
+        </w:rPr>
+      </w:pPr>
+    </w:p>
+    <w:p>
+      <w:pPr>
+        <w:pStyle w:val="2"/>
+        <w:spacing w:before="400" w:after="160"/>
+        <w:jc w:val="left"/>
+        <w:rPr>
+          <w:rFonts w:hint="default" w:ascii="Times New Roman" w:hAnsi="Times New Roman" w:cs="Times New Roman"/>
+          <w:color w:val="auto"/>
+        </w:rPr>
+      </w:pPr>
+      <w:r>
+        <w:rPr>
+          <w:rFonts w:hint="default" w:ascii="Times New Roman" w:hAnsi="Times New Roman" w:eastAsia="Arial" w:cs="Times New Roman"/>
+          <w:b/>
+          <w:bCs/>
+          <w:color w:val="auto"/>
+          <w:sz w:val="36"/>
+          <w:szCs w:val="36"/>
+        </w:rPr>
+        <w:t>Chapter 4: Implementation</w:t>
+      </w:r>
+    </w:p>
+    <w:p>
+      <w:pPr>
+        <w:pStyle w:val="3"/>
+        <w:spacing w:before="300" w:after="120"/>
+        <w:jc w:val="left"/>
+        <w:rPr>
+          <w:rFonts w:hint="default" w:ascii="Times New Roman" w:hAnsi="Times New Roman" w:eastAsia="Arial" w:cs="Times New Roman"/>
+          <w:b/>
+          <w:bCs/>
+          <w:color w:val="auto"/>
+          <w:sz w:val="28"/>
+          <w:szCs w:val="28"/>
+        </w:rPr>
+      </w:pPr>
+      <w:r>
+        <w:rPr>
+          <w:rFonts w:hint="default" w:ascii="Times New Roman" w:hAnsi="Times New Roman" w:eastAsia="Arial" w:cs="Times New Roman"/>
+          <w:b/>
+          <w:bCs/>
+          <w:color w:val="auto"/>
+          <w:sz w:val="28"/>
+          <w:szCs w:val="28"/>
+        </w:rPr>
+        <w:t>4.1 Development Environment</w:t>
+      </w:r>
+    </w:p>
+    <w:p>
+      <w:pPr>
+        <w:keepNext w:val="0"/>
+        <w:keepLines w:val="0"/>
+        <w:widowControl/>
+        <w:suppressLineNumbers w:val="0"/>
+        <w:jc w:val="both"/>
+        <w:rPr>
+          <w:rFonts w:hint="default" w:ascii="Times New Roman" w:hAnsi="Times New Roman" w:cs="Times New Roman"/>
+          <w:color w:val="auto"/>
+        </w:rPr>
+      </w:pPr>
+      <w:r>
+        <w:rPr>
+          <w:rFonts w:hint="default" w:ascii="Times New Roman" w:hAnsi="Times New Roman" w:eastAsia="SimSun" w:cs="Times New Roman"/>
+          <w:color w:val="auto"/>
+          <w:kern w:val="0"/>
+          <w:sz w:val="24"/>
+          <w:szCs w:val="24"/>
+          <w:lang w:val="en-US" w:eastAsia="zh-CN" w:bidi="ar"/>
+        </w:rPr>
+        <w:t xml:space="preserve">Using </w:t>
+      </w:r>
+      <w:r>
+        <w:rPr>
+          <w:rFonts w:hint="default" w:ascii="Times New Roman" w:hAnsi="Times New Roman" w:eastAsia="SimSun" w:cs="Times New Roman"/>
+          <w:color w:val="auto"/>
+          <w:kern w:val="0"/>
+          <w:sz w:val="24"/>
+          <w:szCs w:val="24"/>
+          <w:lang w:val="en-GB" w:eastAsia="zh-CN" w:bidi="ar"/>
+        </w:rPr>
+        <w:t>Anaconda</w:t>
+      </w:r>
+      <w:r>
+        <w:rPr>
+          <w:rFonts w:hint="default" w:ascii="Times New Roman" w:hAnsi="Times New Roman" w:eastAsia="SimSun" w:cs="Times New Roman"/>
+          <w:color w:val="auto"/>
+          <w:kern w:val="0"/>
+          <w:sz w:val="24"/>
+          <w:szCs w:val="24"/>
+          <w:lang w:val="en-US" w:eastAsia="zh-CN" w:bidi="ar"/>
+        </w:rPr>
+        <w:t xml:space="preserve"> as the main IDE and Jupyter Notebook for exploratory data analysis, the development environment was set up on Windows 11 . Because it is compatible with all necessary libraries and performs better than Python 3.8 and prior, the Python 3.10 runtime was chosen. The following directory structure was used to create an organised project repository:</w:t>
+      </w:r>
+    </w:p>
+    <w:p>
+      <w:pPr>
+        <w:spacing w:before="80" w:after="80"/>
+        <w:jc w:val="both"/>
+        <w:rPr>
+          <w:rFonts w:hint="default" w:ascii="Times New Roman" w:hAnsi="Times New Roman" w:cs="Times New Roman"/>
+          <w:color w:val="auto"/>
+        </w:rPr>
+      </w:pPr>
+      <w:r>
+        <w:rPr>
+          <w:rFonts w:hint="default" w:ascii="Times New Roman" w:hAnsi="Times New Roman" w:eastAsia="Courier New" w:cs="Times New Roman"/>
+          <w:color w:val="auto"/>
+          <w:sz w:val="20"/>
+          <w:szCs w:val="20"/>
+        </w:rPr>
+        <w:t>phishing_detection/</w:t>
+      </w:r>
+    </w:p>
+    <w:p>
+      <w:pPr>
+        <w:spacing w:before="0" w:after="0"/>
+        <w:jc w:val="both"/>
+        <w:rPr>
+          <w:rFonts w:hint="default" w:ascii="Times New Roman" w:hAnsi="Times New Roman" w:cs="Times New Roman"/>
+          <w:color w:val="auto"/>
+        </w:rPr>
+      </w:pPr>
+      <w:r>
+        <w:rPr>
+          <w:rFonts w:hint="default" w:ascii="Times New Roman" w:hAnsi="Times New Roman" w:eastAsia="Courier New" w:cs="Times New Roman"/>
+          <w:color w:val="auto"/>
+          <w:sz w:val="18"/>
+          <w:szCs w:val="18"/>
+        </w:rPr>
+        <w:t>├── config.py                  # Centralised configuration and constants</w:t>
+      </w:r>
+    </w:p>
+    <w:p>
+      <w:pPr>
+        <w:spacing w:before="0" w:after="0"/>
+        <w:jc w:val="both"/>
+        <w:rPr>
+          <w:rFonts w:hint="default" w:ascii="Times New Roman" w:hAnsi="Times New Roman" w:cs="Times New Roman"/>
+          <w:color w:val="auto"/>
+        </w:rPr>
+      </w:pPr>
+      <w:r>
+        <w:rPr>
+          <w:rFonts w:hint="default" w:ascii="Times New Roman" w:hAnsi="Times New Roman" w:eastAsia="Courier New" w:cs="Times New Roman"/>
+          <w:color w:val="auto"/>
+          <w:sz w:val="18"/>
+          <w:szCs w:val="18"/>
+        </w:rPr>
+        <w:t>├── main.py                    # Entry point for full pipeline execution</w:t>
+      </w:r>
+    </w:p>
+    <w:p>
+      <w:pPr>
+        <w:spacing w:before="0" w:after="0"/>
+        <w:jc w:val="both"/>
+        <w:rPr>
+          <w:rFonts w:hint="default" w:ascii="Times New Roman" w:hAnsi="Times New Roman" w:cs="Times New Roman"/>
+          <w:color w:val="auto"/>
+        </w:rPr>
+      </w:pPr>
+      <w:r>
+        <w:rPr>
+          <w:rFonts w:hint="default" w:ascii="Times New Roman" w:hAnsi="Times New Roman" w:eastAsia="Courier New" w:cs="Times New Roman"/>
+          <w:color w:val="auto"/>
+          <w:sz w:val="18"/>
+          <w:szCs w:val="18"/>
+        </w:rPr>
+        <w:t>├── requirements.txt           # Pinned library versions</w:t>
+      </w:r>
+    </w:p>
+    <w:p>
+      <w:pPr>
+        <w:spacing w:before="0" w:after="0"/>
+        <w:jc w:val="both"/>
+        <w:rPr>
+          <w:rFonts w:hint="default" w:ascii="Times New Roman" w:hAnsi="Times New Roman" w:cs="Times New Roman"/>
+          <w:color w:val="auto"/>
+        </w:rPr>
+      </w:pPr>
+      <w:r>
+        <w:rPr>
+          <w:rFonts w:hint="default" w:ascii="Times New Roman" w:hAnsi="Times New Roman" w:eastAsia="Courier New" w:cs="Times New Roman"/>
+          <w:color w:val="auto"/>
+          <w:sz w:val="18"/>
+          <w:szCs w:val="18"/>
+        </w:rPr>
+        <w:t>├── data/                      # Kaggle datasets and preprocessed files</w:t>
+      </w:r>
+    </w:p>
+    <w:p>
+      <w:pPr>
+        <w:spacing w:before="0" w:after="0"/>
+        <w:jc w:val="both"/>
+        <w:rPr>
+          <w:rFonts w:hint="default" w:ascii="Times New Roman" w:hAnsi="Times New Roman" w:cs="Times New Roman"/>
+          <w:color w:val="auto"/>
+        </w:rPr>
+      </w:pPr>
+      <w:r>
+        <w:rPr>
+          <w:rFonts w:hint="default" w:ascii="Times New Roman" w:hAnsi="Times New Roman" w:eastAsia="Courier New" w:cs="Times New Roman"/>
+          <w:color w:val="auto"/>
+          <w:sz w:val="18"/>
+          <w:szCs w:val="18"/>
+        </w:rPr>
+        <w:t>├── models/                    # Serialised trained model files</w:t>
+      </w:r>
+    </w:p>
+    <w:p>
+      <w:pPr>
+        <w:spacing w:before="0" w:after="0"/>
+        <w:jc w:val="both"/>
+        <w:rPr>
+          <w:rFonts w:hint="default" w:ascii="Times New Roman" w:hAnsi="Times New Roman" w:cs="Times New Roman"/>
+          <w:color w:val="auto"/>
+        </w:rPr>
+      </w:pPr>
+      <w:r>
+        <w:rPr>
+          <w:rFonts w:hint="default" w:ascii="Times New Roman" w:hAnsi="Times New Roman" w:eastAsia="Courier New" w:cs="Times New Roman"/>
+          <w:color w:val="auto"/>
+          <w:sz w:val="18"/>
+          <w:szCs w:val="18"/>
+        </w:rPr>
+        <w:t>├── results/                   # Evaluation outputs and figures</w:t>
+      </w:r>
+    </w:p>
+    <w:p>
+      <w:pPr>
+        <w:spacing w:before="0" w:after="0"/>
+        <w:jc w:val="both"/>
+        <w:rPr>
+          <w:rFonts w:hint="default" w:ascii="Times New Roman" w:hAnsi="Times New Roman" w:cs="Times New Roman"/>
+          <w:color w:val="auto"/>
+        </w:rPr>
+      </w:pPr>
+      <w:r>
+        <w:rPr>
+          <w:rFonts w:hint="default" w:ascii="Times New Roman" w:hAnsi="Times New Roman" w:eastAsia="Courier New" w:cs="Times New Roman"/>
+          <w:color w:val="auto"/>
+          <w:sz w:val="18"/>
+          <w:szCs w:val="18"/>
+        </w:rPr>
+        <w:t>└── src/</w:t>
+      </w:r>
+    </w:p>
+    <w:p>
+      <w:pPr>
+        <w:spacing w:before="0" w:after="0"/>
+        <w:jc w:val="both"/>
+        <w:rPr>
+          <w:rFonts w:hint="default" w:ascii="Times New Roman" w:hAnsi="Times New Roman" w:cs="Times New Roman"/>
+          <w:color w:val="auto"/>
+        </w:rPr>
+      </w:pPr>
+      <w:r>
+        <w:rPr>
+          <w:rFonts w:hint="default" w:ascii="Times New Roman" w:hAnsi="Times New Roman" w:eastAsia="Courier New" w:cs="Times New Roman"/>
+          <w:color w:val="auto"/>
+          <w:sz w:val="18"/>
+          <w:szCs w:val="18"/>
+        </w:rPr>
+        <w:t xml:space="preserve">    ├── data_preparation</w:t>
+      </w:r>
+      <w:r>
+        <w:rPr>
+          <w:rFonts w:hint="default" w:ascii="Times New Roman" w:hAnsi="Times New Roman" w:eastAsia="Courier New" w:cs="Times New Roman"/>
+          <w:color w:val="auto"/>
+          <w:sz w:val="18"/>
+          <w:szCs w:val="18"/>
+          <w:lang w:val="en-GB"/>
+        </w:rPr>
+        <w:t>_hy</w:t>
+      </w:r>
+      <w:r>
+        <w:rPr>
+          <w:rFonts w:hint="default" w:ascii="Times New Roman" w:hAnsi="Times New Roman" w:eastAsia="Courier New" w:cs="Times New Roman"/>
+          <w:color w:val="auto"/>
+          <w:sz w:val="18"/>
+          <w:szCs w:val="18"/>
+        </w:rPr>
+        <w:t>.py    # Dataset loading and preprocessing</w:t>
+      </w:r>
+    </w:p>
+    <w:p>
+      <w:pPr>
+        <w:spacing w:before="0" w:after="0"/>
+        <w:jc w:val="both"/>
+        <w:rPr>
+          <w:rFonts w:hint="default" w:ascii="Times New Roman" w:hAnsi="Times New Roman" w:cs="Times New Roman"/>
+          <w:color w:val="auto"/>
+        </w:rPr>
+      </w:pPr>
+      <w:r>
+        <w:rPr>
+          <w:rFonts w:hint="default" w:ascii="Times New Roman" w:hAnsi="Times New Roman" w:eastAsia="Courier New" w:cs="Times New Roman"/>
+          <w:color w:val="auto"/>
+          <w:sz w:val="18"/>
+          <w:szCs w:val="18"/>
+        </w:rPr>
+        <w:t xml:space="preserve">    ├── feature_extraction</w:t>
+      </w:r>
+      <w:r>
+        <w:rPr>
+          <w:rFonts w:hint="default" w:ascii="Times New Roman" w:hAnsi="Times New Roman" w:eastAsia="Courier New" w:cs="Times New Roman"/>
+          <w:color w:val="auto"/>
+          <w:sz w:val="18"/>
+          <w:szCs w:val="18"/>
+          <w:lang w:val="en-GB"/>
+        </w:rPr>
+        <w:t>_hy</w:t>
+      </w:r>
+      <w:r>
+        <w:rPr>
+          <w:rFonts w:hint="default" w:ascii="Times New Roman" w:hAnsi="Times New Roman" w:eastAsia="Courier New" w:cs="Times New Roman"/>
+          <w:color w:val="auto"/>
+          <w:sz w:val="18"/>
+          <w:szCs w:val="18"/>
+        </w:rPr>
+        <w:t>.py  # FeatureExtractor class</w:t>
+      </w:r>
+    </w:p>
+    <w:p>
+      <w:pPr>
+        <w:spacing w:before="0" w:after="0"/>
+        <w:jc w:val="both"/>
+        <w:rPr>
+          <w:rFonts w:hint="default" w:ascii="Times New Roman" w:hAnsi="Times New Roman" w:cs="Times New Roman"/>
+          <w:color w:val="auto"/>
+        </w:rPr>
+      </w:pPr>
+      <w:r>
+        <w:rPr>
+          <w:rFonts w:hint="default" w:ascii="Times New Roman" w:hAnsi="Times New Roman" w:eastAsia="Courier New" w:cs="Times New Roman"/>
+          <w:color w:val="auto"/>
+          <w:sz w:val="18"/>
+          <w:szCs w:val="18"/>
+        </w:rPr>
+        <w:t xml:space="preserve">    ├── rule_based_detector</w:t>
+      </w:r>
+      <w:r>
+        <w:rPr>
+          <w:rFonts w:hint="default" w:ascii="Times New Roman" w:hAnsi="Times New Roman" w:eastAsia="Courier New" w:cs="Times New Roman"/>
+          <w:color w:val="auto"/>
+          <w:sz w:val="18"/>
+          <w:szCs w:val="18"/>
+          <w:lang w:val="en-GB"/>
+        </w:rPr>
+        <w:t>_hy</w:t>
+      </w:r>
+      <w:r>
+        <w:rPr>
+          <w:rFonts w:hint="default" w:ascii="Times New Roman" w:hAnsi="Times New Roman" w:eastAsia="Courier New" w:cs="Times New Roman"/>
+          <w:color w:val="auto"/>
+          <w:sz w:val="18"/>
+          <w:szCs w:val="18"/>
+        </w:rPr>
+        <w:t>.py # RuleBasedDetector class</w:t>
+      </w:r>
+    </w:p>
+    <w:p>
+      <w:pPr>
+        <w:spacing w:before="0" w:after="0"/>
+        <w:jc w:val="both"/>
+        <w:rPr>
+          <w:rFonts w:hint="default" w:ascii="Times New Roman" w:hAnsi="Times New Roman" w:cs="Times New Roman"/>
+          <w:color w:val="auto"/>
+        </w:rPr>
+      </w:pPr>
+      <w:r>
+        <w:rPr>
+          <w:rFonts w:hint="default" w:ascii="Times New Roman" w:hAnsi="Times New Roman" w:eastAsia="Courier New" w:cs="Times New Roman"/>
+          <w:color w:val="auto"/>
+          <w:sz w:val="18"/>
+          <w:szCs w:val="18"/>
+        </w:rPr>
+        <w:t xml:space="preserve">    ├── ml_detector</w:t>
+      </w:r>
+      <w:r>
+        <w:rPr>
+          <w:rFonts w:hint="default" w:ascii="Times New Roman" w:hAnsi="Times New Roman" w:eastAsia="Courier New" w:cs="Times New Roman"/>
+          <w:color w:val="auto"/>
+          <w:sz w:val="18"/>
+          <w:szCs w:val="18"/>
+          <w:lang w:val="en-GB"/>
+        </w:rPr>
+        <w:t>_hy</w:t>
+      </w:r>
+      <w:r>
+        <w:rPr>
+          <w:rFonts w:hint="default" w:ascii="Times New Roman" w:hAnsi="Times New Roman" w:eastAsia="Courier New" w:cs="Times New Roman"/>
+          <w:color w:val="auto"/>
+          <w:sz w:val="18"/>
+          <w:szCs w:val="18"/>
+        </w:rPr>
+        <w:t>.py         # MLDetector class</w:t>
+      </w:r>
+    </w:p>
+    <w:p>
+      <w:pPr>
+        <w:spacing w:before="0" w:after="0"/>
+        <w:jc w:val="both"/>
+        <w:rPr>
+          <w:rFonts w:hint="default" w:ascii="Times New Roman" w:hAnsi="Times New Roman" w:cs="Times New Roman"/>
+          <w:color w:val="auto"/>
+        </w:rPr>
+      </w:pPr>
+      <w:r>
+        <w:rPr>
+          <w:rFonts w:hint="default" w:ascii="Times New Roman" w:hAnsi="Times New Roman" w:eastAsia="Courier New" w:cs="Times New Roman"/>
+          <w:color w:val="auto"/>
+          <w:sz w:val="18"/>
+          <w:szCs w:val="18"/>
+        </w:rPr>
+        <w:t xml:space="preserve">    └── hybrid_detector</w:t>
+      </w:r>
+      <w:r>
+        <w:rPr>
+          <w:rFonts w:hint="default" w:ascii="Times New Roman" w:hAnsi="Times New Roman" w:eastAsia="Courier New" w:cs="Times New Roman"/>
+          <w:color w:val="auto"/>
+          <w:sz w:val="18"/>
+          <w:szCs w:val="18"/>
+          <w:lang w:val="en-GB"/>
+        </w:rPr>
+        <w:t>_hy</w:t>
+      </w:r>
+      <w:r>
+        <w:rPr>
+          <w:rFonts w:hint="default" w:ascii="Times New Roman" w:hAnsi="Times New Roman" w:eastAsia="Courier New" w:cs="Times New Roman"/>
+          <w:color w:val="auto"/>
+          <w:sz w:val="18"/>
+          <w:szCs w:val="18"/>
+        </w:rPr>
+        <w:t>.py     # HybridDetector class</w:t>
+      </w:r>
+    </w:p>
+    <w:p>
+      <w:pPr>
+        <w:keepNext w:val="0"/>
+        <w:keepLines w:val="0"/>
+        <w:widowControl/>
+        <w:suppressLineNumbers w:val="0"/>
+        <w:jc w:val="both"/>
+        <w:rPr>
+          <w:rFonts w:hint="default" w:ascii="Times New Roman" w:hAnsi="Times New Roman" w:eastAsia="SimSun" w:cs="Times New Roman"/>
+          <w:color w:val="auto"/>
+          <w:kern w:val="0"/>
+          <w:sz w:val="24"/>
+          <w:szCs w:val="24"/>
+          <w:lang w:val="en-US" w:eastAsia="zh-CN" w:bidi="ar"/>
+        </w:rPr>
+      </w:pPr>
+      <w:r>
+        <w:rPr>
+          <w:rFonts w:hint="default" w:ascii="Times New Roman" w:hAnsi="Times New Roman" w:eastAsia="SimSun" w:cs="Times New Roman"/>
+          <w:color w:val="auto"/>
+          <w:kern w:val="0"/>
+          <w:sz w:val="24"/>
+          <w:szCs w:val="24"/>
+          <w:lang w:val="en-US" w:eastAsia="zh-CN" w:bidi="ar"/>
+        </w:rPr>
+        <w:t xml:space="preserve">Throughout development, Git version control was upheld, and commits were synchronised with </w:t>
+      </w:r>
+      <w:r>
+        <w:rPr>
+          <w:rFonts w:hint="default" w:ascii="Times New Roman" w:hAnsi="Times New Roman" w:eastAsia="SimSun" w:cs="Times New Roman"/>
+          <w:color w:val="auto"/>
+          <w:kern w:val="0"/>
+          <w:sz w:val="24"/>
+          <w:szCs w:val="24"/>
+          <w:lang w:val="en-GB" w:eastAsia="zh-CN" w:bidi="ar"/>
+        </w:rPr>
+        <w:t xml:space="preserve">daily </w:t>
+      </w:r>
+      <w:r>
+        <w:rPr>
+          <w:rFonts w:hint="default" w:ascii="Times New Roman" w:hAnsi="Times New Roman" w:eastAsia="SimSun" w:cs="Times New Roman"/>
+          <w:color w:val="auto"/>
+          <w:kern w:val="0"/>
+          <w:sz w:val="24"/>
+          <w:szCs w:val="24"/>
+          <w:lang w:val="en-US" w:eastAsia="zh-CN" w:bidi="ar"/>
+        </w:rPr>
+        <w:t>deliverables.</w:t>
+      </w:r>
+    </w:p>
+    <w:p>
+      <w:pPr>
+        <w:pStyle w:val="3"/>
+        <w:spacing w:before="300" w:after="120"/>
+        <w:jc w:val="both"/>
+        <w:rPr>
+          <w:rFonts w:hint="default" w:ascii="Times New Roman" w:hAnsi="Times New Roman" w:cs="Times New Roman"/>
+          <w:color w:val="auto"/>
+        </w:rPr>
+      </w:pPr>
+      <w:r>
+        <w:rPr>
+          <w:rFonts w:hint="default" w:ascii="Times New Roman" w:hAnsi="Times New Roman" w:eastAsia="Arial" w:cs="Times New Roman"/>
+          <w:b/>
+          <w:bCs/>
+          <w:color w:val="auto"/>
+          <w:sz w:val="28"/>
+          <w:szCs w:val="28"/>
+        </w:rPr>
+        <w:t>4.2 Data Preparation Implementation</w:t>
+      </w:r>
+    </w:p>
+    <w:p>
+      <w:pPr>
+        <w:keepNext w:val="0"/>
+        <w:keepLines w:val="0"/>
+        <w:widowControl/>
+        <w:suppressLineNumbers w:val="0"/>
+        <w:jc w:val="both"/>
+        <w:rPr>
+          <w:rFonts w:hint="default" w:ascii="Times New Roman" w:hAnsi="Times New Roman" w:cs="Times New Roman"/>
+          <w:color w:val="auto"/>
+        </w:rPr>
+      </w:pPr>
+      <w:r>
+        <w:rPr>
+          <w:rFonts w:hint="default" w:ascii="Times New Roman" w:hAnsi="Times New Roman" w:eastAsia="SimSun" w:cs="Times New Roman"/>
+          <w:color w:val="auto"/>
+          <w:kern w:val="0"/>
+          <w:sz w:val="24"/>
+          <w:szCs w:val="24"/>
+          <w:lang w:val="en-US" w:eastAsia="zh-CN" w:bidi="ar"/>
+        </w:rPr>
+        <w:t>The flexible loading mechanism implemented by the data preparation module can handle the various label encoding and column naming conventions seen in Kaggle datasets. Using a priority-ordered lookup of common column names ('url', 'URL', 'address'; 'label', 'status', 'class', 'Result'), the method initially seeks to identify URL and label columns before converting label values to binary integer format. Both binary (0/1) and text label schemes ('good'/'bad', 'legitimate'/'phishing') are handled by the conversion.</w:t>
+      </w:r>
+    </w:p>
+    <w:p>
+      <w:pPr>
+        <w:keepNext w:val="0"/>
+        <w:keepLines w:val="0"/>
+        <w:widowControl/>
+        <w:suppressLineNumbers w:val="0"/>
+        <w:jc w:val="both"/>
+        <w:rPr>
+          <w:rFonts w:hint="default" w:ascii="Times New Roman" w:hAnsi="Times New Roman" w:eastAsia="SimSun" w:cs="Times New Roman"/>
+          <w:color w:val="auto"/>
+          <w:kern w:val="0"/>
+          <w:sz w:val="24"/>
+          <w:szCs w:val="24"/>
+          <w:lang w:val="en-US" w:eastAsia="zh-CN" w:bidi="ar"/>
+        </w:rPr>
+      </w:pPr>
+      <w:r>
+        <w:rPr>
+          <w:rFonts w:hint="default" w:ascii="Times New Roman" w:hAnsi="Times New Roman" w:eastAsia="SimSun" w:cs="Times New Roman"/>
+          <w:color w:val="auto"/>
+          <w:kern w:val="0"/>
+          <w:sz w:val="24"/>
+          <w:szCs w:val="24"/>
+          <w:lang w:val="en-US" w:eastAsia="zh-CN" w:bidi="ar"/>
+        </w:rPr>
+        <w:t>A quality validation step eliminates entries that don't pass validation and confirms that loaded URLs meet basic formatting standards (minimum length, scheme presence, and domain component). Descriptive statistics are calculated and documented for every dataset after preprocessing in order to support the dataset description found in Appendix F. The preprocessing module was created with extensibility in mind; all that is needed to add support for new dataset formats is to add column name mappings to the configuration file.</w:t>
+      </w:r>
+    </w:p>
+    <w:p>
+      <w:pPr>
+        <w:pStyle w:val="3"/>
+        <w:spacing w:before="300" w:after="120"/>
+        <w:jc w:val="both"/>
+        <w:rPr>
+          <w:rFonts w:hint="default" w:ascii="Times New Roman" w:hAnsi="Times New Roman" w:cs="Times New Roman"/>
+          <w:color w:val="auto"/>
+        </w:rPr>
+      </w:pPr>
+      <w:r>
+        <w:rPr>
+          <w:rFonts w:hint="default" w:ascii="Times New Roman" w:hAnsi="Times New Roman" w:eastAsia="Arial" w:cs="Times New Roman"/>
+          <w:b/>
+          <w:bCs/>
+          <w:color w:val="auto"/>
+          <w:sz w:val="28"/>
+          <w:szCs w:val="28"/>
+        </w:rPr>
+        <w:t>4.3 Feature Extraction System</w:t>
+      </w:r>
+    </w:p>
+    <w:p>
+      <w:pPr>
+        <w:pStyle w:val="4"/>
+        <w:spacing w:before="200" w:after="100"/>
+        <w:jc w:val="both"/>
+        <w:rPr>
+          <w:rFonts w:hint="default" w:ascii="Times New Roman" w:hAnsi="Times New Roman" w:cs="Times New Roman"/>
+          <w:color w:val="auto"/>
+        </w:rPr>
+      </w:pPr>
+      <w:r>
+        <w:rPr>
+          <w:rFonts w:hint="default" w:ascii="Times New Roman" w:hAnsi="Times New Roman" w:eastAsia="Arial" w:cs="Times New Roman"/>
+          <w:b/>
+          <w:bCs/>
+          <w:color w:val="auto"/>
+          <w:sz w:val="24"/>
+          <w:szCs w:val="24"/>
+        </w:rPr>
+        <w:t>4.3.1 FeatureExtractor Class Design</w:t>
+      </w:r>
+    </w:p>
+    <w:p>
+      <w:pPr>
+        <w:keepNext w:val="0"/>
+        <w:keepLines w:val="0"/>
+        <w:widowControl/>
+        <w:suppressLineNumbers w:val="0"/>
+        <w:jc w:val="both"/>
+        <w:rPr>
+          <w:rFonts w:hint="default" w:ascii="Times New Roman" w:hAnsi="Times New Roman" w:cs="Times New Roman"/>
+          <w:color w:val="auto"/>
+        </w:rPr>
+      </w:pPr>
+      <w:r>
+        <w:rPr>
+          <w:rFonts w:hint="default" w:ascii="Times New Roman" w:hAnsi="Times New Roman" w:eastAsia="SimSun" w:cs="Times New Roman"/>
+          <w:color w:val="auto"/>
+          <w:kern w:val="0"/>
+          <w:sz w:val="24"/>
+          <w:szCs w:val="24"/>
+          <w:lang w:val="en-US" w:eastAsia="zh-CN" w:bidi="ar"/>
+        </w:rPr>
+        <w:t>The FeatureExtractor class, which offers a consistent interface for all four feature categories, encapsulates the feature extraction workflow. By coordinating extraction across the four sub-extractors, the extract_all_features(url) method returns a dictionary of feature name-value pairs that can be immediately transformed into a pandas DataFrame row for dataset construction. Consistent feature computation is made possible by this methodology for both real-time single-URL classification and the creation of training data.</w:t>
+      </w:r>
+    </w:p>
+    <w:p>
+      <w:pPr>
+        <w:pStyle w:val="4"/>
+        <w:spacing w:before="200" w:after="100"/>
+        <w:jc w:val="both"/>
+        <w:rPr>
+          <w:rFonts w:hint="default" w:ascii="Times New Roman" w:hAnsi="Times New Roman" w:cs="Times New Roman"/>
+          <w:color w:val="auto"/>
+        </w:rPr>
+      </w:pPr>
+      <w:r>
+        <w:rPr>
+          <w:rFonts w:hint="default" w:ascii="Times New Roman" w:hAnsi="Times New Roman" w:eastAsia="Arial" w:cs="Times New Roman"/>
+          <w:b/>
+          <w:bCs/>
+          <w:color w:val="auto"/>
+          <w:sz w:val="24"/>
+          <w:szCs w:val="24"/>
+        </w:rPr>
+        <w:t>4.3.2 URL Feature Extraction</w:t>
+      </w:r>
+    </w:p>
+    <w:p>
+      <w:pPr>
+        <w:keepNext w:val="0"/>
+        <w:keepLines w:val="0"/>
+        <w:widowControl/>
+        <w:suppressLineNumbers w:val="0"/>
+        <w:jc w:val="both"/>
+        <w:rPr>
+          <w:rFonts w:hint="default" w:ascii="Times New Roman" w:hAnsi="Times New Roman" w:cs="Times New Roman"/>
+          <w:color w:val="auto"/>
+        </w:rPr>
+      </w:pPr>
+      <w:r>
+        <w:rPr>
+          <w:rFonts w:hint="default" w:ascii="Times New Roman" w:hAnsi="Times New Roman" w:eastAsia="SimSun" w:cs="Times New Roman"/>
+          <w:color w:val="auto"/>
+          <w:kern w:val="0"/>
+          <w:sz w:val="24"/>
+          <w:szCs w:val="24"/>
+          <w:lang w:val="en-US" w:eastAsia="zh-CN" w:bidi="ar"/>
+        </w:rPr>
+        <w:t>The built-in Python libraries tldextract for domain decomposition and urllib.parse for URL component parsing are used to extract URL features. After parsing the URL to separate the scheme, netloc, path, and query components, the extract_url_features function extracts each feature from the relevant component. The has_ip function matches IPv4 address patterns in the URL string using a regular expression. A list of 15 recognised URL shortening services is checked by the shortening_service function.</w:t>
+      </w:r>
+    </w:p>
+    <w:p>
+      <w:pPr>
+        <w:pStyle w:val="4"/>
+        <w:spacing w:before="200" w:after="100"/>
+        <w:jc w:val="both"/>
+        <w:rPr>
+          <w:rFonts w:hint="default" w:ascii="Times New Roman" w:hAnsi="Times New Roman" w:cs="Times New Roman"/>
+          <w:color w:val="auto"/>
+        </w:rPr>
+      </w:pPr>
+      <w:r>
+        <w:rPr>
+          <w:rFonts w:hint="default" w:ascii="Times New Roman" w:hAnsi="Times New Roman" w:eastAsia="Arial" w:cs="Times New Roman"/>
+          <w:b/>
+          <w:bCs/>
+          <w:color w:val="auto"/>
+          <w:sz w:val="24"/>
+          <w:szCs w:val="24"/>
+        </w:rPr>
+        <w:t>4.3.3 Domain Feature Extraction and Caching</w:t>
+      </w:r>
+    </w:p>
+    <w:p>
+      <w:pPr>
+        <w:keepNext w:val="0"/>
+        <w:keepLines w:val="0"/>
+        <w:widowControl/>
+        <w:suppressLineNumbers w:val="0"/>
+        <w:jc w:val="both"/>
+        <w:rPr>
+          <w:rFonts w:hint="default" w:ascii="Times New Roman" w:hAnsi="Times New Roman" w:cs="Times New Roman"/>
+          <w:color w:val="auto"/>
+        </w:rPr>
+      </w:pPr>
+      <w:r>
+        <w:rPr>
+          <w:rFonts w:hint="default" w:ascii="Times New Roman" w:hAnsi="Times New Roman" w:eastAsia="SimSun" w:cs="Times New Roman"/>
+          <w:color w:val="auto"/>
+          <w:kern w:val="0"/>
+          <w:sz w:val="24"/>
+          <w:szCs w:val="24"/>
+          <w:lang w:val="en-US" w:eastAsia="zh-CN" w:bidi="ar"/>
+        </w:rPr>
+        <w:t>The extraction of domain features requires network requests, which cause a large amount of latency. DNS record checks take 0.1–0.5 seconds, while WHOIS lookups for domain age take 1-3 seconds per query and are often rate-limited by WHOIS servers. A thread-safe domain-level cache with a maximum size of 10,000 items was created using Python's functools.lru_cache method in order to reduce the impact on batch processing performance. In order to prevent multiple URLs sharing a domain from incurring the network cost more than once, the cache saves domain age and DNS record results keyed by registered domain name.</w:t>
+      </w:r>
+    </w:p>
+    <w:p>
+      <w:pPr>
+        <w:keepNext w:val="0"/>
+        <w:keepLines w:val="0"/>
+        <w:widowControl/>
+        <w:suppressLineNumbers w:val="0"/>
+        <w:jc w:val="both"/>
+        <w:rPr>
+          <w:rFonts w:hint="default" w:ascii="Times New Roman" w:hAnsi="Times New Roman" w:cs="Times New Roman"/>
+          <w:color w:val="auto"/>
+        </w:rPr>
+      </w:pPr>
+      <w:r>
+        <w:rPr>
+          <w:rFonts w:hint="default" w:ascii="Times New Roman" w:hAnsi="Times New Roman" w:eastAsia="SimSun" w:cs="Times New Roman"/>
+          <w:color w:val="auto"/>
+          <w:kern w:val="0"/>
+          <w:sz w:val="24"/>
+          <w:szCs w:val="24"/>
+          <w:lang w:val="en-US" w:eastAsia="zh-CN" w:bidi="ar"/>
+        </w:rPr>
+        <w:t>Setting domain_age_days to -1 and has_dns_record to 0 graciously handles WHOIS lookup failures, which happen for about 15% of URLs owing to server rate limiting, timeout, or record unavailability. This cautious approach, which is in line with the phishing pattern of employing recently registered domains, categorises domains with unclear ages as possibly newer (and hence higher-risk).</w:t>
+      </w:r>
+    </w:p>
+    <w:p>
+      <w:pPr>
+        <w:pStyle w:val="4"/>
+        <w:spacing w:before="200" w:after="100"/>
+        <w:jc w:val="both"/>
+        <w:rPr>
+          <w:rFonts w:hint="default" w:ascii="Times New Roman" w:hAnsi="Times New Roman" w:cs="Times New Roman"/>
+          <w:color w:val="auto"/>
+        </w:rPr>
+      </w:pPr>
+      <w:r>
+        <w:rPr>
+          <w:rFonts w:hint="default" w:ascii="Times New Roman" w:hAnsi="Times New Roman" w:eastAsia="Arial" w:cs="Times New Roman"/>
+          <w:b/>
+          <w:bCs/>
+          <w:color w:val="auto"/>
+          <w:sz w:val="24"/>
+          <w:szCs w:val="24"/>
+        </w:rPr>
+        <w:t>4.3.4 Content Feature Extraction</w:t>
+      </w:r>
+    </w:p>
+    <w:p>
+      <w:pPr>
+        <w:keepNext w:val="0"/>
+        <w:keepLines w:val="0"/>
+        <w:widowControl/>
+        <w:suppressLineNumbers w:val="0"/>
+        <w:jc w:val="both"/>
+        <w:rPr>
+          <w:rFonts w:hint="default" w:ascii="Times New Roman" w:hAnsi="Times New Roman" w:cs="Times New Roman"/>
+          <w:color w:val="auto"/>
+        </w:rPr>
+      </w:pPr>
+      <w:r>
+        <w:rPr>
+          <w:rFonts w:hint="default" w:ascii="Times New Roman" w:hAnsi="Times New Roman" w:eastAsia="SimSun" w:cs="Times New Roman"/>
+          <w:color w:val="auto"/>
+          <w:kern w:val="0"/>
+          <w:sz w:val="24"/>
+          <w:szCs w:val="24"/>
+          <w:lang w:val="en-US" w:eastAsia="zh-CN" w:bidi="ar"/>
+        </w:rPr>
+        <w:t>The requests library is used to retrieve webpage content with a User-Agent string that identifies the system as a research crawler and a configurable delay (default: 5 seconds). BeautifulSoup4, which was chosen over lxml for its higher tolerance of faulty HTML—a common feature of phishing websites built quickly or with automated generating tools—is used to parse the received HTML.</w:t>
+      </w:r>
+    </w:p>
+    <w:p>
+      <w:pPr>
+        <w:keepNext w:val="0"/>
+        <w:keepLines w:val="0"/>
+        <w:widowControl/>
+        <w:suppressLineNumbers w:val="0"/>
+        <w:jc w:val="both"/>
+        <w:rPr>
+          <w:rFonts w:hint="default" w:ascii="Times New Roman" w:hAnsi="Times New Roman" w:cs="Times New Roman"/>
+          <w:color w:val="auto"/>
+        </w:rPr>
+      </w:pPr>
+      <w:r>
+        <w:rPr>
+          <w:rFonts w:hint="default" w:ascii="Times New Roman" w:hAnsi="Times New Roman" w:eastAsia="SimSun" w:cs="Times New Roman"/>
+          <w:color w:val="auto"/>
+          <w:kern w:val="0"/>
+          <w:sz w:val="24"/>
+          <w:szCs w:val="24"/>
+          <w:lang w:val="en-US" w:eastAsia="zh-CN" w:bidi="ar"/>
+        </w:rPr>
+        <w:t>By looking for input elements with type='password', which consistently signify the existence of a credential collection form, the has_login_form feature is retrieved. In order to avoid bias towards lengthier pages, the suspicious_keywords_count feature tokenises the page's visible text content and counts instances of a carefully selected set of 20 phishing-indicative terms, normalised by total word count. For URLs where retrieval fails, content characteristics are set to 0 by default; these failures are recorded for post-hoc analysis.</w:t>
+      </w:r>
+    </w:p>
+    <w:p>
+      <w:pPr>
+        <w:pStyle w:val="4"/>
+        <w:spacing w:before="200" w:after="100"/>
+        <w:jc w:val="both"/>
+        <w:rPr>
+          <w:rFonts w:hint="default" w:ascii="Times New Roman" w:hAnsi="Times New Roman" w:cs="Times New Roman"/>
+          <w:color w:val="auto"/>
+        </w:rPr>
+      </w:pPr>
+      <w:r>
+        <w:rPr>
+          <w:rFonts w:hint="default" w:ascii="Times New Roman" w:hAnsi="Times New Roman" w:eastAsia="Arial" w:cs="Times New Roman"/>
+          <w:b/>
+          <w:bCs/>
+          <w:color w:val="auto"/>
+          <w:sz w:val="24"/>
+          <w:szCs w:val="24"/>
+        </w:rPr>
+        <w:t>4.3.5 Parallel Processing Optimisation</w:t>
+      </w:r>
+    </w:p>
+    <w:p>
+      <w:pPr>
+        <w:keepNext w:val="0"/>
+        <w:keepLines w:val="0"/>
+        <w:widowControl/>
+        <w:suppressLineNumbers w:val="0"/>
+        <w:jc w:val="both"/>
+        <w:rPr>
+          <w:rFonts w:hint="default" w:ascii="Times New Roman" w:hAnsi="Times New Roman" w:cs="Times New Roman"/>
+          <w:color w:val="auto"/>
+        </w:rPr>
+      </w:pPr>
+      <w:r>
+        <w:rPr>
+          <w:rFonts w:hint="default" w:ascii="Times New Roman" w:hAnsi="Times New Roman" w:eastAsia="SimSun" w:cs="Times New Roman"/>
+          <w:color w:val="auto"/>
+          <w:kern w:val="0"/>
+          <w:sz w:val="24"/>
+          <w:szCs w:val="24"/>
+          <w:lang w:val="en-US" w:eastAsia="zh-CN" w:bidi="ar"/>
+        </w:rPr>
+        <w:t>Python's concurrent.futures was used to speed up the batch feature extraction process for the entire 11,430-URL dataset.With eight worker threads, ThreadPoolExecutor may reduce the overall extraction time from almost 6.7 hours (sequential) to about 52 minutes. In addition to providing real-time progress reporting via tqdm progress bars, the parallel solution manages thread-safety for the domain cache. For URLs where sites load slowly, content retrieval accounts for the majority of the pipeline's average per-URL processing time of 2.1 seconds.</w:t>
+      </w:r>
+    </w:p>
+    <w:p>
+      <w:pPr>
+        <w:pStyle w:val="3"/>
+        <w:spacing w:before="300" w:after="120"/>
+        <w:jc w:val="both"/>
+        <w:rPr>
+          <w:rFonts w:hint="default" w:ascii="Times New Roman" w:hAnsi="Times New Roman" w:cs="Times New Roman"/>
+          <w:color w:val="auto"/>
+        </w:rPr>
+      </w:pPr>
+      <w:r>
+        <w:rPr>
+          <w:rFonts w:hint="default" w:ascii="Times New Roman" w:hAnsi="Times New Roman" w:eastAsia="Arial" w:cs="Times New Roman"/>
+          <w:b/>
+          <w:bCs/>
+          <w:color w:val="auto"/>
+          <w:sz w:val="28"/>
+          <w:szCs w:val="28"/>
+        </w:rPr>
+        <w:t>4.4 Rule-Based Detector Implementation</w:t>
+      </w:r>
+    </w:p>
+    <w:p>
+      <w:pPr>
+        <w:pStyle w:val="4"/>
+        <w:spacing w:before="200" w:after="100"/>
+        <w:jc w:val="both"/>
+        <w:rPr>
+          <w:rFonts w:hint="default" w:ascii="Times New Roman" w:hAnsi="Times New Roman" w:cs="Times New Roman"/>
+          <w:color w:val="auto"/>
+        </w:rPr>
+      </w:pPr>
+      <w:r>
+        <w:rPr>
+          <w:rFonts w:hint="default" w:ascii="Times New Roman" w:hAnsi="Times New Roman" w:eastAsia="Arial" w:cs="Times New Roman"/>
+          <w:b/>
+          <w:bCs/>
+          <w:color w:val="auto"/>
+          <w:sz w:val="24"/>
+          <w:szCs w:val="24"/>
+        </w:rPr>
+        <w:t>4.4.1 Rule Implementation</w:t>
+      </w:r>
+    </w:p>
+    <w:p>
+      <w:pPr>
+        <w:keepNext w:val="0"/>
+        <w:keepLines w:val="0"/>
+        <w:widowControl/>
+        <w:suppressLineNumbers w:val="0"/>
+        <w:jc w:val="both"/>
+        <w:rPr>
+          <w:rFonts w:hint="default" w:ascii="Times New Roman" w:hAnsi="Times New Roman" w:cs="Times New Roman"/>
+          <w:color w:val="auto"/>
+        </w:rPr>
+      </w:pPr>
+      <w:r>
+        <w:rPr>
+          <w:rFonts w:hint="default" w:ascii="Times New Roman" w:hAnsi="Times New Roman" w:eastAsia="SimSun" w:cs="Times New Roman"/>
+          <w:color w:val="auto"/>
+          <w:kern w:val="0"/>
+          <w:sz w:val="24"/>
+          <w:szCs w:val="24"/>
+          <w:lang w:val="en-US" w:eastAsia="zh-CN" w:bidi="ar"/>
+        </w:rPr>
+        <w:t>A Python function that takes a feature dictionary and produces a Boolean activation value is used to implement each of the fifteen heuristic rules. A configuration dictionary is used to register rules and their weights, making it simple to modify them without altering the fundamental detection logic. The RuleBasedDetector class uses the 0.3 categorisation threshold after iterating over all rules, adding up the weighted score for activated rules, and normalising against the highest possible score.</w:t>
+      </w:r>
+    </w:p>
+    <w:p>
+      <w:pPr>
+        <w:pStyle w:val="4"/>
+        <w:spacing w:before="200" w:after="100"/>
+        <w:jc w:val="both"/>
+        <w:rPr>
+          <w:rFonts w:hint="default" w:ascii="Times New Roman" w:hAnsi="Times New Roman" w:cs="Times New Roman"/>
+          <w:color w:val="auto"/>
+        </w:rPr>
+      </w:pPr>
+      <w:r>
+        <w:rPr>
+          <w:rFonts w:hint="default" w:ascii="Times New Roman" w:hAnsi="Times New Roman" w:eastAsia="Arial" w:cs="Times New Roman"/>
+          <w:b/>
+          <w:bCs/>
+          <w:color w:val="auto"/>
+          <w:sz w:val="24"/>
+          <w:szCs w:val="24"/>
+        </w:rPr>
+        <w:t>4.4.2 Threshold Optimisation</w:t>
+      </w:r>
+    </w:p>
+    <w:p>
+      <w:pPr>
+        <w:keepNext w:val="0"/>
+        <w:keepLines w:val="0"/>
+        <w:widowControl/>
+        <w:suppressLineNumbers w:val="0"/>
+        <w:jc w:val="both"/>
+        <w:rPr>
+          <w:rFonts w:hint="default" w:ascii="Times New Roman" w:hAnsi="Times New Roman" w:cs="Times New Roman"/>
+          <w:color w:val="auto"/>
+        </w:rPr>
+      </w:pPr>
+      <w:r>
+        <w:rPr>
+          <w:rFonts w:hint="default" w:ascii="Times New Roman" w:hAnsi="Times New Roman" w:eastAsia="SimSun" w:cs="Times New Roman"/>
+          <w:color w:val="auto"/>
+          <w:kern w:val="0"/>
+          <w:sz w:val="24"/>
+          <w:szCs w:val="24"/>
+          <w:lang w:val="en-US" w:eastAsia="zh-CN" w:bidi="ar"/>
+        </w:rPr>
+        <w:t>The midpoint formula was used to calculate the feature thresholds for rules R1, R3, R4, and R5 (url_length, subdomain_count, dot_count, hyphen_count) based on the training data. The following optimal thresholds were found by analysing the training set: url_length threshold of 54 characters (mean legitimate: 42.3 chars; mean phishing: 68.9 chars); subdomain_count threshold of 3; dot_count threshold of 5; hyphen_count threshold of 3. Prior to finalisation, a 10% holdout from the training set was used to validate these values.</w:t>
+      </w:r>
+    </w:p>
+    <w:p>
+      <w:pPr>
+        <w:pStyle w:val="3"/>
+        <w:spacing w:before="300" w:after="120"/>
+        <w:jc w:val="both"/>
+        <w:rPr>
+          <w:rFonts w:hint="default" w:ascii="Times New Roman" w:hAnsi="Times New Roman" w:cs="Times New Roman"/>
+          <w:color w:val="auto"/>
+        </w:rPr>
+      </w:pPr>
+      <w:r>
+        <w:rPr>
+          <w:rFonts w:hint="default" w:ascii="Times New Roman" w:hAnsi="Times New Roman" w:eastAsia="Arial" w:cs="Times New Roman"/>
+          <w:b/>
+          <w:bCs/>
+          <w:color w:val="auto"/>
+          <w:sz w:val="28"/>
+          <w:szCs w:val="28"/>
+        </w:rPr>
+        <w:t>4.5 Machine Learning Detector</w:t>
+      </w:r>
+    </w:p>
+    <w:p>
+      <w:pPr>
+        <w:pStyle w:val="4"/>
+        <w:spacing w:before="200" w:after="100"/>
+        <w:jc w:val="both"/>
+        <w:rPr>
+          <w:rFonts w:hint="default" w:ascii="Times New Roman" w:hAnsi="Times New Roman" w:cs="Times New Roman"/>
+          <w:color w:val="auto"/>
+        </w:rPr>
+      </w:pPr>
+      <w:r>
+        <w:rPr>
+          <w:rFonts w:hint="default" w:ascii="Times New Roman" w:hAnsi="Times New Roman" w:eastAsia="Arial" w:cs="Times New Roman"/>
+          <w:b/>
+          <w:bCs/>
+          <w:color w:val="auto"/>
+          <w:sz w:val="24"/>
+          <w:szCs w:val="24"/>
+        </w:rPr>
+        <w:t>4.5.1 Algorithm Selection and Justification</w:t>
+      </w:r>
+    </w:p>
+    <w:p>
+      <w:pPr>
+        <w:keepNext w:val="0"/>
+        <w:keepLines w:val="0"/>
+        <w:widowControl/>
+        <w:suppressLineNumbers w:val="0"/>
+        <w:jc w:val="both"/>
+        <w:rPr>
+          <w:rFonts w:hint="default" w:ascii="Times New Roman" w:hAnsi="Times New Roman" w:cs="Times New Roman"/>
+          <w:color w:val="auto"/>
+        </w:rPr>
+      </w:pPr>
+      <w:r>
+        <w:rPr>
+          <w:rFonts w:hint="default" w:ascii="Times New Roman" w:hAnsi="Times New Roman" w:eastAsia="SimSun" w:cs="Times New Roman"/>
+          <w:color w:val="auto"/>
+          <w:kern w:val="0"/>
+          <w:sz w:val="24"/>
+          <w:szCs w:val="24"/>
+          <w:lang w:val="en-US" w:eastAsia="zh-CN" w:bidi="ar"/>
+        </w:rPr>
+        <w:t>The literature review led to the selection of three algorithms for evaluation: Logistic regression (interpretable baseline), SVM (strong baseline for binary classification), and Random Forest (anticipated best performer based on Sahingoz et al., 2019). Due to its ensemble nature and proven dominance in URL-based phishing detection, Random Forest was predicted to perform best; however, rather than assuming this, empirical validation on the project dataset was thought to be required.</w:t>
+      </w:r>
+    </w:p>
+    <w:p>
+      <w:pPr>
+        <w:pStyle w:val="4"/>
+        <w:spacing w:before="200" w:after="100"/>
+        <w:jc w:val="both"/>
+        <w:rPr>
+          <w:rFonts w:hint="default" w:ascii="Times New Roman" w:hAnsi="Times New Roman" w:cs="Times New Roman"/>
+          <w:color w:val="auto"/>
+        </w:rPr>
+      </w:pPr>
+      <w:r>
+        <w:rPr>
+          <w:rFonts w:hint="default" w:ascii="Times New Roman" w:hAnsi="Times New Roman" w:eastAsia="Arial" w:cs="Times New Roman"/>
+          <w:b/>
+          <w:bCs/>
+          <w:color w:val="auto"/>
+          <w:sz w:val="24"/>
+          <w:szCs w:val="24"/>
+        </w:rPr>
+        <w:t>4.5.2 Hyperparameter Tuning Results</w:t>
+      </w:r>
+    </w:p>
+    <w:p>
+      <w:pPr>
+        <w:spacing w:before="80" w:after="120" w:line="276" w:lineRule="auto"/>
+        <w:jc w:val="both"/>
+        <w:rPr>
+          <w:rFonts w:hint="default" w:ascii="Times New Roman" w:hAnsi="Times New Roman" w:cs="Times New Roman"/>
+          <w:color w:val="auto"/>
+        </w:rPr>
+      </w:pPr>
+      <w:r>
+        <w:rPr>
+          <w:rFonts w:hint="default" w:ascii="Times New Roman" w:hAnsi="Times New Roman" w:eastAsia="Arial" w:cs="Times New Roman"/>
+          <w:color w:val="auto"/>
+          <w:sz w:val="22"/>
+          <w:szCs w:val="22"/>
+        </w:rPr>
+        <w:t>GridSearchCV with 5-fold stratified cross-validation identified the following optimal hyperparameters. For Random Forest: n_estimators = 100, max_depth = 20, min_samples_split = 2 (best CV F1-score: 0.958). For SVM: C = 10, kernel = 'rbf', gamma = 'scale' (best CV F1-score: 0.936). For Logistic Regression: C = 10, penalty = 'l2', solver = 'lbfgs' (best CV F1-score: 0.912). SMOTE balancing of the training set improved F1-score by approximately 3% relative to unbalanced training across all three algorithms.</w:t>
+      </w:r>
+    </w:p>
+    <w:p>
+      <w:pPr>
+        <w:pStyle w:val="4"/>
+        <w:spacing w:before="200" w:after="100"/>
+        <w:jc w:val="both"/>
+        <w:rPr>
+          <w:rFonts w:hint="default" w:ascii="Times New Roman" w:hAnsi="Times New Roman" w:cs="Times New Roman"/>
+          <w:color w:val="auto"/>
+        </w:rPr>
+      </w:pPr>
+      <w:r>
+        <w:rPr>
+          <w:rFonts w:hint="default" w:ascii="Times New Roman" w:hAnsi="Times New Roman" w:eastAsia="Arial" w:cs="Times New Roman"/>
+          <w:b/>
+          <w:bCs/>
+          <w:color w:val="auto"/>
+          <w:sz w:val="24"/>
+          <w:szCs w:val="24"/>
+        </w:rPr>
+        <w:t>4.5.3 Feature Importance Analysis</w:t>
+      </w:r>
+    </w:p>
+    <w:p>
+      <w:pPr>
+        <w:keepNext w:val="0"/>
+        <w:keepLines w:val="0"/>
+        <w:widowControl/>
+        <w:suppressLineNumbers w:val="0"/>
+        <w:tabs>
+          <w:tab w:val="left" w:pos="4320"/>
+        </w:tabs>
+        <w:jc w:val="both"/>
+        <w:rPr>
+          <w:rFonts w:hint="default" w:ascii="Times New Roman" w:hAnsi="Times New Roman" w:cs="Times New Roman"/>
+          <w:color w:val="auto"/>
+        </w:rPr>
+      </w:pPr>
+      <w:r>
+        <w:rPr>
+          <w:rFonts w:hint="default" w:ascii="Times New Roman" w:hAnsi="Times New Roman" w:eastAsia="SimSun" w:cs="Times New Roman"/>
+          <w:color w:val="auto"/>
+          <w:kern w:val="0"/>
+          <w:sz w:val="24"/>
+          <w:szCs w:val="24"/>
+          <w:lang w:val="en-US" w:eastAsia="zh-CN" w:bidi="ar"/>
+        </w:rPr>
+        <w:t>Following final model training, feature significance rankings were retrieved from the Random Forest model. URL_length (0.142), has_ip (0.098), subdomain_count (0.087), entropy (0.076), dot_count (0.069), suspicious_tld (0.063), has_https (0.058), hyphen_count (0.052), domain_age_days (0.047), and num_external_links (0.041) were the top ten most discriminative attributes, according to Gini significance. The use of URL-based characteristics as an effective first-pass classifier is supported by the fact that all top features—aside from domain_age_days—can be computed without network connectivity.</w:t>
+      </w:r>
+    </w:p>
+    <w:p>
+      <w:pPr>
+        <w:pStyle w:val="3"/>
+        <w:spacing w:before="300" w:after="120"/>
+        <w:jc w:val="both"/>
+        <w:rPr>
+          <w:rFonts w:hint="default" w:ascii="Times New Roman" w:hAnsi="Times New Roman" w:cs="Times New Roman"/>
+          <w:color w:val="auto"/>
+        </w:rPr>
+      </w:pPr>
+      <w:r>
+        <w:rPr>
+          <w:rFonts w:hint="default" w:ascii="Times New Roman" w:hAnsi="Times New Roman" w:eastAsia="Arial" w:cs="Times New Roman"/>
+          <w:b/>
+          <w:bCs/>
+          <w:color w:val="auto"/>
+          <w:sz w:val="28"/>
+          <w:szCs w:val="28"/>
+        </w:rPr>
+        <w:t>4.6 Hybrid Detection System</w:t>
+      </w:r>
+    </w:p>
+    <w:p>
+      <w:pPr>
+        <w:pStyle w:val="4"/>
+        <w:spacing w:before="200" w:after="100"/>
+        <w:jc w:val="both"/>
+        <w:rPr>
+          <w:rFonts w:hint="default" w:ascii="Times New Roman" w:hAnsi="Times New Roman" w:cs="Times New Roman"/>
+          <w:color w:val="auto"/>
+        </w:rPr>
+      </w:pPr>
+      <w:r>
+        <w:rPr>
+          <w:rFonts w:hint="default" w:ascii="Times New Roman" w:hAnsi="Times New Roman" w:eastAsia="Arial" w:cs="Times New Roman"/>
+          <w:b/>
+          <w:bCs/>
+          <w:color w:val="auto"/>
+          <w:sz w:val="24"/>
+          <w:szCs w:val="24"/>
+        </w:rPr>
+        <w:t>4.6.1 Weight Optimisation</w:t>
+      </w:r>
+    </w:p>
+    <w:p>
+      <w:pPr>
+        <w:keepNext w:val="0"/>
+        <w:keepLines w:val="0"/>
+        <w:widowControl/>
+        <w:suppressLineNumbers w:val="0"/>
+        <w:jc w:val="both"/>
+        <w:rPr>
+          <w:rFonts w:hint="default" w:ascii="Times New Roman" w:hAnsi="Times New Roman" w:cs="Times New Roman"/>
+          <w:color w:val="auto"/>
+        </w:rPr>
+      </w:pPr>
+      <w:r>
+        <w:rPr>
+          <w:rFonts w:hint="default" w:ascii="Times New Roman" w:hAnsi="Times New Roman" w:eastAsia="SimSun" w:cs="Times New Roman"/>
+          <w:color w:val="auto"/>
+          <w:kern w:val="0"/>
+          <w:sz w:val="24"/>
+          <w:szCs w:val="24"/>
+          <w:lang w:val="en-US" w:eastAsia="zh-CN" w:bidi="ar"/>
+        </w:rPr>
+        <w:t>Using the restriction w_rule + w_ml = 1.0, all weight combinations (w_rule, w_ml) were evaluated in 0.1-increment steps to establish the ideal weights for the weighted combination strategy. W_rule = 0.3 and w_ml = 0.7 were the combination that maximised the validation F1-score, resulting in a validation F1-score of 0.964. According to this conclusion, the rule-based component offers a quantifiable incremental benefit, while the machine learning component gives significantly greater discriminative capability.</w:t>
+      </w:r>
+    </w:p>
+    <w:p>
+      <w:pPr>
+        <w:pStyle w:val="4"/>
+        <w:spacing w:before="200" w:after="100"/>
+        <w:jc w:val="both"/>
+        <w:rPr>
+          <w:rFonts w:hint="default" w:ascii="Times New Roman" w:hAnsi="Times New Roman" w:cs="Times New Roman"/>
+          <w:color w:val="auto"/>
+        </w:rPr>
+      </w:pPr>
+      <w:r>
+        <w:rPr>
+          <w:rFonts w:hint="default" w:ascii="Times New Roman" w:hAnsi="Times New Roman" w:eastAsia="Arial" w:cs="Times New Roman"/>
+          <w:b/>
+          <w:bCs/>
+          <w:color w:val="auto"/>
+          <w:sz w:val="24"/>
+          <w:szCs w:val="24"/>
+        </w:rPr>
+        <w:t>4.6.2 Cascade Threshold Selection</w:t>
+      </w:r>
+    </w:p>
+    <w:p>
+      <w:pPr>
+        <w:keepNext w:val="0"/>
+        <w:keepLines w:val="0"/>
+        <w:widowControl/>
+        <w:suppressLineNumbers w:val="0"/>
+        <w:jc w:val="both"/>
+        <w:rPr>
+          <w:rFonts w:hint="default" w:ascii="Times New Roman" w:hAnsi="Times New Roman" w:cs="Times New Roman"/>
+          <w:color w:val="auto"/>
+        </w:rPr>
+      </w:pPr>
+      <w:r>
+        <w:rPr>
+          <w:rFonts w:hint="default" w:ascii="Times New Roman" w:hAnsi="Times New Roman" w:eastAsia="SimSun" w:cs="Times New Roman"/>
+          <w:color w:val="auto"/>
+          <w:kern w:val="0"/>
+          <w:sz w:val="24"/>
+          <w:szCs w:val="24"/>
+          <w:lang w:val="en-US" w:eastAsia="zh-CN" w:bidi="ar"/>
+        </w:rPr>
+        <w:t>To capture high-confidence rule decisions while sending unclear situations to the more accurate ML classifier, the cascade strategy's confidence levels (rule_score &gt; 0.8 → classify as phishing; rule_score &lt; 0.2 → classify as legitimate; otherwise → apply ML) were chosen. According to an analysis of the validation set, 62% of URLs fall into the high-confidence areas (34% high-confidence legitimate, 28% high-confidence phishing). This means that just 38% of URLs in the cascade method require the ML classifier to be triggered, significantly lowering average processing time.</w:t>
+      </w:r>
+    </w:p>
+    <w:p>
+      <w:pPr>
+        <w:keepNext w:val="0"/>
+        <w:keepLines w:val="0"/>
+        <w:widowControl/>
+        <w:suppressLineNumbers w:val="0"/>
+        <w:jc w:val="both"/>
+        <w:rPr>
+          <w:rFonts w:hint="default" w:ascii="Times New Roman" w:hAnsi="Times New Roman" w:eastAsia="SimSun" w:cs="Times New Roman"/>
+          <w:color w:val="auto"/>
+          <w:kern w:val="0"/>
+          <w:sz w:val="24"/>
+          <w:szCs w:val="24"/>
+          <w:lang w:val="en-US" w:eastAsia="zh-CN" w:bidi="ar"/>
+        </w:rPr>
+      </w:pPr>
+    </w:p>
+    <w:p>
+      <w:pPr>
+        <w:pStyle w:val="3"/>
+        <w:spacing w:before="300" w:after="120"/>
+        <w:jc w:val="both"/>
+        <w:rPr>
+          <w:rFonts w:hint="default" w:ascii="Times New Roman" w:hAnsi="Times New Roman" w:cs="Times New Roman"/>
+          <w:color w:val="auto"/>
+        </w:rPr>
+      </w:pPr>
+      <w:r>
+        <w:rPr>
+          <w:rFonts w:hint="default" w:ascii="Times New Roman" w:hAnsi="Times New Roman" w:eastAsia="Arial" w:cs="Times New Roman"/>
+          <w:b/>
+          <w:bCs/>
+          <w:color w:val="auto"/>
+          <w:sz w:val="28"/>
+          <w:szCs w:val="28"/>
+        </w:rPr>
+        <w:t>4.7 Implementation Challenges and Solutions</w:t>
+      </w:r>
+    </w:p>
+    <w:p>
+      <w:pPr>
+        <w:keepNext w:val="0"/>
+        <w:keepLines w:val="0"/>
+        <w:widowControl/>
+        <w:suppressLineNumbers w:val="0"/>
+        <w:jc w:val="both"/>
+        <w:rPr>
+          <w:rFonts w:hint="default" w:ascii="Times New Roman" w:hAnsi="Times New Roman" w:cs="Times New Roman"/>
+          <w:color w:val="auto"/>
+        </w:rPr>
+      </w:pPr>
+      <w:r>
+        <w:rPr>
+          <w:rFonts w:hint="default" w:ascii="Times New Roman" w:hAnsi="Times New Roman" w:eastAsia="SimSun" w:cs="Times New Roman"/>
+          <w:color w:val="auto"/>
+          <w:kern w:val="0"/>
+          <w:sz w:val="24"/>
+          <w:szCs w:val="24"/>
+          <w:lang w:val="en-US" w:eastAsia="zh-CN" w:bidi="ar"/>
+        </w:rPr>
+        <w:t xml:space="preserve">During development, three major implementation issues arose and were fixed. </w:t>
+      </w:r>
+      <w:r>
+        <w:rPr>
+          <w:rFonts w:hint="default" w:ascii="Times New Roman" w:hAnsi="Times New Roman" w:eastAsia="SimSun" w:cs="Times New Roman"/>
+          <w:color w:val="auto"/>
+          <w:kern w:val="0"/>
+          <w:sz w:val="24"/>
+          <w:szCs w:val="24"/>
+          <w:lang w:val="en-US" w:eastAsia="zh-CN" w:bidi="ar"/>
+        </w:rPr>
+        <w:br w:type="textWrapping"/>
+      </w:r>
+      <w:r>
+        <w:rPr>
+          <w:rFonts w:hint="default" w:ascii="Times New Roman" w:hAnsi="Times New Roman" w:eastAsia="SimSun" w:cs="Times New Roman"/>
+          <w:color w:val="auto"/>
+          <w:kern w:val="0"/>
+          <w:sz w:val="24"/>
+          <w:szCs w:val="24"/>
+          <w:lang w:val="en-US" w:eastAsia="zh-CN" w:bidi="ar"/>
+        </w:rPr>
+        <w:t>As explained in Section 4.2, the construction of a flexible preprocessing module that could identify and standardise multiple column naming and label encoding protocols was necessary due to dataset format inconsistencies between Kaggle sources. The manual preprocessing processes that would have been necessary for every new dataset were eliminated by this method.</w:t>
+      </w:r>
+    </w:p>
+    <w:p>
+      <w:pPr>
+        <w:keepNext w:val="0"/>
+        <w:keepLines w:val="0"/>
+        <w:widowControl/>
+        <w:suppressLineNumbers w:val="0"/>
+        <w:jc w:val="both"/>
+        <w:rPr>
+          <w:rFonts w:hint="default" w:ascii="Times New Roman" w:hAnsi="Times New Roman" w:cs="Times New Roman"/>
+          <w:color w:val="auto"/>
+        </w:rPr>
+      </w:pPr>
+      <w:r>
+        <w:rPr>
+          <w:rFonts w:hint="default" w:ascii="Times New Roman" w:hAnsi="Times New Roman" w:eastAsia="SimSun" w:cs="Times New Roman"/>
+          <w:color w:val="auto"/>
+          <w:kern w:val="0"/>
+          <w:sz w:val="24"/>
+          <w:szCs w:val="24"/>
+          <w:lang w:val="en-US" w:eastAsia="zh-CN" w:bidi="ar"/>
+        </w:rPr>
+        <w:t xml:space="preserve">The biggest challenge was the performance of feature extraction. For the 11,430-URL dataset, the initial sequential extraction of the entire feature set took about 6.7 hours; this is adequate for a one-time training operation but unfeasible for real-time classification. This was lowered to 52 minutes for bulk extraction with a per-URL time of 2.1 seconds by the parallel processing method detailed in Section 4.3.5. A tiered approach, which computes URL and lexical features instantly, domain features on initial visit, and content features asynchronously, is suggested for real-time browser deployment. </w:t>
+      </w:r>
+      <w:r>
+        <w:rPr>
+          <w:rFonts w:hint="default" w:ascii="Times New Roman" w:hAnsi="Times New Roman" w:eastAsia="SimSun" w:cs="Times New Roman"/>
+          <w:color w:val="auto"/>
+          <w:kern w:val="0"/>
+          <w:sz w:val="24"/>
+          <w:szCs w:val="24"/>
+          <w:lang w:val="en-US" w:eastAsia="zh-CN" w:bidi="ar"/>
+        </w:rPr>
+        <w:br w:type="textWrapping"/>
+      </w:r>
+      <w:r>
+        <w:rPr>
+          <w:rFonts w:hint="default" w:ascii="Times New Roman" w:hAnsi="Times New Roman" w:eastAsia="SimSun" w:cs="Times New Roman"/>
+          <w:color w:val="auto"/>
+          <w:kern w:val="0"/>
+          <w:sz w:val="24"/>
+          <w:szCs w:val="24"/>
+          <w:lang w:val="en-US" w:eastAsia="zh-CN" w:bidi="ar"/>
+        </w:rPr>
+        <w:t>The reliability of WHOIS searches was less than expected, with failures impacting about 15% of URLs. To prevent exploitable blind spots in the detection system caused by WHOIS failures, conservative default handling (considering unknown domain age as a risk signal) was put into place.</w:t>
+      </w:r>
+    </w:p>
+    <w:p>
+      <w:pPr>
+        <w:pStyle w:val="3"/>
+        <w:spacing w:before="300" w:after="120"/>
+        <w:jc w:val="both"/>
+        <w:rPr>
+          <w:rFonts w:hint="default" w:ascii="Times New Roman" w:hAnsi="Times New Roman" w:cs="Times New Roman"/>
+          <w:color w:val="auto"/>
+        </w:rPr>
+      </w:pPr>
+      <w:r>
+        <w:rPr>
+          <w:rFonts w:hint="default" w:ascii="Times New Roman" w:hAnsi="Times New Roman" w:eastAsia="Arial" w:cs="Times New Roman"/>
+          <w:b/>
+          <w:bCs/>
+          <w:color w:val="auto"/>
+          <w:sz w:val="28"/>
+          <w:szCs w:val="28"/>
+        </w:rPr>
+        <w:t>4.8 Code Quality and Testing</w:t>
+      </w:r>
+    </w:p>
+    <w:p>
+      <w:pPr>
+        <w:keepNext w:val="0"/>
+        <w:keepLines w:val="0"/>
+        <w:widowControl/>
+        <w:suppressLineNumbers w:val="0"/>
+        <w:jc w:val="both"/>
+        <w:rPr>
+          <w:rFonts w:hint="default" w:ascii="Times New Roman" w:hAnsi="Times New Roman" w:cs="Times New Roman"/>
+          <w:color w:val="auto"/>
+        </w:rPr>
+      </w:pPr>
+      <w:r>
+        <w:rPr>
+          <w:rFonts w:hint="default" w:ascii="Times New Roman" w:hAnsi="Times New Roman" w:eastAsia="SimSun" w:cs="Times New Roman"/>
+          <w:color w:val="auto"/>
+          <w:kern w:val="0"/>
+          <w:sz w:val="24"/>
+          <w:szCs w:val="24"/>
+          <w:lang w:val="en-US" w:eastAsia="zh-CN" w:bidi="ar"/>
+        </w:rPr>
+        <w:t>Comprehensive docstrings detailing function signatures, parameters, return values, and known limits were used in the development of each module. For the URL feature extraction functions, unit tests were created to confirm that each feature was correctly extracted against a set of manually created test URLs that covered edge cases such as IPv6 addresses, internationalised domain names, and URLs with odd encoding. Integration tests confirmed consistent outcomes across several runs, validating the entire pipeline from raw URL input to classification output. Complete traceability of implementation choices was made possible by committing all code to the GitHub repository with informative commit messages.</w:t>
+      </w:r>
+    </w:p>
+    <w:p>
+      <w:pPr>
+        <w:keepNext w:val="0"/>
+        <w:keepLines w:val="0"/>
+        <w:widowControl/>
+        <w:suppressLineNumbers w:val="0"/>
+        <w:jc w:val="both"/>
+        <w:rPr>
+          <w:rFonts w:hint="default" w:ascii="Times New Roman" w:hAnsi="Times New Roman" w:eastAsia="SimSun" w:cs="Times New Roman"/>
+          <w:color w:val="auto"/>
+          <w:kern w:val="0"/>
+          <w:sz w:val="24"/>
+          <w:szCs w:val="24"/>
+          <w:lang w:val="en-US" w:eastAsia="zh-CN" w:bidi="ar"/>
+        </w:rPr>
+      </w:pPr>
+    </w:p>
+    <w:p>
+      <w:pPr>
+        <w:jc w:val="left"/>
+        <w:rPr>
+          <w:rFonts w:hint="default" w:ascii="Times New Roman" w:hAnsi="Times New Roman" w:cs="Times New Roman"/>
+          <w:color w:val="auto"/>
+        </w:rPr>
+      </w:pPr>
+    </w:p>
+    <w:p>
+      <w:pPr>
+        <w:jc w:val="left"/>
         <w:rPr>
           <w:rFonts w:hint="default" w:ascii="Times New Roman" w:hAnsi="Times New Roman" w:eastAsia="Arial" w:cs="Times New Roman"/>
           <w:b/>
@@ -8696,7 +10306,7 @@
     </w:p>
     <w:p>
       <w:pPr>
-        <w:jc w:val="both"/>
+        <w:jc w:val="left"/>
         <w:rPr>
           <w:rFonts w:hint="default" w:ascii="Times New Roman" w:hAnsi="Times New Roman" w:eastAsia="Arial" w:cs="Times New Roman"/>
           <w:b/>
@@ -8710,7 +10320,7 @@
     </w:p>
     <w:p>
       <w:pPr>
-        <w:jc w:val="both"/>
+        <w:jc w:val="left"/>
         <w:rPr>
           <w:rFonts w:hint="default" w:ascii="Times New Roman" w:hAnsi="Times New Roman" w:eastAsia="Arial" w:cs="Times New Roman"/>
           <w:b/>
@@ -8724,62 +10334,7 @@
     </w:p>
     <w:p>
       <w:pPr>
-        <w:pStyle w:val="2"/>
-        <w:spacing w:before="400" w:after="160"/>
-        <w:rPr>
-          <w:rFonts w:hint="default" w:ascii="Times New Roman" w:hAnsi="Times New Roman" w:cs="Times New Roman"/>
-          <w:color w:val="auto"/>
-        </w:rPr>
-      </w:pPr>
-      <w:r>
-        <w:rPr>
-          <w:rFonts w:hint="default" w:ascii="Times New Roman" w:hAnsi="Times New Roman" w:eastAsia="Arial" w:cs="Times New Roman"/>
-          <w:b/>
-          <w:bCs/>
-          <w:color w:val="auto"/>
-          <w:sz w:val="36"/>
-          <w:szCs w:val="36"/>
-        </w:rPr>
-        <w:t>Chapter 4: Implementation</w:t>
-      </w:r>
-    </w:p>
-    <w:p>
-      <w:pPr>
-        <w:pStyle w:val="3"/>
-        <w:spacing w:before="300" w:after="120"/>
-        <w:rPr>
-          <w:rFonts w:hint="default" w:ascii="Times New Roman" w:hAnsi="Times New Roman" w:eastAsia="Arial" w:cs="Times New Roman"/>
-          <w:b/>
-          <w:bCs/>
-          <w:color w:val="auto"/>
-          <w:sz w:val="28"/>
-          <w:szCs w:val="28"/>
-        </w:rPr>
-      </w:pPr>
-      <w:r>
-        <w:rPr>
-          <w:rFonts w:hint="default" w:ascii="Times New Roman" w:hAnsi="Times New Roman" w:eastAsia="Arial" w:cs="Times New Roman"/>
-          <w:b/>
-          <w:bCs/>
-          <w:color w:val="auto"/>
-          <w:sz w:val="28"/>
-          <w:szCs w:val="28"/>
-        </w:rPr>
-        <w:t>4.1 Development Environment</w:t>
-      </w:r>
-    </w:p>
-    <w:p>
-      <w:pPr>
-        <w:rPr>
-          <w:rFonts w:hint="default"/>
-        </w:rPr>
-      </w:pPr>
-      <w:bookmarkStart w:id="0" w:name="_GoBack"/>
-      <w:bookmarkEnd w:id="0"/>
-    </w:p>
-    <w:p>
-      <w:pPr>
-        <w:jc w:val="both"/>
+        <w:jc w:val="left"/>
         <w:rPr>
           <w:rFonts w:hint="default" w:ascii="Times New Roman" w:hAnsi="Times New Roman" w:eastAsia="Arial" w:cs="Times New Roman"/>
           <w:b/>
@@ -8790,6 +10345,478 @@
           <w:lang w:val="en-GB"/>
         </w:rPr>
       </w:pPr>
+    </w:p>
+    <w:p>
+      <w:pPr>
+        <w:jc w:val="left"/>
+        <w:rPr>
+          <w:rFonts w:hint="default" w:ascii="Times New Roman" w:hAnsi="Times New Roman" w:eastAsia="Arial" w:cs="Times New Roman"/>
+          <w:b/>
+          <w:bCs/>
+          <w:color w:val="auto"/>
+          <w:sz w:val="28"/>
+          <w:szCs w:val="28"/>
+          <w:lang w:val="en-GB"/>
+        </w:rPr>
+      </w:pPr>
+    </w:p>
+    <w:p>
+      <w:pPr>
+        <w:jc w:val="left"/>
+        <w:rPr>
+          <w:rFonts w:hint="default" w:ascii="Times New Roman" w:hAnsi="Times New Roman" w:eastAsia="Arial" w:cs="Times New Roman"/>
+          <w:b/>
+          <w:bCs/>
+          <w:color w:val="auto"/>
+          <w:sz w:val="28"/>
+          <w:szCs w:val="28"/>
+          <w:lang w:val="en-GB"/>
+        </w:rPr>
+      </w:pPr>
+    </w:p>
+    <w:p>
+      <w:pPr>
+        <w:jc w:val="left"/>
+        <w:rPr>
+          <w:rFonts w:hint="default" w:ascii="Times New Roman" w:hAnsi="Times New Roman" w:eastAsia="Arial" w:cs="Times New Roman"/>
+          <w:b/>
+          <w:bCs/>
+          <w:color w:val="auto"/>
+          <w:sz w:val="28"/>
+          <w:szCs w:val="28"/>
+          <w:lang w:val="en-GB"/>
+        </w:rPr>
+      </w:pPr>
+    </w:p>
+    <w:p>
+      <w:pPr>
+        <w:jc w:val="left"/>
+        <w:rPr>
+          <w:rFonts w:hint="default" w:ascii="Times New Roman" w:hAnsi="Times New Roman" w:eastAsia="Arial" w:cs="Times New Roman"/>
+          <w:b/>
+          <w:bCs/>
+          <w:color w:val="auto"/>
+          <w:sz w:val="28"/>
+          <w:szCs w:val="28"/>
+          <w:lang w:val="en-GB"/>
+        </w:rPr>
+      </w:pPr>
+    </w:p>
+    <w:p>
+      <w:pPr>
+        <w:jc w:val="left"/>
+        <w:rPr>
+          <w:rFonts w:hint="default" w:ascii="Times New Roman" w:hAnsi="Times New Roman" w:eastAsia="Arial" w:cs="Times New Roman"/>
+          <w:b/>
+          <w:bCs/>
+          <w:color w:val="auto"/>
+          <w:sz w:val="28"/>
+          <w:szCs w:val="28"/>
+          <w:lang w:val="en-GB"/>
+        </w:rPr>
+      </w:pPr>
+    </w:p>
+    <w:p>
+      <w:pPr>
+        <w:jc w:val="left"/>
+        <w:rPr>
+          <w:rFonts w:hint="default" w:ascii="Times New Roman" w:hAnsi="Times New Roman" w:eastAsia="Arial" w:cs="Times New Roman"/>
+          <w:b/>
+          <w:bCs/>
+          <w:color w:val="auto"/>
+          <w:sz w:val="28"/>
+          <w:szCs w:val="28"/>
+          <w:lang w:val="en-GB"/>
+        </w:rPr>
+      </w:pPr>
+    </w:p>
+    <w:p>
+      <w:pPr>
+        <w:jc w:val="left"/>
+        <w:rPr>
+          <w:rFonts w:hint="default" w:ascii="Times New Roman" w:hAnsi="Times New Roman" w:eastAsia="Arial" w:cs="Times New Roman"/>
+          <w:b/>
+          <w:bCs/>
+          <w:color w:val="auto"/>
+          <w:sz w:val="28"/>
+          <w:szCs w:val="28"/>
+          <w:lang w:val="en-GB"/>
+        </w:rPr>
+      </w:pPr>
+    </w:p>
+    <w:p>
+      <w:pPr>
+        <w:jc w:val="left"/>
+        <w:rPr>
+          <w:rFonts w:hint="default" w:ascii="Times New Roman" w:hAnsi="Times New Roman" w:eastAsia="Arial" w:cs="Times New Roman"/>
+          <w:b/>
+          <w:bCs/>
+          <w:color w:val="auto"/>
+          <w:sz w:val="28"/>
+          <w:szCs w:val="28"/>
+          <w:lang w:val="en-GB"/>
+        </w:rPr>
+      </w:pPr>
+    </w:p>
+    <w:p>
+      <w:pPr>
+        <w:jc w:val="left"/>
+        <w:rPr>
+          <w:rFonts w:hint="default" w:ascii="Times New Roman" w:hAnsi="Times New Roman" w:eastAsia="Arial" w:cs="Times New Roman"/>
+          <w:b/>
+          <w:bCs/>
+          <w:color w:val="auto"/>
+          <w:sz w:val="28"/>
+          <w:szCs w:val="28"/>
+          <w:lang w:val="en-GB"/>
+        </w:rPr>
+      </w:pPr>
+    </w:p>
+    <w:p>
+      <w:pPr>
+        <w:jc w:val="left"/>
+        <w:rPr>
+          <w:rFonts w:hint="default" w:ascii="Times New Roman" w:hAnsi="Times New Roman" w:eastAsia="Arial" w:cs="Times New Roman"/>
+          <w:b/>
+          <w:bCs/>
+          <w:color w:val="auto"/>
+          <w:sz w:val="28"/>
+          <w:szCs w:val="28"/>
+          <w:lang w:val="en-GB"/>
+        </w:rPr>
+      </w:pPr>
+    </w:p>
+    <w:p>
+      <w:pPr>
+        <w:jc w:val="left"/>
+        <w:rPr>
+          <w:rFonts w:hint="default" w:ascii="Times New Roman" w:hAnsi="Times New Roman" w:eastAsia="Arial" w:cs="Times New Roman"/>
+          <w:b/>
+          <w:bCs/>
+          <w:color w:val="auto"/>
+          <w:sz w:val="28"/>
+          <w:szCs w:val="28"/>
+          <w:lang w:val="en-GB"/>
+        </w:rPr>
+      </w:pPr>
+    </w:p>
+    <w:p>
+      <w:pPr>
+        <w:jc w:val="left"/>
+        <w:rPr>
+          <w:rFonts w:hint="default" w:ascii="Times New Roman" w:hAnsi="Times New Roman" w:eastAsia="Arial" w:cs="Times New Roman"/>
+          <w:b/>
+          <w:bCs/>
+          <w:color w:val="auto"/>
+          <w:sz w:val="28"/>
+          <w:szCs w:val="28"/>
+          <w:lang w:val="en-GB"/>
+        </w:rPr>
+      </w:pPr>
+    </w:p>
+    <w:p>
+      <w:pPr>
+        <w:jc w:val="left"/>
+        <w:rPr>
+          <w:rFonts w:hint="default" w:ascii="Times New Roman" w:hAnsi="Times New Roman" w:eastAsia="Arial" w:cs="Times New Roman"/>
+          <w:b/>
+          <w:bCs/>
+          <w:color w:val="auto"/>
+          <w:sz w:val="28"/>
+          <w:szCs w:val="28"/>
+          <w:lang w:val="en-GB"/>
+        </w:rPr>
+      </w:pPr>
+    </w:p>
+    <w:p>
+      <w:pPr>
+        <w:jc w:val="left"/>
+        <w:rPr>
+          <w:rFonts w:hint="default" w:ascii="Times New Roman" w:hAnsi="Times New Roman" w:eastAsia="Arial" w:cs="Times New Roman"/>
+          <w:b/>
+          <w:bCs/>
+          <w:color w:val="auto"/>
+          <w:sz w:val="28"/>
+          <w:szCs w:val="28"/>
+          <w:lang w:val="en-GB"/>
+        </w:rPr>
+      </w:pPr>
+    </w:p>
+    <w:p>
+      <w:pPr>
+        <w:jc w:val="left"/>
+        <w:rPr>
+          <w:rFonts w:hint="default" w:ascii="Times New Roman" w:hAnsi="Times New Roman" w:eastAsia="Arial" w:cs="Times New Roman"/>
+          <w:b/>
+          <w:bCs/>
+          <w:color w:val="auto"/>
+          <w:sz w:val="28"/>
+          <w:szCs w:val="28"/>
+          <w:lang w:val="en-GB"/>
+        </w:rPr>
+      </w:pPr>
+    </w:p>
+    <w:p>
+      <w:pPr>
+        <w:jc w:val="left"/>
+        <w:rPr>
+          <w:rFonts w:hint="default" w:ascii="Times New Roman" w:hAnsi="Times New Roman" w:eastAsia="Arial" w:cs="Times New Roman"/>
+          <w:b/>
+          <w:bCs/>
+          <w:color w:val="auto"/>
+          <w:sz w:val="28"/>
+          <w:szCs w:val="28"/>
+          <w:lang w:val="en-GB"/>
+        </w:rPr>
+      </w:pPr>
+      <w:bookmarkStart w:id="0" w:name="_GoBack"/>
+      <w:bookmarkEnd w:id="0"/>
+    </w:p>
+    <w:p>
+      <w:pPr>
+        <w:pStyle w:val="2"/>
+        <w:spacing w:before="400" w:after="160"/>
+        <w:rPr>
+          <w:rFonts w:hint="default" w:ascii="Times New Roman" w:hAnsi="Times New Roman" w:cs="Times New Roman"/>
+        </w:rPr>
+      </w:pPr>
+      <w:r>
+        <w:rPr>
+          <w:rFonts w:hint="default" w:ascii="Times New Roman" w:hAnsi="Times New Roman" w:eastAsia="Arial" w:cs="Times New Roman"/>
+          <w:b/>
+          <w:bCs/>
+          <w:color w:val="auto"/>
+          <w:sz w:val="36"/>
+          <w:szCs w:val="36"/>
+        </w:rPr>
+        <w:t>References</w:t>
+      </w:r>
+    </w:p>
+    <w:p>
+      <w:pPr>
+        <w:spacing w:before="0" w:after="0" w:line="240" w:lineRule="auto"/>
+        <w:rPr>
+          <w:rFonts w:hint="default" w:ascii="Times New Roman" w:hAnsi="Times New Roman" w:cs="Times New Roman"/>
+        </w:rPr>
+      </w:pPr>
+    </w:p>
+    <w:p>
+      <w:pPr>
+        <w:spacing w:before="60" w:after="60" w:line="276" w:lineRule="auto"/>
+        <w:ind w:left="720" w:hanging="720"/>
+        <w:rPr>
+          <w:rFonts w:hint="default" w:ascii="Times New Roman" w:hAnsi="Times New Roman" w:cs="Times New Roman"/>
+        </w:rPr>
+      </w:pPr>
+      <w:r>
+        <w:rPr>
+          <w:rFonts w:hint="default" w:ascii="Times New Roman" w:hAnsi="Times New Roman" w:eastAsia="Arial" w:cs="Times New Roman"/>
+          <w:color w:val="1A1A1A"/>
+          <w:sz w:val="20"/>
+          <w:szCs w:val="20"/>
+        </w:rPr>
+        <w:t>APWG (2024) Phishing Activity Trends Report, 4th Quarter 2024. Anti-Phishing Working Group. Available at: https://apwg.org/trendsreports/ (Accessed: 20 March 2026).</w:t>
+      </w:r>
+    </w:p>
+    <w:p>
+      <w:pPr>
+        <w:spacing w:before="60" w:after="60" w:line="276" w:lineRule="auto"/>
+        <w:ind w:left="720" w:hanging="720"/>
+        <w:rPr>
+          <w:rFonts w:hint="default" w:ascii="Times New Roman" w:hAnsi="Times New Roman" w:cs="Times New Roman"/>
+        </w:rPr>
+      </w:pPr>
+      <w:r>
+        <w:rPr>
+          <w:rFonts w:hint="default" w:ascii="Times New Roman" w:hAnsi="Times New Roman" w:eastAsia="Arial" w:cs="Times New Roman"/>
+          <w:color w:val="1A1A1A"/>
+          <w:sz w:val="20"/>
+          <w:szCs w:val="20"/>
+        </w:rPr>
+        <w:t>Abdelhamid, N., Ayesh, A. and Thabtah, F. (2014) 'Phishing detection based associative classification data mining', Expert Systems with Applications, 41(13), pp. 5948–5959.</w:t>
+      </w:r>
+    </w:p>
+    <w:p>
+      <w:pPr>
+        <w:spacing w:before="60" w:after="60" w:line="276" w:lineRule="auto"/>
+        <w:ind w:left="720" w:hanging="720"/>
+        <w:rPr>
+          <w:rFonts w:hint="default" w:ascii="Times New Roman" w:hAnsi="Times New Roman" w:cs="Times New Roman"/>
+        </w:rPr>
+      </w:pPr>
+      <w:r>
+        <w:rPr>
+          <w:rFonts w:hint="default" w:ascii="Times New Roman" w:hAnsi="Times New Roman" w:eastAsia="Arial" w:cs="Times New Roman"/>
+          <w:color w:val="1A1A1A"/>
+          <w:sz w:val="20"/>
+          <w:szCs w:val="20"/>
+        </w:rPr>
+        <w:t>Chiew, K.L., Tan, C.L., Wong, K., Yong, K.S.C. and Tiong, W.K. (2018) 'A new hybrid ensemble feature selection framework for machine learning-based phishing detection system', Information Sciences, 484, pp. 153–166.</w:t>
+      </w:r>
+    </w:p>
+    <w:p>
+      <w:pPr>
+        <w:spacing w:before="60" w:after="60" w:line="276" w:lineRule="auto"/>
+        <w:ind w:left="720" w:hanging="720"/>
+        <w:rPr>
+          <w:rFonts w:hint="default" w:ascii="Times New Roman" w:hAnsi="Times New Roman" w:cs="Times New Roman"/>
+        </w:rPr>
+      </w:pPr>
+      <w:r>
+        <w:rPr>
+          <w:rFonts w:hint="default" w:ascii="Times New Roman" w:hAnsi="Times New Roman" w:eastAsia="Arial" w:cs="Times New Roman"/>
+          <w:color w:val="1A1A1A"/>
+          <w:sz w:val="20"/>
+          <w:szCs w:val="20"/>
+        </w:rPr>
+        <w:t>Jain, A.K. and Gupta, B.B. (2022) 'A survey on phishing detection techniques', Journal of Ambient Intelligence and Humanized Computing, 13(10), pp. 4867–4886.</w:t>
+      </w:r>
+    </w:p>
+    <w:p>
+      <w:pPr>
+        <w:spacing w:before="60" w:after="60" w:line="276" w:lineRule="auto"/>
+        <w:ind w:left="720" w:hanging="720"/>
+        <w:rPr>
+          <w:rFonts w:hint="default" w:ascii="Times New Roman" w:hAnsi="Times New Roman" w:cs="Times New Roman"/>
+        </w:rPr>
+      </w:pPr>
+      <w:r>
+        <w:rPr>
+          <w:rFonts w:hint="default" w:ascii="Times New Roman" w:hAnsi="Times New Roman" w:eastAsia="Arial" w:cs="Times New Roman"/>
+          <w:color w:val="1A1A1A"/>
+          <w:sz w:val="20"/>
+          <w:szCs w:val="20"/>
+        </w:rPr>
+        <w:t>Khonji, M., Iraqi, Y. and Jones, A. (2013) 'Phishing detection: a literature survey', IEEE Communications Surveys and Tutorials, 15(4), pp. 2091–2121.</w:t>
+      </w:r>
+    </w:p>
+    <w:p>
+      <w:pPr>
+        <w:spacing w:before="60" w:after="60" w:line="276" w:lineRule="auto"/>
+        <w:ind w:left="720" w:hanging="720"/>
+        <w:rPr>
+          <w:rFonts w:hint="default" w:ascii="Times New Roman" w:hAnsi="Times New Roman" w:cs="Times New Roman"/>
+        </w:rPr>
+      </w:pPr>
+      <w:r>
+        <w:rPr>
+          <w:rFonts w:hint="default" w:ascii="Times New Roman" w:hAnsi="Times New Roman" w:eastAsia="Arial" w:cs="Times New Roman"/>
+          <w:color w:val="1A1A1A"/>
+          <w:sz w:val="20"/>
+          <w:szCs w:val="20"/>
+        </w:rPr>
+        <w:t>Mohammad, R.M., Thabtah, F. and McCluskey, L. (2015) 'Phishing websites detection based on machine learning: A review', International Journal of Computer Applications, 181(5), pp. 27–43.</w:t>
+      </w:r>
+    </w:p>
+    <w:p>
+      <w:pPr>
+        <w:spacing w:before="60" w:after="60" w:line="276" w:lineRule="auto"/>
+        <w:ind w:left="720" w:hanging="720"/>
+        <w:rPr>
+          <w:rFonts w:hint="default" w:ascii="Times New Roman" w:hAnsi="Times New Roman" w:cs="Times New Roman"/>
+        </w:rPr>
+      </w:pPr>
+      <w:r>
+        <w:rPr>
+          <w:rFonts w:hint="default" w:ascii="Times New Roman" w:hAnsi="Times New Roman" w:eastAsia="Arial" w:cs="Times New Roman"/>
+          <w:color w:val="1A1A1A"/>
+          <w:sz w:val="20"/>
+          <w:szCs w:val="20"/>
+        </w:rPr>
+        <w:t>Rao, R.S. and Pais, A.R. (2019) 'Detection of phishing websites using an efficient feature-based machine learning framework', Neural Computing and Applications, 31(8), pp. 3851–3873.</w:t>
+      </w:r>
+    </w:p>
+    <w:p>
+      <w:pPr>
+        <w:spacing w:before="60" w:after="60" w:line="276" w:lineRule="auto"/>
+        <w:ind w:left="720" w:hanging="720"/>
+        <w:rPr>
+          <w:rFonts w:hint="default" w:ascii="Times New Roman" w:hAnsi="Times New Roman" w:cs="Times New Roman"/>
+        </w:rPr>
+      </w:pPr>
+      <w:r>
+        <w:rPr>
+          <w:rFonts w:hint="default" w:ascii="Times New Roman" w:hAnsi="Times New Roman" w:eastAsia="Arial" w:cs="Times New Roman"/>
+          <w:color w:val="1A1A1A"/>
+          <w:sz w:val="20"/>
+          <w:szCs w:val="20"/>
+        </w:rPr>
+        <w:t>Sahingoz, O.K., Buber, E., Demir, O. and Diri, B. (2019) 'Machine learning based phishing detection from URLs', Expert Systems with Applications, 117, pp. 345–357.</w:t>
+      </w:r>
+    </w:p>
+    <w:p>
+      <w:pPr>
+        <w:spacing w:before="60" w:after="60" w:line="276" w:lineRule="auto"/>
+        <w:ind w:left="720" w:hanging="720"/>
+        <w:rPr>
+          <w:rFonts w:hint="default" w:ascii="Times New Roman" w:hAnsi="Times New Roman" w:cs="Times New Roman"/>
+        </w:rPr>
+      </w:pPr>
+      <w:r>
+        <w:rPr>
+          <w:rFonts w:hint="default" w:ascii="Times New Roman" w:hAnsi="Times New Roman" w:eastAsia="Arial" w:cs="Times New Roman"/>
+          <w:color w:val="1A1A1A"/>
+          <w:sz w:val="20"/>
+          <w:szCs w:val="20"/>
+        </w:rPr>
+        <w:t>Tiwari, S. (2021) Web Page Phishing Detection Dataset. Kaggle. Available at: https://www.kaggle.com/datasets/shashwatwork/web-page-phishing-detection-dataset (Accessed: 10 February 2026).</w:t>
+      </w:r>
+    </w:p>
+    <w:p>
+      <w:pPr>
+        <w:spacing w:before="60" w:after="60" w:line="276" w:lineRule="auto"/>
+        <w:ind w:left="720" w:hanging="720"/>
+        <w:rPr>
+          <w:rFonts w:hint="default" w:ascii="Times New Roman" w:hAnsi="Times New Roman" w:cs="Times New Roman"/>
+        </w:rPr>
+      </w:pPr>
+      <w:r>
+        <w:rPr>
+          <w:rFonts w:hint="default" w:ascii="Times New Roman" w:hAnsi="Times New Roman" w:eastAsia="Arial" w:cs="Times New Roman"/>
+          <w:color w:val="1A1A1A"/>
+          <w:sz w:val="20"/>
+          <w:szCs w:val="20"/>
+        </w:rPr>
+        <w:t>Wardman, B. and Warner, G. (2008) 'Automating phishing website identification through deep MD5 matching', in Proceedings of the eCrime Researchers Summit. IEEE, pp. 1–8.</w:t>
+      </w:r>
+    </w:p>
+    <w:p>
+      <w:pPr>
+        <w:spacing w:before="60" w:after="60" w:line="276" w:lineRule="auto"/>
+        <w:ind w:left="720" w:hanging="720"/>
+        <w:rPr>
+          <w:rFonts w:hint="default" w:ascii="Times New Roman" w:hAnsi="Times New Roman" w:cs="Times New Roman"/>
+        </w:rPr>
+      </w:pPr>
+      <w:r>
+        <w:rPr>
+          <w:rFonts w:hint="default" w:ascii="Times New Roman" w:hAnsi="Times New Roman" w:eastAsia="Arial" w:cs="Times New Roman"/>
+          <w:color w:val="1A1A1A"/>
+          <w:sz w:val="20"/>
+          <w:szCs w:val="20"/>
+        </w:rPr>
+        <w:t>Yi, P., Guan, Y., Zou, F., Yao, Y., Wang, W. and Zhu, T. (2020) 'Web phishing detection using a deep learning framework', Wireless Communications and Mobile Computing, 2018, Article ID 4678746.</w:t>
+      </w:r>
+    </w:p>
+    <w:p>
+      <w:pPr>
+        <w:jc w:val="left"/>
+        <w:rPr>
+          <w:rFonts w:hint="default" w:ascii="Times New Roman" w:hAnsi="Times New Roman" w:eastAsia="Arial" w:cs="Times New Roman"/>
+          <w:b/>
+          <w:bCs/>
+          <w:color w:val="auto"/>
+          <w:sz w:val="28"/>
+          <w:szCs w:val="28"/>
+          <w:lang w:val="en-GB"/>
+        </w:rPr>
+      </w:pPr>
+      <w:r>
+        <w:rPr>
+          <w:rFonts w:hint="default" w:ascii="Times New Roman" w:hAnsi="Times New Roman" w:cs="Times New Roman"/>
+        </w:rPr>
+        <w:br w:type="page"/>
+      </w:r>
     </w:p>
     <w:sectPr>
       <w:pgSz w:w="12240" w:h="15840"/>

</xml_diff>

<commit_message>
Updated Files with cross checking format
</commit_message>
<xml_diff>
--- a/Documentaions/24090531-Hyndavi-Yasarapu FPR.docx
+++ b/Documentaions/24090531-Hyndavi-Yasarapu FPR.docx
@@ -349,15 +349,91 @@
     </w:p>
     <w:p>
       <w:pPr>
+        <w:spacing w:before="200" w:after="0"/>
         <w:jc w:val="both"/>
         <w:rPr>
-          <w:rFonts w:hint="default" w:ascii="Times New Roman" w:hAnsi="Times New Roman" w:eastAsia="Calibri" w:cs="Times New Roman"/>
-          <w:color w:val="auto"/>
-          <w:sz w:val="36"/>
-          <w:szCs w:val="36"/>
+          <w:rFonts w:hint="default" w:ascii="Times New Roman" w:hAnsi="Times New Roman" w:eastAsia="Times New Roman" w:cs="Times New Roman"/>
+          <w:b/>
+          <w:bCs/>
+          <w:sz w:val="24"/>
+          <w:szCs w:val="24"/>
           <w:lang w:val="en-GB"/>
         </w:rPr>
       </w:pPr>
+    </w:p>
+    <w:p>
+      <w:pPr>
+        <w:spacing w:before="200" w:after="0"/>
+        <w:jc w:val="both"/>
+        <w:rPr>
+          <w:rFonts w:hint="default" w:ascii="Times New Roman" w:hAnsi="Times New Roman" w:eastAsia="Times New Roman" w:cs="Times New Roman"/>
+          <w:b/>
+          <w:bCs/>
+          <w:sz w:val="24"/>
+          <w:szCs w:val="24"/>
+          <w:lang w:val="en-GB"/>
+        </w:rPr>
+      </w:pPr>
+    </w:p>
+    <w:p>
+      <w:pPr>
+        <w:spacing w:before="200" w:after="0"/>
+        <w:jc w:val="both"/>
+        <w:rPr>
+          <w:rFonts w:hint="default" w:ascii="Times New Roman" w:hAnsi="Times New Roman" w:eastAsia="Times New Roman" w:cs="Times New Roman"/>
+          <w:b/>
+          <w:bCs/>
+          <w:sz w:val="24"/>
+          <w:szCs w:val="24"/>
+          <w:lang w:val="en-GB"/>
+        </w:rPr>
+      </w:pPr>
+    </w:p>
+    <w:p>
+      <w:pPr>
+        <w:spacing w:before="200" w:after="0"/>
+        <w:jc w:val="both"/>
+        <w:rPr>
+          <w:rFonts w:hint="default" w:ascii="Times New Roman" w:hAnsi="Times New Roman" w:eastAsia="Times New Roman" w:cs="Times New Roman"/>
+          <w:b/>
+          <w:bCs/>
+          <w:sz w:val="24"/>
+          <w:szCs w:val="24"/>
+          <w:lang w:val="en-GB"/>
+        </w:rPr>
+      </w:pPr>
+      <w:r>
+        <w:rPr>
+          <w:rFonts w:hint="default" w:ascii="Times New Roman" w:hAnsi="Times New Roman" w:eastAsia="Times New Roman" w:cs="Times New Roman"/>
+          <w:b/>
+          <w:bCs/>
+          <w:sz w:val="24"/>
+          <w:szCs w:val="24"/>
+          <w:lang w:val="en-GB"/>
+        </w:rPr>
+        <w:t>Proof-Read and Quality Check Confirmation:</w:t>
+      </w:r>
+    </w:p>
+    <w:p>
+      <w:pPr>
+        <w:spacing w:before="60" w:after="0"/>
+        <w:jc w:val="both"/>
+        <w:rPr>
+          <w:rFonts w:hint="default" w:ascii="Times New Roman" w:hAnsi="Times New Roman" w:eastAsia="Times New Roman" w:cs="Times New Roman"/>
+          <w:sz w:val="24"/>
+          <w:szCs w:val="24"/>
+          <w:lang w:val="en-GB"/>
+        </w:rPr>
+      </w:pPr>
+      <w:r>
+        <w:rPr>
+          <w:rFonts w:hint="default" w:ascii="Times New Roman" w:hAnsi="Times New Roman" w:eastAsia="Times New Roman" w:cs="Times New Roman"/>
+          <w:sz w:val="24"/>
+          <w:szCs w:val="24"/>
+          <w:lang w:val="en-GB"/>
+        </w:rPr>
+        <w:t>I confirm that this report has been critically proof-read and quality checked to ensure it is free from grammar, spelling, and formatting errors, and meets high standards of clarity, coherence, and presentation.</w:t>
+      </w:r>
     </w:p>
     <w:p>
       <w:pPr>
@@ -380,7 +456,7 @@
         <w:jc w:val="center"/>
         <w:rPr>
           <w:rFonts w:hint="default" w:ascii="Times New Roman" w:hAnsi="Times New Roman" w:eastAsia="Times New Roman" w:cs="Times New Roman"/>
-          <w:color w:val="104862" w:themeColor="accent1" w:themeShade="BF"/>
+          <w:color w:val="auto"/>
           <w:sz w:val="36"/>
           <w:szCs w:val="32"/>
           <w:lang w:eastAsia="en-GB"/>
@@ -389,7 +465,7 @@
       <w:r>
         <w:rPr>
           <w:rFonts w:hint="default" w:ascii="Times New Roman" w:hAnsi="Times New Roman" w:eastAsia="Times New Roman" w:cs="Times New Roman"/>
-          <w:color w:val="104862" w:themeColor="accent1" w:themeShade="BF"/>
+          <w:color w:val="auto"/>
           <w:sz w:val="36"/>
           <w:szCs w:val="32"/>
           <w:lang w:eastAsia="en-GB"/>
@@ -411,6 +487,8 @@
           <w:lang w:eastAsia="en-GB"/>
         </w:rPr>
       </w:pPr>
+      <w:bookmarkStart w:id="0" w:name="_GoBack"/>
+      <w:bookmarkEnd w:id="0"/>
     </w:p>
     <w:p>
       <w:pPr>
@@ -495,13 +573,7 @@
           <w:lang w:eastAsia="en-GB"/>
         </w:rPr>
       </w:pPr>
-    </w:p>
-    <w:p>
-      <w:pPr>
-        <w:autoSpaceDE w:val="0"/>
-        <w:autoSpaceDN w:val="0"/>
-        <w:adjustRightInd w:val="0"/>
-        <w:spacing w:before="100" w:beforeAutospacing="1" w:after="0" w:line="480" w:lineRule="auto"/>
+      <w:r>
         <w:rPr>
           <w:rFonts w:hint="default" w:ascii="Times New Roman" w:hAnsi="Times New Roman" w:eastAsia="Times New Roman" w:cs="Times New Roman"/>
           <w:color w:val="000000"/>
@@ -509,34 +581,8 @@
           <w:szCs w:val="24"/>
           <w:lang w:eastAsia="en-GB"/>
         </w:rPr>
-      </w:pPr>
-      <w:r>
-        <w:rPr>
-          <w:rFonts w:hint="default" w:ascii="Times New Roman" w:hAnsi="Times New Roman" w:eastAsia="Times New Roman" w:cs="Times New Roman"/>
-          <w:color w:val="000000"/>
-          <w:sz w:val="24"/>
-          <w:szCs w:val="24"/>
-          <w:lang w:eastAsia="en-GB"/>
-        </w:rPr>
         <w:t>I hereby declare that the work presented in this project and report is entirely my own, except where explicitly stated otherwise. All sources of information and ideas, whether quoted directly or paraphrased, have been properly referenced in accordance with academic standards. I understand that any failure to properly acknowledge the work of others could constitute plagiarism and may result in academic penalties.</w:t>
       </w:r>
-    </w:p>
-    <w:p>
-      <w:pPr>
-        <w:autoSpaceDE w:val="0"/>
-        <w:autoSpaceDN w:val="0"/>
-        <w:adjustRightInd w:val="0"/>
-        <w:spacing w:before="100" w:beforeAutospacing="1" w:after="0" w:line="480" w:lineRule="auto"/>
-        <w:rPr>
-          <w:rFonts w:hint="default" w:ascii="Times New Roman" w:hAnsi="Times New Roman" w:eastAsia="Times New Roman" w:cs="Times New Roman"/>
-          <w:i/>
-          <w:iCs/>
-          <w:color w:val="000000"/>
-          <w:sz w:val="24"/>
-          <w:szCs w:val="24"/>
-          <w:lang w:eastAsia="en-GB"/>
-        </w:rPr>
-      </w:pPr>
     </w:p>
     <w:p>
       <w:pPr>
@@ -667,94 +713,6 @@
         </w:rPr>
         <w:t>.</w:t>
       </w:r>
-    </w:p>
-    <w:p>
-      <w:pPr>
-        <w:jc w:val="both"/>
-        <w:rPr>
-          <w:rFonts w:hint="default" w:ascii="Times New Roman" w:hAnsi="Times New Roman" w:eastAsia="Calibri" w:cs="Times New Roman"/>
-          <w:color w:val="auto"/>
-          <w:sz w:val="36"/>
-          <w:szCs w:val="36"/>
-          <w:lang w:val="en-GB"/>
-        </w:rPr>
-      </w:pPr>
-    </w:p>
-    <w:p>
-      <w:pPr>
-        <w:jc w:val="both"/>
-        <w:rPr>
-          <w:rFonts w:hint="default" w:ascii="Times New Roman" w:hAnsi="Times New Roman" w:eastAsia="Calibri" w:cs="Times New Roman"/>
-          <w:color w:val="auto"/>
-          <w:sz w:val="36"/>
-          <w:szCs w:val="36"/>
-          <w:lang w:val="en-GB"/>
-        </w:rPr>
-      </w:pPr>
-    </w:p>
-    <w:p>
-      <w:pPr>
-        <w:spacing w:before="200" w:after="0"/>
-        <w:jc w:val="both"/>
-        <w:rPr>
-          <w:rFonts w:hint="default" w:ascii="Times New Roman" w:hAnsi="Times New Roman" w:eastAsia="Times New Roman" w:cs="Times New Roman"/>
-          <w:b/>
-          <w:bCs/>
-          <w:sz w:val="24"/>
-          <w:szCs w:val="24"/>
-          <w:lang w:val="en-GB"/>
-        </w:rPr>
-      </w:pPr>
-      <w:r>
-        <w:rPr>
-          <w:rFonts w:hint="default" w:ascii="Times New Roman" w:hAnsi="Times New Roman" w:eastAsia="Times New Roman" w:cs="Times New Roman"/>
-          <w:b/>
-          <w:bCs/>
-          <w:sz w:val="24"/>
-          <w:szCs w:val="24"/>
-          <w:lang w:val="en-GB"/>
-        </w:rPr>
-        <w:t>Proof-Read and Quality Check Confirmation:</w:t>
-      </w:r>
-    </w:p>
-    <w:p>
-      <w:pPr>
-        <w:spacing w:before="60" w:after="0"/>
-        <w:jc w:val="both"/>
-        <w:rPr>
-          <w:rFonts w:hint="default" w:ascii="Times New Roman" w:hAnsi="Times New Roman" w:eastAsia="Times New Roman" w:cs="Times New Roman"/>
-          <w:sz w:val="24"/>
-          <w:szCs w:val="24"/>
-          <w:lang w:val="en-GB"/>
-        </w:rPr>
-      </w:pPr>
-      <w:r>
-        <w:rPr>
-          <w:rFonts w:hint="default" w:ascii="Times New Roman" w:hAnsi="Times New Roman" w:eastAsia="Times New Roman" w:cs="Times New Roman"/>
-          <w:sz w:val="24"/>
-          <w:szCs w:val="24"/>
-          <w:lang w:val="en-GB"/>
-        </w:rPr>
-        <w:t>I confirm that this report has been critically proof-read and quality checked to ensure it is free from grammar, spelling, and formatting errors, and meets high standards of clarity, coherence, and presentation.</w:t>
-      </w:r>
-    </w:p>
-    <w:p>
-      <w:pPr>
-        <w:jc w:val="both"/>
-        <w:rPr>
-          <w:rFonts w:hint="default" w:ascii="Times New Roman" w:hAnsi="Times New Roman" w:eastAsia="Calibri" w:cs="Times New Roman"/>
-          <w:color w:val="auto"/>
-          <w:sz w:val="36"/>
-          <w:szCs w:val="36"/>
-          <w:lang w:val="en-GB"/>
-        </w:rPr>
-        <w:sectPr>
-          <w:pgSz w:w="12240" w:h="15840"/>
-          <w:pgMar w:top="1440" w:right="1440" w:bottom="1440" w:left="1440" w:header="720" w:footer="720" w:gutter="0"/>
-          <w:cols w:space="720" w:num="1"/>
-          <w:docGrid w:linePitch="360" w:charSpace="0"/>
-        </w:sectPr>
-      </w:pPr>
     </w:p>
     <w:p>
       <w:pPr>
@@ -1113,6 +1071,10 @@
         </w:tabs>
         <w:spacing w:before="140" w:after="0"/>
         <w:ind w:left="0"/>
+        <w:rPr>
+          <w:rFonts w:hint="default"/>
+          <w:lang w:val="en-GB"/>
+        </w:rPr>
       </w:pPr>
       <w:r>
         <w:rPr>
@@ -1136,13 +1098,14 @@
       </w:r>
       <w:r>
         <w:rPr>
-          <w:rFonts w:ascii="Times New Roman" w:hAnsi="Times New Roman" w:eastAsia="Times New Roman" w:cs="Times New Roman"/>
+          <w:rFonts w:hint="default" w:ascii="Times New Roman" w:hAnsi="Times New Roman" w:eastAsia="Times New Roman" w:cs="Times New Roman"/>
           <w:b/>
           <w:bCs/>
           <w:sz w:val="24"/>
           <w:szCs w:val="24"/>
-        </w:rPr>
-        <w:t>2</w:t>
+          <w:lang w:val="en-GB"/>
+        </w:rPr>
+        <w:t>3</w:t>
       </w:r>
     </w:p>
     <w:p>
@@ -1152,6 +1115,10 @@
         </w:tabs>
         <w:spacing w:before="140" w:after="0"/>
         <w:ind w:left="0"/>
+        <w:rPr>
+          <w:rFonts w:hint="default"/>
+          <w:lang w:val="en-GB"/>
+        </w:rPr>
       </w:pPr>
       <w:r>
         <w:rPr>
@@ -1175,13 +1142,14 @@
       </w:r>
       <w:r>
         <w:rPr>
-          <w:rFonts w:ascii="Times New Roman" w:hAnsi="Times New Roman" w:eastAsia="Times New Roman" w:cs="Times New Roman"/>
+          <w:rFonts w:hint="default" w:ascii="Times New Roman" w:hAnsi="Times New Roman" w:eastAsia="Times New Roman" w:cs="Times New Roman"/>
           <w:b/>
           <w:bCs/>
           <w:sz w:val="24"/>
           <w:szCs w:val="24"/>
-        </w:rPr>
-        <w:t>5</w:t>
+          <w:lang w:val="en-GB"/>
+        </w:rPr>
+        <w:t>7</w:t>
       </w:r>
     </w:p>
     <w:p>
@@ -1191,6 +1159,10 @@
         </w:tabs>
         <w:spacing w:before="140" w:after="0"/>
         <w:ind w:left="0"/>
+        <w:rPr>
+          <w:rFonts w:hint="default"/>
+          <w:lang w:val="en-GB"/>
+        </w:rPr>
       </w:pPr>
       <w:r>
         <w:rPr>
@@ -1214,13 +1186,14 @@
       </w:r>
       <w:r>
         <w:rPr>
-          <w:rFonts w:ascii="Times New Roman" w:hAnsi="Times New Roman" w:eastAsia="Times New Roman" w:cs="Times New Roman"/>
+          <w:rFonts w:hint="default" w:ascii="Times New Roman" w:hAnsi="Times New Roman" w:eastAsia="Times New Roman" w:cs="Times New Roman"/>
           <w:b/>
           <w:bCs/>
           <w:sz w:val="24"/>
           <w:szCs w:val="24"/>
-        </w:rPr>
-        <w:t>5</w:t>
+          <w:lang w:val="en-GB"/>
+        </w:rPr>
+        <w:t>7</w:t>
       </w:r>
     </w:p>
     <w:p>
@@ -1264,7 +1237,7 @@
           <w:szCs w:val="24"/>
           <w:lang w:val="en-GB"/>
         </w:rPr>
-        <w:t>8</w:t>
+        <w:t>9</w:t>
       </w:r>
     </w:p>
     <w:p>
@@ -1308,7 +1281,7 @@
           <w:szCs w:val="22"/>
           <w:lang w:val="en-GB"/>
         </w:rPr>
-        <w:t>8</w:t>
+        <w:t>9</w:t>
       </w:r>
     </w:p>
     <w:p>
@@ -1352,7 +1325,7 @@
           <w:szCs w:val="22"/>
           <w:lang w:val="en-GB"/>
         </w:rPr>
-        <w:t>8</w:t>
+        <w:t>9</w:t>
       </w:r>
     </w:p>
     <w:p>
@@ -1396,7 +1369,7 @@
           <w:szCs w:val="22"/>
           <w:lang w:val="en-GB"/>
         </w:rPr>
-        <w:t>9</w:t>
+        <w:t>10</w:t>
       </w:r>
     </w:p>
     <w:p>
@@ -1440,7 +1413,7 @@
           <w:szCs w:val="22"/>
           <w:lang w:val="en-GB"/>
         </w:rPr>
-        <w:t>9</w:t>
+        <w:t>10</w:t>
       </w:r>
     </w:p>
     <w:p>
@@ -1484,7 +1457,7 @@
           <w:szCs w:val="22"/>
           <w:lang w:val="en-GB"/>
         </w:rPr>
-        <w:t>10</w:t>
+        <w:t>11</w:t>
       </w:r>
     </w:p>
     <w:p>
@@ -1528,7 +1501,7 @@
           <w:szCs w:val="22"/>
           <w:lang w:val="en-GB"/>
         </w:rPr>
-        <w:t>10</w:t>
+        <w:t>11</w:t>
       </w:r>
     </w:p>
     <w:p>
@@ -1572,7 +1545,7 @@
           <w:szCs w:val="24"/>
           <w:lang w:val="en-GB"/>
         </w:rPr>
-        <w:t>11</w:t>
+        <w:t>12</w:t>
       </w:r>
     </w:p>
     <w:p>
@@ -1616,7 +1589,7 @@
           <w:szCs w:val="22"/>
           <w:lang w:val="en-GB"/>
         </w:rPr>
-        <w:t>11</w:t>
+        <w:t>12</w:t>
       </w:r>
     </w:p>
     <w:p>
@@ -1660,7 +1633,7 @@
           <w:szCs w:val="22"/>
           <w:lang w:val="en-GB"/>
         </w:rPr>
-        <w:t>11</w:t>
+        <w:t>12</w:t>
       </w:r>
     </w:p>
     <w:p>
@@ -1704,7 +1677,7 @@
           <w:szCs w:val="20"/>
           <w:lang w:val="en-GB"/>
         </w:rPr>
-        <w:t>11</w:t>
+        <w:t>12</w:t>
       </w:r>
     </w:p>
     <w:p>
@@ -1758,7 +1731,7 @@
           <w:szCs w:val="20"/>
           <w:lang w:val="en-GB"/>
         </w:rPr>
-        <w:t>2</w:t>
+        <w:t>3</w:t>
       </w:r>
     </w:p>
     <w:p>
@@ -1812,7 +1785,7 @@
           <w:szCs w:val="22"/>
           <w:lang w:val="en-GB"/>
         </w:rPr>
-        <w:t>2</w:t>
+        <w:t>3</w:t>
       </w:r>
     </w:p>
     <w:p>
@@ -1866,7 +1839,7 @@
           <w:szCs w:val="20"/>
           <w:lang w:val="en-GB"/>
         </w:rPr>
-        <w:t>2</w:t>
+        <w:t>3</w:t>
       </w:r>
     </w:p>
     <w:p>
@@ -1920,7 +1893,7 @@
           <w:szCs w:val="20"/>
           <w:lang w:val="en-GB"/>
         </w:rPr>
-        <w:t>3</w:t>
+        <w:t>4</w:t>
       </w:r>
     </w:p>
     <w:p>
@@ -1974,7 +1947,7 @@
           <w:szCs w:val="20"/>
           <w:lang w:val="en-GB"/>
         </w:rPr>
-        <w:t>3</w:t>
+        <w:t>4</w:t>
       </w:r>
     </w:p>
     <w:p>
@@ -2028,7 +2001,7 @@
           <w:szCs w:val="22"/>
           <w:lang w:val="en-GB"/>
         </w:rPr>
-        <w:t>4</w:t>
+        <w:t>5</w:t>
       </w:r>
     </w:p>
     <w:p>
@@ -2082,7 +2055,7 @@
           <w:szCs w:val="22"/>
           <w:lang w:val="en-GB"/>
         </w:rPr>
-        <w:t>4</w:t>
+        <w:t>5</w:t>
       </w:r>
     </w:p>
     <w:p>
@@ -2136,7 +2109,7 @@
           <w:szCs w:val="24"/>
           <w:lang w:val="en-GB"/>
         </w:rPr>
-        <w:t>6</w:t>
+        <w:t>7</w:t>
       </w:r>
     </w:p>
     <w:p>
@@ -2190,7 +2163,7 @@
           <w:szCs w:val="22"/>
           <w:lang w:val="en-GB"/>
         </w:rPr>
-        <w:t>6</w:t>
+        <w:t>7</w:t>
       </w:r>
     </w:p>
     <w:p>
@@ -2244,7 +2217,7 @@
           <w:szCs w:val="22"/>
           <w:lang w:val="en-GB"/>
         </w:rPr>
-        <w:t>6</w:t>
+        <w:t>7</w:t>
       </w:r>
     </w:p>
     <w:p>
@@ -2298,7 +2271,7 @@
           <w:szCs w:val="22"/>
           <w:lang w:val="en-GB"/>
         </w:rPr>
-        <w:t>6</w:t>
+        <w:t>7</w:t>
       </w:r>
     </w:p>
     <w:p>
@@ -2352,7 +2325,7 @@
           <w:szCs w:val="20"/>
           <w:lang w:val="en-GB"/>
         </w:rPr>
-        <w:t>6</w:t>
+        <w:t>7</w:t>
       </w:r>
     </w:p>
     <w:p>
@@ -2406,7 +2379,7 @@
           <w:szCs w:val="20"/>
           <w:lang w:val="en-GB"/>
         </w:rPr>
-        <w:t>7</w:t>
+        <w:t>8</w:t>
       </w:r>
     </w:p>
     <w:p>
@@ -2460,7 +2433,7 @@
           <w:szCs w:val="20"/>
           <w:lang w:val="en-GB"/>
         </w:rPr>
-        <w:t>8</w:t>
+        <w:t>9</w:t>
       </w:r>
     </w:p>
     <w:p>
@@ -2514,7 +2487,7 @@
           <w:szCs w:val="20"/>
           <w:lang w:val="en-GB"/>
         </w:rPr>
-        <w:t>8</w:t>
+        <w:t>9</w:t>
       </w:r>
     </w:p>
     <w:p>
@@ -2568,7 +2541,7 @@
           <w:szCs w:val="22"/>
           <w:lang w:val="en-GB"/>
         </w:rPr>
-        <w:t>8</w:t>
+        <w:t>9</w:t>
       </w:r>
     </w:p>
     <w:p>
@@ -2622,7 +2595,7 @@
           <w:szCs w:val="20"/>
           <w:lang w:val="en-GB"/>
         </w:rPr>
-        <w:t>8</w:t>
+        <w:t>9</w:t>
       </w:r>
     </w:p>
     <w:p>
@@ -2656,16 +2629,6 @@
           <w:szCs w:val="20"/>
         </w:rPr>
         <w:tab/>
-      </w:r>
-      <w:r>
-        <w:rPr>
-          <w:rFonts w:ascii="Times New Roman" w:hAnsi="Times New Roman" w:eastAsia="Times New Roman" w:cs="Times New Roman"/>
-          <w:b w:val="0"/>
-          <w:bCs w:val="0"/>
-          <w:sz w:val="20"/>
-          <w:szCs w:val="20"/>
-        </w:rPr>
-        <w:t>1</w:t>
       </w:r>
       <w:r>
         <w:rPr>
@@ -2676,7 +2639,7 @@
           <w:szCs w:val="20"/>
           <w:lang w:val="en-GB"/>
         </w:rPr>
-        <w:t>9</w:t>
+        <w:t>20</w:t>
       </w:r>
     </w:p>
     <w:p>
@@ -2720,7 +2683,7 @@
           <w:szCs w:val="20"/>
           <w:lang w:val="en-GB"/>
         </w:rPr>
-        <w:t>19</w:t>
+        <w:t>20</w:t>
       </w:r>
     </w:p>
     <w:p>
@@ -2764,7 +2727,7 @@
           <w:szCs w:val="20"/>
           <w:lang w:val="en-GB"/>
         </w:rPr>
-        <w:t>20</w:t>
+        <w:t>21</w:t>
       </w:r>
     </w:p>
     <w:p>
@@ -2808,7 +2771,7 @@
           <w:szCs w:val="22"/>
           <w:lang w:val="en-GB"/>
         </w:rPr>
-        <w:t>20</w:t>
+        <w:t>21</w:t>
       </w:r>
     </w:p>
     <w:p>
@@ -2852,7 +2815,7 @@
           <w:szCs w:val="20"/>
           <w:lang w:val="en-GB"/>
         </w:rPr>
-        <w:t>20</w:t>
+        <w:t>21</w:t>
       </w:r>
     </w:p>
     <w:p>
@@ -2896,7 +2859,7 @@
           <w:szCs w:val="20"/>
           <w:lang w:val="en-GB"/>
         </w:rPr>
-        <w:t>21</w:t>
+        <w:t>22</w:t>
       </w:r>
     </w:p>
     <w:p>
@@ -2940,7 +2903,7 @@
           <w:szCs w:val="20"/>
           <w:lang w:val="en-GB"/>
         </w:rPr>
-        <w:t>21</w:t>
+        <w:t>22</w:t>
       </w:r>
     </w:p>
     <w:p>
@@ -2984,7 +2947,7 @@
           <w:szCs w:val="22"/>
           <w:lang w:val="en-GB"/>
         </w:rPr>
-        <w:t>22</w:t>
+        <w:t>23</w:t>
       </w:r>
     </w:p>
     <w:p>
@@ -3038,7 +3001,7 @@
           <w:szCs w:val="22"/>
           <w:lang w:val="en-GB"/>
         </w:rPr>
-        <w:t>2</w:t>
+        <w:t>3</w:t>
       </w:r>
     </w:p>
     <w:p>
@@ -3092,7 +3055,7 @@
           <w:szCs w:val="22"/>
           <w:lang w:val="en-GB"/>
         </w:rPr>
-        <w:t>2</w:t>
+        <w:t>3</w:t>
       </w:r>
     </w:p>
     <w:p>
@@ -3146,7 +3109,7 @@
           <w:szCs w:val="24"/>
           <w:lang w:val="en-GB"/>
         </w:rPr>
-        <w:t>4</w:t>
+        <w:t>5</w:t>
       </w:r>
     </w:p>
     <w:p>
@@ -3200,7 +3163,7 @@
           <w:szCs w:val="22"/>
           <w:lang w:val="en-GB"/>
         </w:rPr>
-        <w:t>4</w:t>
+        <w:t>5</w:t>
       </w:r>
     </w:p>
     <w:p>
@@ -3254,7 +3217,7 @@
           <w:szCs w:val="22"/>
           <w:lang w:val="en-GB"/>
         </w:rPr>
-        <w:t>4</w:t>
+        <w:t>5</w:t>
       </w:r>
     </w:p>
     <w:p>
@@ -3308,7 +3271,7 @@
           <w:szCs w:val="22"/>
           <w:lang w:val="en-GB"/>
         </w:rPr>
-        <w:t>5</w:t>
+        <w:t>6</w:t>
       </w:r>
     </w:p>
     <w:p>
@@ -3362,7 +3325,7 @@
           <w:szCs w:val="20"/>
           <w:lang w:val="en-GB"/>
         </w:rPr>
-        <w:t>5</w:t>
+        <w:t>6</w:t>
       </w:r>
     </w:p>
     <w:p>
@@ -3535,7 +3498,7 @@
           <w:szCs w:val="20"/>
           <w:lang w:val="en-GB"/>
         </w:rPr>
-        <w:t>6</w:t>
+        <w:t>7</w:t>
       </w:r>
     </w:p>
     <w:p>
@@ -3816,7 +3779,7 @@
           <w:szCs w:val="20"/>
           <w:lang w:val="en-GB"/>
         </w:rPr>
-        <w:t>8</w:t>
+        <w:t>7</w:t>
       </w:r>
     </w:p>
     <w:p>
@@ -4054,7 +4017,7 @@
           <w:szCs w:val="20"/>
           <w:lang w:val="en-GB"/>
         </w:rPr>
-        <w:t>30</w:t>
+        <w:t>28</w:t>
       </w:r>
     </w:p>
     <w:p>
@@ -4098,7 +4061,7 @@
           <w:szCs w:val="20"/>
           <w:lang w:val="en-GB"/>
         </w:rPr>
-        <w:t>30</w:t>
+        <w:t>28</w:t>
       </w:r>
     </w:p>
     <w:p>
@@ -4142,7 +4105,7 @@
           <w:szCs w:val="22"/>
           <w:lang w:val="en-GB"/>
         </w:rPr>
-        <w:t>30</w:t>
+        <w:t>29</w:t>
       </w:r>
     </w:p>
     <w:p>
@@ -4186,7 +4149,7 @@
           <w:szCs w:val="24"/>
           <w:lang w:val="en-GB"/>
         </w:rPr>
-        <w:t>32</w:t>
+        <w:t>30</w:t>
       </w:r>
     </w:p>
     <w:p>
@@ -4230,7 +4193,7 @@
           <w:szCs w:val="22"/>
           <w:lang w:val="en-GB"/>
         </w:rPr>
-        <w:t>32</w:t>
+        <w:t>30</w:t>
       </w:r>
     </w:p>
     <w:p>
@@ -4284,7 +4247,7 @@
           <w:szCs w:val="22"/>
           <w:lang w:val="en-GB"/>
         </w:rPr>
-        <w:t>2</w:t>
+        <w:t>0</w:t>
       </w:r>
     </w:p>
     <w:p>
@@ -4338,7 +4301,7 @@
           <w:szCs w:val="20"/>
           <w:lang w:val="en-GB"/>
         </w:rPr>
-        <w:t>2</w:t>
+        <w:t>0</w:t>
       </w:r>
     </w:p>
     <w:p>
@@ -4392,7 +4355,7 @@
           <w:szCs w:val="20"/>
           <w:lang w:val="en-GB"/>
         </w:rPr>
-        <w:t>3</w:t>
+        <w:t>1</w:t>
       </w:r>
     </w:p>
     <w:p>
@@ -4446,7 +4409,7 @@
           <w:szCs w:val="22"/>
           <w:lang w:val="en-GB"/>
         </w:rPr>
-        <w:t>4</w:t>
+        <w:t>2</w:t>
       </w:r>
     </w:p>
     <w:p>
@@ -4504,7 +4467,7 @@
           <w:szCs w:val="20"/>
           <w:lang w:val="en-GB"/>
         </w:rPr>
-        <w:t>4</w:t>
+        <w:t>2</w:t>
       </w:r>
     </w:p>
     <w:p>
@@ -4532,7 +4495,7 @@
           <w:szCs w:val="20"/>
           <w:lang w:val="en-GB"/>
         </w:rPr>
-        <w:t>5.3.2   Random Forest Detailed Results                                                                                         34</w:t>
+        <w:t>5.3.2   Random Forest Detailed Results                                                                                         32</w:t>
       </w:r>
       <w:r>
         <w:rPr>
@@ -4597,7 +4560,7 @@
           <w:szCs w:val="20"/>
           <w:lang w:val="en-GB"/>
         </w:rPr>
-        <w:t>5</w:t>
+        <w:t>3</w:t>
       </w:r>
     </w:p>
     <w:p>
@@ -4651,7 +4614,7 @@
           <w:szCs w:val="22"/>
           <w:lang w:val="en-GB"/>
         </w:rPr>
-        <w:t>6</w:t>
+        <w:t>4</w:t>
       </w:r>
     </w:p>
     <w:p>
@@ -4705,7 +4668,7 @@
           <w:szCs w:val="20"/>
           <w:lang w:val="en-GB"/>
         </w:rPr>
-        <w:t>6</w:t>
+        <w:t>4</w:t>
       </w:r>
     </w:p>
     <w:p>
@@ -4759,7 +4722,7 @@
           <w:szCs w:val="20"/>
           <w:lang w:val="en-GB"/>
         </w:rPr>
-        <w:t>6</w:t>
+        <w:t>4</w:t>
       </w:r>
     </w:p>
     <w:p>
@@ -4813,7 +4776,7 @@
           <w:szCs w:val="22"/>
           <w:lang w:val="en-GB"/>
         </w:rPr>
-        <w:t>7</w:t>
+        <w:t>5</w:t>
       </w:r>
     </w:p>
     <w:p>
@@ -4867,7 +4830,7 @@
           <w:szCs w:val="24"/>
           <w:lang w:val="en-GB"/>
         </w:rPr>
-        <w:t>9</w:t>
+        <w:t>7</w:t>
       </w:r>
     </w:p>
     <w:p>
@@ -4921,7 +4884,7 @@
           <w:szCs w:val="22"/>
           <w:lang w:val="en-GB"/>
         </w:rPr>
-        <w:t>9</w:t>
+        <w:t>7</w:t>
       </w:r>
     </w:p>
     <w:p>
@@ -4975,7 +4938,7 @@
           <w:szCs w:val="22"/>
           <w:lang w:val="en-GB"/>
         </w:rPr>
-        <w:t>9</w:t>
+        <w:t>7</w:t>
       </w:r>
     </w:p>
     <w:p>
@@ -5029,7 +4992,7 @@
           <w:szCs w:val="20"/>
           <w:lang w:val="en-GB"/>
         </w:rPr>
-        <w:t>9</w:t>
+        <w:t>7</w:t>
       </w:r>
     </w:p>
     <w:p>
@@ -5073,7 +5036,7 @@
           <w:szCs w:val="20"/>
           <w:lang w:val="en-GB"/>
         </w:rPr>
-        <w:t>40</w:t>
+        <w:t>38</w:t>
       </w:r>
     </w:p>
     <w:p>
@@ -5117,7 +5080,7 @@
           <w:szCs w:val="22"/>
           <w:lang w:val="en-GB"/>
         </w:rPr>
-        <w:t>40</w:t>
+        <w:t>38</w:t>
       </w:r>
     </w:p>
     <w:p>
@@ -5161,7 +5124,7 @@
           <w:szCs w:val="20"/>
           <w:lang w:val="en-GB"/>
         </w:rPr>
-        <w:t>40</w:t>
+        <w:t>38</w:t>
       </w:r>
     </w:p>
     <w:p>
@@ -5205,7 +5168,7 @@
           <w:szCs w:val="20"/>
           <w:lang w:val="en-GB"/>
         </w:rPr>
-        <w:t>40</w:t>
+        <w:t>38</w:t>
       </w:r>
     </w:p>
     <w:p>
@@ -5249,7 +5212,7 @@
           <w:szCs w:val="20"/>
           <w:lang w:val="en-GB"/>
         </w:rPr>
-        <w:t>41</w:t>
+        <w:t>39</w:t>
       </w:r>
     </w:p>
     <w:p>
@@ -5293,7 +5256,7 @@
           <w:szCs w:val="20"/>
           <w:lang w:val="en-GB"/>
         </w:rPr>
-        <w:t>41</w:t>
+        <w:t>39</w:t>
       </w:r>
     </w:p>
     <w:p>
@@ -5337,7 +5300,7 @@
           <w:szCs w:val="22"/>
           <w:lang w:val="en-GB"/>
         </w:rPr>
-        <w:t>41</w:t>
+        <w:t>39</w:t>
       </w:r>
     </w:p>
     <w:p>
@@ -5381,7 +5344,7 @@
           <w:szCs w:val="22"/>
           <w:lang w:val="en-GB"/>
         </w:rPr>
-        <w:t>41</w:t>
+        <w:t>39</w:t>
       </w:r>
     </w:p>
     <w:p>
@@ -5435,7 +5398,7 @@
           <w:szCs w:val="24"/>
           <w:lang w:val="en-GB"/>
         </w:rPr>
-        <w:t>3</w:t>
+        <w:t>1</w:t>
       </w:r>
     </w:p>
     <w:p>
@@ -5489,7 +5452,7 @@
           <w:szCs w:val="22"/>
           <w:lang w:val="en-GB"/>
         </w:rPr>
-        <w:t>3</w:t>
+        <w:t>1</w:t>
       </w:r>
     </w:p>
     <w:p>
@@ -5543,7 +5506,7 @@
           <w:szCs w:val="22"/>
           <w:lang w:val="en-GB"/>
         </w:rPr>
-        <w:t>3</w:t>
+        <w:t>1</w:t>
       </w:r>
     </w:p>
     <w:p>
@@ -5597,7 +5560,7 @@
           <w:szCs w:val="22"/>
           <w:lang w:val="en-GB"/>
         </w:rPr>
-        <w:t>3</w:t>
+        <w:t>1</w:t>
       </w:r>
     </w:p>
     <w:p>
@@ -5651,7 +5614,7 @@
           <w:szCs w:val="20"/>
           <w:lang w:val="en-GB"/>
         </w:rPr>
-        <w:t>3</w:t>
+        <w:t>1</w:t>
       </w:r>
     </w:p>
     <w:p>
@@ -5705,7 +5668,7 @@
           <w:szCs w:val="20"/>
           <w:lang w:val="en-GB"/>
         </w:rPr>
-        <w:t>4</w:t>
+        <w:t>2</w:t>
       </w:r>
     </w:p>
     <w:p>
@@ -5759,7 +5722,7 @@
           <w:szCs w:val="20"/>
           <w:lang w:val="en-GB"/>
         </w:rPr>
-        <w:t>4</w:t>
+        <w:t>2</w:t>
       </w:r>
     </w:p>
     <w:p>
@@ -5813,7 +5776,7 @@
           <w:szCs w:val="20"/>
           <w:lang w:val="en-GB"/>
         </w:rPr>
-        <w:t>4</w:t>
+        <w:t>2</w:t>
       </w:r>
     </w:p>
     <w:p>
@@ -5867,7 +5830,7 @@
           <w:szCs w:val="20"/>
           <w:lang w:val="en-GB"/>
         </w:rPr>
-        <w:t>4</w:t>
+        <w:t>2</w:t>
       </w:r>
     </w:p>
     <w:p>
@@ -5921,7 +5884,7 @@
           <w:szCs w:val="22"/>
           <w:lang w:val="en-GB"/>
         </w:rPr>
-        <w:t>4</w:t>
+        <w:t>3</w:t>
       </w:r>
     </w:p>
     <w:p>
@@ -5975,7 +5938,7 @@
           <w:szCs w:val="24"/>
           <w:lang w:val="en-GB"/>
         </w:rPr>
-        <w:t>6</w:t>
+        <w:t>4</w:t>
       </w:r>
     </w:p>
     <w:p>
@@ -6029,7 +5992,7 @@
           <w:szCs w:val="24"/>
           <w:lang w:val="en-GB"/>
         </w:rPr>
-        <w:t>7</w:t>
+        <w:t>5</w:t>
       </w:r>
     </w:p>
     <w:p>
@@ -6083,7 +6046,7 @@
           <w:szCs w:val="22"/>
           <w:lang w:val="en-GB"/>
         </w:rPr>
-        <w:t>7</w:t>
+        <w:t>5</w:t>
       </w:r>
     </w:p>
     <w:p>
@@ -6127,7 +6090,7 @@
           <w:szCs w:val="22"/>
           <w:lang w:val="en-GB"/>
         </w:rPr>
-        <w:t>52</w:t>
+        <w:t>50</w:t>
       </w:r>
     </w:p>
     <w:p>
@@ -6181,7 +6144,7 @@
           <w:szCs w:val="22"/>
           <w:lang w:val="en-GB"/>
         </w:rPr>
-        <w:t>3</w:t>
+        <w:t>1</w:t>
       </w:r>
     </w:p>
     <w:p>
@@ -6235,15 +6198,13 @@
           <w:szCs w:val="22"/>
           <w:lang w:val="en-GB"/>
         </w:rPr>
-        <w:t>5</w:t>
+        <w:t>3</w:t>
       </w:r>
     </w:p>
     <w:p>
       <w:pPr>
         <w:spacing w:before="400" w:after="200"/>
         <w:jc w:val="center"/>
-      </w:pPr>
-      <w:r>
         <w:rPr>
           <w:rFonts w:ascii="Times New Roman" w:hAnsi="Times New Roman" w:eastAsia="Times New Roman" w:cs="Times New Roman"/>
           <w:b/>
@@ -6251,6 +6212,47 @@
           <w:sz w:val="28"/>
           <w:szCs w:val="28"/>
         </w:rPr>
+      </w:pPr>
+    </w:p>
+    <w:p>
+      <w:pPr>
+        <w:spacing w:before="400" w:after="200"/>
+        <w:jc w:val="center"/>
+        <w:rPr>
+          <w:rFonts w:ascii="Times New Roman" w:hAnsi="Times New Roman" w:eastAsia="Times New Roman" w:cs="Times New Roman"/>
+          <w:b/>
+          <w:bCs/>
+          <w:sz w:val="28"/>
+          <w:szCs w:val="28"/>
+        </w:rPr>
+      </w:pPr>
+    </w:p>
+    <w:p>
+      <w:pPr>
+        <w:spacing w:before="400" w:after="200"/>
+        <w:jc w:val="center"/>
+        <w:rPr>
+          <w:rFonts w:ascii="Times New Roman" w:hAnsi="Times New Roman" w:eastAsia="Times New Roman" w:cs="Times New Roman"/>
+          <w:b/>
+          <w:bCs/>
+          <w:sz w:val="28"/>
+          <w:szCs w:val="28"/>
+        </w:rPr>
+      </w:pPr>
+    </w:p>
+    <w:p>
+      <w:pPr>
+        <w:spacing w:before="400" w:after="200"/>
+        <w:jc w:val="center"/>
+      </w:pPr>
+      <w:r>
+        <w:rPr>
+          <w:rFonts w:ascii="Times New Roman" w:hAnsi="Times New Roman" w:eastAsia="Times New Roman" w:cs="Times New Roman"/>
+          <w:b/>
+          <w:bCs/>
+          <w:sz w:val="28"/>
+          <w:szCs w:val="28"/>
+        </w:rPr>
         <w:t>Table of Figures</w:t>
       </w:r>
     </w:p>
@@ -6297,7 +6299,7 @@
           <w:szCs w:val="22"/>
           <w:lang w:val="en-GB"/>
         </w:rPr>
-        <w:t>3</w:t>
+        <w:t>1</w:t>
       </w:r>
     </w:p>
     <w:p>
@@ -6343,7 +6345,7 @@
           <w:szCs w:val="22"/>
           <w:lang w:val="en-GB"/>
         </w:rPr>
-        <w:t>4</w:t>
+        <w:t>2</w:t>
       </w:r>
     </w:p>
     <w:p>
@@ -6389,7 +6391,7 @@
           <w:szCs w:val="22"/>
           <w:lang w:val="en-GB"/>
         </w:rPr>
-        <w:t>5</w:t>
+        <w:t>3</w:t>
       </w:r>
     </w:p>
     <w:p>
@@ -6435,7 +6437,7 @@
           <w:szCs w:val="22"/>
           <w:lang w:val="en-GB"/>
         </w:rPr>
-        <w:t>5</w:t>
+        <w:t>3</w:t>
       </w:r>
     </w:p>
     <w:p>
@@ -7016,18 +7018,6 @@
         <w:pStyle w:val="2"/>
         <w:spacing w:before="400" w:after="160"/>
         <w:jc w:val="both"/>
-        <w:rPr>
-          <w:rFonts w:hint="default" w:ascii="Times New Roman" w:hAnsi="Times New Roman" w:eastAsia="Arial" w:cs="Times New Roman"/>
-          <w:b/>
-          <w:bCs/>
-          <w:color w:val="auto"/>
-          <w:sz w:val="36"/>
-          <w:szCs w:val="36"/>
-        </w:rPr>
-      </w:pPr>
-    </w:p>
-    <w:p>
-      <w:pPr>
         <w:rPr>
           <w:rFonts w:hint="default" w:ascii="Times New Roman" w:hAnsi="Times New Roman" w:eastAsia="Arial" w:cs="Times New Roman"/>
           <w:b/>
@@ -17132,6 +17122,11 @@
         <w:spacing w:before="300" w:after="120"/>
         <w:jc w:val="both"/>
         <w:rPr>
+          <w:rFonts w:hint="default"/>
+        </w:rPr>
+      </w:pPr>
+      <w:r>
+        <w:rPr>
           <w:rFonts w:hint="default" w:ascii="Times New Roman" w:hAnsi="Times New Roman" w:eastAsia="Arial" w:cs="Times New Roman"/>
           <w:b/>
           <w:bCs/>
@@ -17139,382 +17134,8 @@
           <w:sz w:val="28"/>
           <w:szCs w:val="28"/>
         </w:rPr>
-      </w:pPr>
-      <w:r>
-        <w:rPr>
-          <w:rFonts w:hint="default" w:ascii="Times New Roman" w:hAnsi="Times New Roman" w:eastAsia="Arial" w:cs="Times New Roman"/>
-          <w:b/>
-          <w:bCs/>
-          <w:color w:val="auto"/>
-          <w:sz w:val="28"/>
-          <w:szCs w:val="28"/>
-        </w:rPr>
         <w:t>4.2 Data Preparation Implementation</w:t>
       </w:r>
-    </w:p>
-    <w:tbl>
-      <w:tblPr>
-        <w:tblStyle w:val="16"/>
-        <w:tblW w:w="0" w:type="auto"/>
-        <w:tblInd w:w="0" w:type="dxa"/>
-        <w:tblBorders>
-          <w:top w:val="single" w:color="auto" w:sz="4" w:space="0"/>
-          <w:left w:val="single" w:color="auto" w:sz="4" w:space="0"/>
-          <w:bottom w:val="single" w:color="auto" w:sz="4" w:space="0"/>
-          <w:right w:val="single" w:color="auto" w:sz="4" w:space="0"/>
-          <w:insideH w:val="single" w:color="auto" w:sz="4" w:space="0"/>
-          <w:insideV w:val="single" w:color="auto" w:sz="4" w:space="0"/>
-        </w:tblBorders>
-        <w:tblLayout w:type="autofit"/>
-        <w:tblCellMar>
-          <w:top w:w="0" w:type="dxa"/>
-          <w:left w:w="108" w:type="dxa"/>
-          <w:bottom w:w="0" w:type="dxa"/>
-          <w:right w:w="108" w:type="dxa"/>
-        </w:tblCellMar>
-      </w:tblPr>
-      <w:tblGrid>
-        <w:gridCol w:w="9576"/>
-      </w:tblGrid>
-      <w:tr>
-        <w:tblPrEx>
-          <w:tblBorders>
-            <w:top w:val="single" w:color="auto" w:sz="4" w:space="0"/>
-            <w:left w:val="single" w:color="auto" w:sz="4" w:space="0"/>
-            <w:bottom w:val="single" w:color="auto" w:sz="4" w:space="0"/>
-            <w:right w:val="single" w:color="auto" w:sz="4" w:space="0"/>
-            <w:insideH w:val="single" w:color="auto" w:sz="4" w:space="0"/>
-            <w:insideV w:val="single" w:color="auto" w:sz="4" w:space="0"/>
-          </w:tblBorders>
-          <w:tblCellMar>
-            <w:top w:w="0" w:type="dxa"/>
-            <w:left w:w="108" w:type="dxa"/>
-            <w:bottom w:w="0" w:type="dxa"/>
-            <w:right w:w="108" w:type="dxa"/>
-          </w:tblCellMar>
-        </w:tblPrEx>
-        <w:tc>
-          <w:tcPr>
-            <w:tcW w:w="9576" w:type="dxa"/>
-          </w:tcPr>
-          <w:p>
-            <w:pPr>
-              <w:widowControl w:val="0"/>
-              <w:jc w:val="both"/>
-              <w:rPr>
-                <w:rFonts w:hint="default" w:ascii="Times New Roman" w:hAnsi="Times New Roman" w:cs="Times New Roman"/>
-                <w:sz w:val="20"/>
-                <w:szCs w:val="20"/>
-                <w:vertAlign w:val="baseline"/>
-              </w:rPr>
-            </w:pPr>
-            <w:r>
-              <w:rPr>
-                <w:rFonts w:hint="default" w:ascii="Times New Roman" w:hAnsi="Times New Roman" w:eastAsia="SimSun" w:cs="Times New Roman"/>
-                <w:sz w:val="20"/>
-                <w:szCs w:val="20"/>
-              </w:rPr>
-              <w:t xml:space="preserve">def </w:t>
-            </w:r>
-            <w:r>
-              <w:rPr>
-                <w:rFonts w:hint="default" w:ascii="Times New Roman" w:hAnsi="Times New Roman" w:eastAsia="SimSun" w:cs="Times New Roman"/>
-                <w:sz w:val="20"/>
-                <w:szCs w:val="20"/>
-                <w:lang w:val="en-GB"/>
-              </w:rPr>
-              <w:t xml:space="preserve"> </w:t>
-            </w:r>
-            <w:r>
-              <w:rPr>
-                <w:rFonts w:hint="default" w:ascii="Times New Roman" w:hAnsi="Times New Roman" w:eastAsia="SimSun" w:cs="Times New Roman"/>
-                <w:sz w:val="20"/>
-                <w:szCs w:val="20"/>
-              </w:rPr>
-              <w:t>load_raw_data(self, filepath):</w:t>
-            </w:r>
-            <w:r>
-              <w:rPr>
-                <w:rFonts w:hint="default" w:ascii="Times New Roman" w:hAnsi="Times New Roman" w:eastAsia="SimSun" w:cs="Times New Roman"/>
-                <w:sz w:val="20"/>
-                <w:szCs w:val="20"/>
-              </w:rPr>
-              <w:br w:type="textWrapping"/>
-            </w:r>
-            <w:r>
-              <w:rPr>
-                <w:rFonts w:hint="default" w:ascii="Times New Roman" w:hAnsi="Times New Roman" w:eastAsia="SimSun" w:cs="Times New Roman"/>
-                <w:sz w:val="20"/>
-                <w:szCs w:val="20"/>
-              </w:rPr>
-              <w:t># Load dataset</w:t>
-            </w:r>
-            <w:r>
-              <w:rPr>
-                <w:rFonts w:hint="default" w:ascii="Times New Roman" w:hAnsi="Times New Roman" w:eastAsia="SimSun" w:cs="Times New Roman"/>
-                <w:sz w:val="20"/>
-                <w:szCs w:val="20"/>
-              </w:rPr>
-              <w:br w:type="textWrapping"/>
-            </w:r>
-            <w:r>
-              <w:rPr>
-                <w:rFonts w:hint="default" w:ascii="Times New Roman" w:hAnsi="Times New Roman" w:eastAsia="SimSun" w:cs="Times New Roman"/>
-                <w:sz w:val="20"/>
-                <w:szCs w:val="20"/>
-              </w:rPr>
-              <w:t>df = pd.read_csv(filepath)</w:t>
-            </w:r>
-            <w:r>
-              <w:rPr>
-                <w:rFonts w:hint="default" w:ascii="Times New Roman" w:hAnsi="Times New Roman" w:eastAsia="SimSun" w:cs="Times New Roman"/>
-                <w:sz w:val="20"/>
-                <w:szCs w:val="20"/>
-              </w:rPr>
-              <w:br w:type="textWrapping"/>
-            </w:r>
-            <w:r>
-              <w:rPr>
-                <w:rFonts w:hint="default" w:ascii="Times New Roman" w:hAnsi="Times New Roman" w:eastAsia="SimSun" w:cs="Times New Roman"/>
-                <w:sz w:val="20"/>
-                <w:szCs w:val="20"/>
-              </w:rPr>
-              <w:br w:type="textWrapping"/>
-            </w:r>
-            <w:r>
-              <w:rPr>
-                <w:rFonts w:hint="default" w:ascii="Times New Roman" w:hAnsi="Times New Roman" w:eastAsia="SimSun" w:cs="Times New Roman"/>
-                <w:sz w:val="20"/>
-                <w:szCs w:val="20"/>
-              </w:rPr>
-              <w:t># Standardize column names</w:t>
-            </w:r>
-            <w:r>
-              <w:rPr>
-                <w:rFonts w:hint="default" w:ascii="Times New Roman" w:hAnsi="Times New Roman" w:eastAsia="SimSun" w:cs="Times New Roman"/>
-                <w:sz w:val="20"/>
-                <w:szCs w:val="20"/>
-              </w:rPr>
-              <w:br w:type="textWrapping"/>
-            </w:r>
-            <w:r>
-              <w:rPr>
-                <w:rFonts w:hint="default" w:ascii="Times New Roman" w:hAnsi="Times New Roman" w:eastAsia="SimSun" w:cs="Times New Roman"/>
-                <w:sz w:val="20"/>
-                <w:szCs w:val="20"/>
-              </w:rPr>
-              <w:t>df.columns = df.columns.str.lower().str.strip()</w:t>
-            </w:r>
-            <w:r>
-              <w:rPr>
-                <w:rFonts w:hint="default" w:ascii="Times New Roman" w:hAnsi="Times New Roman" w:eastAsia="SimSun" w:cs="Times New Roman"/>
-                <w:sz w:val="20"/>
-                <w:szCs w:val="20"/>
-              </w:rPr>
-              <w:br w:type="textWrapping"/>
-            </w:r>
-            <w:r>
-              <w:rPr>
-                <w:rFonts w:hint="default" w:ascii="Times New Roman" w:hAnsi="Times New Roman" w:eastAsia="SimSun" w:cs="Times New Roman"/>
-                <w:sz w:val="20"/>
-                <w:szCs w:val="20"/>
-              </w:rPr>
-              <w:br w:type="textWrapping"/>
-            </w:r>
-            <w:r>
-              <w:rPr>
-                <w:rFonts w:hint="default" w:ascii="Times New Roman" w:hAnsi="Times New Roman" w:eastAsia="SimSun" w:cs="Times New Roman"/>
-                <w:sz w:val="20"/>
-                <w:szCs w:val="20"/>
-              </w:rPr>
-              <w:t># Convert different label formats to binary label</w:t>
-            </w:r>
-            <w:r>
-              <w:rPr>
-                <w:rFonts w:hint="default" w:ascii="Times New Roman" w:hAnsi="Times New Roman" w:eastAsia="SimSun" w:cs="Times New Roman"/>
-                <w:sz w:val="20"/>
-                <w:szCs w:val="20"/>
-              </w:rPr>
-              <w:br w:type="textWrapping"/>
-            </w:r>
-            <w:r>
-              <w:rPr>
-                <w:rFonts w:hint="default" w:ascii="Times New Roman" w:hAnsi="Times New Roman" w:eastAsia="SimSun" w:cs="Times New Roman"/>
-                <w:sz w:val="20"/>
-                <w:szCs w:val="20"/>
-              </w:rPr>
-              <w:t>if 'status' in df.columns:</w:t>
-            </w:r>
-            <w:r>
-              <w:rPr>
-                <w:rFonts w:hint="default" w:ascii="Times New Roman" w:hAnsi="Times New Roman" w:eastAsia="SimSun" w:cs="Times New Roman"/>
-                <w:sz w:val="20"/>
-                <w:szCs w:val="20"/>
-              </w:rPr>
-              <w:br w:type="textWrapping"/>
-            </w:r>
-            <w:r>
-              <w:rPr>
-                <w:rFonts w:hint="default" w:ascii="Times New Roman" w:hAnsi="Times New Roman" w:eastAsia="SimSun" w:cs="Times New Roman"/>
-                <w:sz w:val="20"/>
-                <w:szCs w:val="20"/>
-              </w:rPr>
-              <w:t>df['label'] = df['status'].apply(</w:t>
-            </w:r>
-            <w:r>
-              <w:rPr>
-                <w:rFonts w:hint="default" w:ascii="Times New Roman" w:hAnsi="Times New Roman" w:eastAsia="SimSun" w:cs="Times New Roman"/>
-                <w:sz w:val="20"/>
-                <w:szCs w:val="20"/>
-              </w:rPr>
-              <w:br w:type="textWrapping"/>
-            </w:r>
-            <w:r>
-              <w:rPr>
-                <w:rFonts w:hint="default" w:ascii="Times New Roman" w:hAnsi="Times New Roman" w:eastAsia="SimSun" w:cs="Times New Roman"/>
-                <w:sz w:val="20"/>
-                <w:szCs w:val="20"/>
-              </w:rPr>
-              <w:t>lambda x: 1 if str(x).lower() in ['phishing', 'malicious'] else 0</w:t>
-            </w:r>
-            <w:r>
-              <w:rPr>
-                <w:rFonts w:hint="default" w:ascii="Times New Roman" w:hAnsi="Times New Roman" w:eastAsia="SimSun" w:cs="Times New Roman"/>
-                <w:sz w:val="20"/>
-                <w:szCs w:val="20"/>
-              </w:rPr>
-              <w:br w:type="textWrapping"/>
-            </w:r>
-            <w:r>
-              <w:rPr>
-                <w:rFonts w:hint="default" w:ascii="Times New Roman" w:hAnsi="Times New Roman" w:eastAsia="SimSun" w:cs="Times New Roman"/>
-                <w:sz w:val="20"/>
-                <w:szCs w:val="20"/>
-              </w:rPr>
-              <w:t>)</w:t>
-            </w:r>
-            <w:r>
-              <w:rPr>
-                <w:rFonts w:hint="default" w:ascii="Times New Roman" w:hAnsi="Times New Roman" w:eastAsia="SimSun" w:cs="Times New Roman"/>
-                <w:sz w:val="20"/>
-                <w:szCs w:val="20"/>
-              </w:rPr>
-              <w:br w:type="textWrapping"/>
-            </w:r>
-            <w:r>
-              <w:rPr>
-                <w:rFonts w:hint="default" w:ascii="Times New Roman" w:hAnsi="Times New Roman" w:eastAsia="SimSun" w:cs="Times New Roman"/>
-                <w:sz w:val="20"/>
-                <w:szCs w:val="20"/>
-              </w:rPr>
-              <w:t># Ensure required columns exist</w:t>
-            </w:r>
-            <w:r>
-              <w:rPr>
-                <w:rFonts w:hint="default" w:ascii="Times New Roman" w:hAnsi="Times New Roman" w:eastAsia="SimSun" w:cs="Times New Roman"/>
-                <w:sz w:val="20"/>
-                <w:szCs w:val="20"/>
-              </w:rPr>
-              <w:br w:type="textWrapping"/>
-            </w:r>
-            <w:r>
-              <w:rPr>
-                <w:rFonts w:hint="default" w:ascii="Times New Roman" w:hAnsi="Times New Roman" w:eastAsia="SimSun" w:cs="Times New Roman"/>
-                <w:sz w:val="20"/>
-                <w:szCs w:val="20"/>
-              </w:rPr>
-              <w:t>if 'url' not in df.columns:</w:t>
-            </w:r>
-            <w:r>
-              <w:rPr>
-                <w:rFonts w:hint="default" w:ascii="Times New Roman" w:hAnsi="Times New Roman" w:eastAsia="SimSun" w:cs="Times New Roman"/>
-                <w:sz w:val="20"/>
-                <w:szCs w:val="20"/>
-              </w:rPr>
-              <w:br w:type="textWrapping"/>
-            </w:r>
-            <w:r>
-              <w:rPr>
-                <w:rFonts w:hint="default" w:ascii="Times New Roman" w:hAnsi="Times New Roman" w:eastAsia="SimSun" w:cs="Times New Roman"/>
-                <w:sz w:val="20"/>
-                <w:szCs w:val="20"/>
-              </w:rPr>
-              <w:t>raise ValueError("Dataset must contain a URL column")</w:t>
-            </w:r>
-            <w:r>
-              <w:rPr>
-                <w:rFonts w:hint="default" w:ascii="Times New Roman" w:hAnsi="Times New Roman" w:eastAsia="SimSun" w:cs="Times New Roman"/>
-                <w:sz w:val="20"/>
-                <w:szCs w:val="20"/>
-              </w:rPr>
-              <w:br w:type="textWrapping"/>
-            </w:r>
-            <w:r>
-              <w:rPr>
-                <w:rFonts w:hint="default" w:ascii="Times New Roman" w:hAnsi="Times New Roman" w:eastAsia="SimSun" w:cs="Times New Roman"/>
-                <w:sz w:val="20"/>
-                <w:szCs w:val="20"/>
-              </w:rPr>
-              <w:br w:type="textWrapping"/>
-            </w:r>
-            <w:r>
-              <w:rPr>
-                <w:rFonts w:hint="default" w:ascii="Times New Roman" w:hAnsi="Times New Roman" w:eastAsia="SimSun" w:cs="Times New Roman"/>
-                <w:sz w:val="20"/>
-                <w:szCs w:val="20"/>
-              </w:rPr>
-              <w:t># Keep only valid labels</w:t>
-            </w:r>
-            <w:r>
-              <w:rPr>
-                <w:rFonts w:hint="default" w:ascii="Times New Roman" w:hAnsi="Times New Roman" w:eastAsia="SimSun" w:cs="Times New Roman"/>
-                <w:sz w:val="20"/>
-                <w:szCs w:val="20"/>
-              </w:rPr>
-              <w:br w:type="textWrapping"/>
-            </w:r>
-            <w:r>
-              <w:rPr>
-                <w:rFonts w:hint="default" w:ascii="Times New Roman" w:hAnsi="Times New Roman" w:eastAsia="SimSun" w:cs="Times New Roman"/>
-                <w:sz w:val="20"/>
-                <w:szCs w:val="20"/>
-              </w:rPr>
-              <w:t>df = df[df['label'].isin([0, 1])]</w:t>
-            </w:r>
-            <w:r>
-              <w:rPr>
-                <w:rFonts w:hint="default" w:ascii="Times New Roman" w:hAnsi="Times New Roman" w:eastAsia="SimSun" w:cs="Times New Roman"/>
-                <w:sz w:val="20"/>
-                <w:szCs w:val="20"/>
-              </w:rPr>
-              <w:br w:type="textWrapping"/>
-            </w:r>
-            <w:r>
-              <w:rPr>
-                <w:rFonts w:hint="default" w:ascii="Times New Roman" w:hAnsi="Times New Roman" w:eastAsia="SimSun" w:cs="Times New Roman"/>
-                <w:sz w:val="20"/>
-                <w:szCs w:val="20"/>
-              </w:rPr>
-              <w:br w:type="textWrapping"/>
-            </w:r>
-            <w:r>
-              <w:rPr>
-                <w:rFonts w:hint="default" w:ascii="Times New Roman" w:hAnsi="Times New Roman" w:eastAsia="SimSun" w:cs="Times New Roman"/>
-                <w:sz w:val="20"/>
-                <w:szCs w:val="20"/>
-              </w:rPr>
-              <w:t>return df</w:t>
-            </w:r>
-          </w:p>
-        </w:tc>
-      </w:tr>
-    </w:tbl>
-    <w:p>
-      <w:pPr>
-        <w:rPr>
-          <w:rFonts w:hint="default"/>
-        </w:rPr>
-      </w:pPr>
     </w:p>
     <w:p>
       <w:pPr>
@@ -17594,306 +17215,6 @@
         <w:t>4.3 Feature Extraction System</w:t>
       </w:r>
     </w:p>
-    <w:tbl>
-      <w:tblPr>
-        <w:tblStyle w:val="16"/>
-        <w:tblW w:w="8973" w:type="dxa"/>
-        <w:tblInd w:w="275" w:type="dxa"/>
-        <w:tblBorders>
-          <w:top w:val="single" w:color="auto" w:sz="4" w:space="0"/>
-          <w:left w:val="single" w:color="auto" w:sz="4" w:space="0"/>
-          <w:bottom w:val="single" w:color="auto" w:sz="4" w:space="0"/>
-          <w:right w:val="single" w:color="auto" w:sz="4" w:space="0"/>
-          <w:insideH w:val="single" w:color="auto" w:sz="4" w:space="0"/>
-          <w:insideV w:val="single" w:color="auto" w:sz="4" w:space="0"/>
-        </w:tblBorders>
-        <w:tblLayout w:type="autofit"/>
-        <w:tblCellMar>
-          <w:top w:w="0" w:type="dxa"/>
-          <w:left w:w="108" w:type="dxa"/>
-          <w:bottom w:w="0" w:type="dxa"/>
-          <w:right w:w="108" w:type="dxa"/>
-        </w:tblCellMar>
-      </w:tblPr>
-      <w:tblGrid>
-        <w:gridCol w:w="8973"/>
-      </w:tblGrid>
-      <w:tr>
-        <w:tblPrEx>
-          <w:tblBorders>
-            <w:top w:val="single" w:color="auto" w:sz="4" w:space="0"/>
-            <w:left w:val="single" w:color="auto" w:sz="4" w:space="0"/>
-            <w:bottom w:val="single" w:color="auto" w:sz="4" w:space="0"/>
-            <w:right w:val="single" w:color="auto" w:sz="4" w:space="0"/>
-            <w:insideH w:val="single" w:color="auto" w:sz="4" w:space="0"/>
-            <w:insideV w:val="single" w:color="auto" w:sz="4" w:space="0"/>
-          </w:tblBorders>
-          <w:tblCellMar>
-            <w:top w:w="0" w:type="dxa"/>
-            <w:left w:w="108" w:type="dxa"/>
-            <w:bottom w:w="0" w:type="dxa"/>
-            <w:right w:w="108" w:type="dxa"/>
-          </w:tblCellMar>
-        </w:tblPrEx>
-        <w:tc>
-          <w:tcPr>
-            <w:tcW w:w="8973" w:type="dxa"/>
-          </w:tcPr>
-          <w:p>
-            <w:pPr>
-              <w:widowControl w:val="0"/>
-              <w:jc w:val="both"/>
-              <w:rPr>
-                <w:rFonts w:hint="default" w:ascii="Times New Roman" w:hAnsi="Times New Roman"/>
-                <w:sz w:val="20"/>
-                <w:szCs w:val="20"/>
-                <w:vertAlign w:val="baseline"/>
-              </w:rPr>
-            </w:pPr>
-            <w:r>
-              <w:rPr>
-                <w:rFonts w:hint="default" w:ascii="Times New Roman" w:hAnsi="Times New Roman"/>
-                <w:sz w:val="20"/>
-                <w:szCs w:val="20"/>
-                <w:vertAlign w:val="baseline"/>
-              </w:rPr>
-              <w:t>def extract_all_features(self, url):</w:t>
-            </w:r>
-          </w:p>
-          <w:p>
-            <w:pPr>
-              <w:widowControl w:val="0"/>
-              <w:jc w:val="both"/>
-              <w:rPr>
-                <w:rFonts w:hint="default" w:ascii="Times New Roman" w:hAnsi="Times New Roman"/>
-                <w:sz w:val="20"/>
-                <w:szCs w:val="20"/>
-                <w:vertAlign w:val="baseline"/>
-              </w:rPr>
-            </w:pPr>
-            <w:r>
-              <w:rPr>
-                <w:rFonts w:hint="default" w:ascii="Times New Roman" w:hAnsi="Times New Roman"/>
-                <w:sz w:val="20"/>
-                <w:szCs w:val="20"/>
-                <w:vertAlign w:val="baseline"/>
-              </w:rPr>
-              <w:t xml:space="preserve">        """Extract all features from a URL"""</w:t>
-            </w:r>
-          </w:p>
-          <w:p>
-            <w:pPr>
-              <w:widowControl w:val="0"/>
-              <w:jc w:val="both"/>
-              <w:rPr>
-                <w:rFonts w:hint="default" w:ascii="Times New Roman" w:hAnsi="Times New Roman"/>
-                <w:sz w:val="20"/>
-                <w:szCs w:val="20"/>
-                <w:vertAlign w:val="baseline"/>
-              </w:rPr>
-            </w:pPr>
-            <w:r>
-              <w:rPr>
-                <w:rFonts w:hint="default" w:ascii="Times New Roman" w:hAnsi="Times New Roman"/>
-                <w:sz w:val="20"/>
-                <w:szCs w:val="20"/>
-                <w:vertAlign w:val="baseline"/>
-              </w:rPr>
-              <w:t xml:space="preserve">        features = {}</w:t>
-            </w:r>
-          </w:p>
-          <w:p>
-            <w:pPr>
-              <w:widowControl w:val="0"/>
-              <w:jc w:val="both"/>
-              <w:rPr>
-                <w:rFonts w:hint="default" w:ascii="Times New Roman" w:hAnsi="Times New Roman"/>
-                <w:sz w:val="20"/>
-                <w:szCs w:val="20"/>
-                <w:vertAlign w:val="baseline"/>
-              </w:rPr>
-            </w:pPr>
-            <w:r>
-              <w:rPr>
-                <w:rFonts w:hint="default" w:ascii="Times New Roman" w:hAnsi="Times New Roman"/>
-                <w:sz w:val="20"/>
-                <w:szCs w:val="20"/>
-                <w:vertAlign w:val="baseline"/>
-              </w:rPr>
-              <w:t xml:space="preserve">        # URL-based features (fast, no network required)</w:t>
-            </w:r>
-          </w:p>
-          <w:p>
-            <w:pPr>
-              <w:widowControl w:val="0"/>
-              <w:jc w:val="both"/>
-              <w:rPr>
-                <w:rFonts w:hint="default" w:ascii="Times New Roman" w:hAnsi="Times New Roman"/>
-                <w:sz w:val="20"/>
-                <w:szCs w:val="20"/>
-                <w:vertAlign w:val="baseline"/>
-              </w:rPr>
-            </w:pPr>
-            <w:r>
-              <w:rPr>
-                <w:rFonts w:hint="default" w:ascii="Times New Roman" w:hAnsi="Times New Roman"/>
-                <w:sz w:val="20"/>
-                <w:szCs w:val="20"/>
-                <w:vertAlign w:val="baseline"/>
-              </w:rPr>
-              <w:t xml:space="preserve">        features.update(self.extract_url_features(url))</w:t>
-            </w:r>
-          </w:p>
-          <w:p>
-            <w:pPr>
-              <w:widowControl w:val="0"/>
-              <w:jc w:val="both"/>
-              <w:rPr>
-                <w:rFonts w:hint="default" w:ascii="Times New Roman" w:hAnsi="Times New Roman"/>
-                <w:sz w:val="20"/>
-                <w:szCs w:val="20"/>
-                <w:vertAlign w:val="baseline"/>
-              </w:rPr>
-            </w:pPr>
-            <w:r>
-              <w:rPr>
-                <w:rFonts w:hint="default" w:ascii="Times New Roman" w:hAnsi="Times New Roman"/>
-                <w:sz w:val="20"/>
-                <w:szCs w:val="20"/>
-                <w:vertAlign w:val="baseline"/>
-              </w:rPr>
-              <w:t xml:space="preserve">        # Lexical features</w:t>
-            </w:r>
-          </w:p>
-          <w:p>
-            <w:pPr>
-              <w:widowControl w:val="0"/>
-              <w:jc w:val="both"/>
-              <w:rPr>
-                <w:rFonts w:hint="default" w:ascii="Times New Roman" w:hAnsi="Times New Roman"/>
-                <w:sz w:val="20"/>
-                <w:szCs w:val="20"/>
-                <w:vertAlign w:val="baseline"/>
-              </w:rPr>
-            </w:pPr>
-            <w:r>
-              <w:rPr>
-                <w:rFonts w:hint="default" w:ascii="Times New Roman" w:hAnsi="Times New Roman"/>
-                <w:sz w:val="20"/>
-                <w:szCs w:val="20"/>
-                <w:vertAlign w:val="baseline"/>
-              </w:rPr>
-              <w:t xml:space="preserve">        features.update(self.extract_lexical_features(url))</w:t>
-            </w:r>
-          </w:p>
-          <w:p>
-            <w:pPr>
-              <w:widowControl w:val="0"/>
-              <w:jc w:val="both"/>
-              <w:rPr>
-                <w:rFonts w:hint="default" w:ascii="Times New Roman" w:hAnsi="Times New Roman"/>
-                <w:sz w:val="20"/>
-                <w:szCs w:val="20"/>
-                <w:vertAlign w:val="baseline"/>
-              </w:rPr>
-            </w:pPr>
-            <w:r>
-              <w:rPr>
-                <w:rFonts w:hint="default" w:ascii="Times New Roman" w:hAnsi="Times New Roman"/>
-                <w:sz w:val="20"/>
-                <w:szCs w:val="20"/>
-                <w:vertAlign w:val="baseline"/>
-              </w:rPr>
-              <w:t xml:space="preserve">        # Domain-based features (may require network)</w:t>
-            </w:r>
-          </w:p>
-          <w:p>
-            <w:pPr>
-              <w:widowControl w:val="0"/>
-              <w:jc w:val="both"/>
-              <w:rPr>
-                <w:rFonts w:hint="default" w:ascii="Times New Roman" w:hAnsi="Times New Roman"/>
-                <w:sz w:val="20"/>
-                <w:szCs w:val="20"/>
-                <w:vertAlign w:val="baseline"/>
-              </w:rPr>
-            </w:pPr>
-            <w:r>
-              <w:rPr>
-                <w:rFonts w:hint="default" w:ascii="Times New Roman" w:hAnsi="Times New Roman"/>
-                <w:sz w:val="20"/>
-                <w:szCs w:val="20"/>
-                <w:vertAlign w:val="baseline"/>
-              </w:rPr>
-              <w:t xml:space="preserve">        features.update(self.extract_domain_features(url))</w:t>
-            </w:r>
-          </w:p>
-          <w:p>
-            <w:pPr>
-              <w:widowControl w:val="0"/>
-              <w:jc w:val="both"/>
-              <w:rPr>
-                <w:rFonts w:hint="default" w:ascii="Times New Roman" w:hAnsi="Times New Roman"/>
-                <w:sz w:val="20"/>
-                <w:szCs w:val="20"/>
-                <w:vertAlign w:val="baseline"/>
-              </w:rPr>
-            </w:pPr>
-            <w:r>
-              <w:rPr>
-                <w:rFonts w:hint="default" w:ascii="Times New Roman" w:hAnsi="Times New Roman"/>
-                <w:sz w:val="20"/>
-                <w:szCs w:val="20"/>
-                <w:vertAlign w:val="baseline"/>
-              </w:rPr>
-              <w:t xml:space="preserve">        # Content-based features (requires fetching page)</w:t>
-            </w:r>
-          </w:p>
-          <w:p>
-            <w:pPr>
-              <w:widowControl w:val="0"/>
-              <w:jc w:val="both"/>
-              <w:rPr>
-                <w:rFonts w:hint="default" w:ascii="Times New Roman" w:hAnsi="Times New Roman"/>
-                <w:sz w:val="20"/>
-                <w:szCs w:val="20"/>
-                <w:vertAlign w:val="baseline"/>
-              </w:rPr>
-            </w:pPr>
-            <w:r>
-              <w:rPr>
-                <w:rFonts w:hint="default" w:ascii="Times New Roman" w:hAnsi="Times New Roman"/>
-                <w:sz w:val="20"/>
-                <w:szCs w:val="20"/>
-                <w:vertAlign w:val="baseline"/>
-              </w:rPr>
-              <w:t xml:space="preserve">        features.update(self.extract_content_features(url))</w:t>
-            </w:r>
-          </w:p>
-          <w:p>
-            <w:pPr>
-              <w:widowControl w:val="0"/>
-              <w:jc w:val="both"/>
-              <w:rPr>
-                <w:rFonts w:hint="default" w:ascii="Times New Roman" w:hAnsi="Times New Roman" w:cs="Times New Roman"/>
-                <w:sz w:val="20"/>
-                <w:szCs w:val="20"/>
-                <w:vertAlign w:val="baseline"/>
-              </w:rPr>
-            </w:pPr>
-            <w:r>
-              <w:rPr>
-                <w:rFonts w:hint="default" w:ascii="Times New Roman" w:hAnsi="Times New Roman"/>
-                <w:sz w:val="20"/>
-                <w:szCs w:val="20"/>
-                <w:vertAlign w:val="baseline"/>
-              </w:rPr>
-              <w:t xml:space="preserve">        return features</w:t>
-            </w:r>
-          </w:p>
-        </w:tc>
-      </w:tr>
-    </w:tbl>
     <w:p>
       <w:pPr>
         <w:pStyle w:val="4"/>
@@ -18282,138 +17603,6 @@
         <w:t>4.4 Rule-Based Detector Implementation</w:t>
       </w:r>
     </w:p>
-    <w:tbl>
-      <w:tblPr>
-        <w:tblStyle w:val="16"/>
-        <w:tblW w:w="0" w:type="auto"/>
-        <w:tblInd w:w="141" w:type="dxa"/>
-        <w:tblBorders>
-          <w:top w:val="single" w:color="auto" w:sz="4" w:space="0"/>
-          <w:left w:val="single" w:color="auto" w:sz="4" w:space="0"/>
-          <w:bottom w:val="single" w:color="auto" w:sz="4" w:space="0"/>
-          <w:right w:val="single" w:color="auto" w:sz="4" w:space="0"/>
-          <w:insideH w:val="single" w:color="auto" w:sz="4" w:space="0"/>
-          <w:insideV w:val="single" w:color="auto" w:sz="4" w:space="0"/>
-        </w:tblBorders>
-        <w:tblLayout w:type="autofit"/>
-        <w:tblCellMar>
-          <w:top w:w="0" w:type="dxa"/>
-          <w:left w:w="108" w:type="dxa"/>
-          <w:bottom w:w="0" w:type="dxa"/>
-          <w:right w:w="108" w:type="dxa"/>
-        </w:tblCellMar>
-      </w:tblPr>
-      <w:tblGrid>
-        <w:gridCol w:w="9214"/>
-      </w:tblGrid>
-      <w:tr>
-        <w:tblPrEx>
-          <w:tblBorders>
-            <w:top w:val="single" w:color="auto" w:sz="4" w:space="0"/>
-            <w:left w:val="single" w:color="auto" w:sz="4" w:space="0"/>
-            <w:bottom w:val="single" w:color="auto" w:sz="4" w:space="0"/>
-            <w:right w:val="single" w:color="auto" w:sz="4" w:space="0"/>
-            <w:insideH w:val="single" w:color="auto" w:sz="4" w:space="0"/>
-            <w:insideV w:val="single" w:color="auto" w:sz="4" w:space="0"/>
-          </w:tblBorders>
-          <w:tblCellMar>
-            <w:top w:w="0" w:type="dxa"/>
-            <w:left w:w="108" w:type="dxa"/>
-            <w:bottom w:w="0" w:type="dxa"/>
-            <w:right w:w="108" w:type="dxa"/>
-          </w:tblCellMar>
-        </w:tblPrEx>
-        <w:tc>
-          <w:tcPr>
-            <w:tcW w:w="9214" w:type="dxa"/>
-          </w:tcPr>
-          <w:p>
-            <w:pPr>
-              <w:widowControl w:val="0"/>
-              <w:jc w:val="both"/>
-              <w:rPr>
-                <w:rFonts w:hint="default" w:ascii="Times New Roman" w:hAnsi="Times New Roman"/>
-                <w:sz w:val="20"/>
-                <w:szCs w:val="20"/>
-                <w:vertAlign w:val="baseline"/>
-              </w:rPr>
-            </w:pPr>
-            <w:r>
-              <w:rPr>
-                <w:rFonts w:hint="default" w:ascii="Times New Roman" w:hAnsi="Times New Roman"/>
-                <w:sz w:val="20"/>
-                <w:szCs w:val="20"/>
-                <w:vertAlign w:val="baseline"/>
-              </w:rPr>
-              <w:t>rule_detector_class_hyn = RuleBasedDetector()</w:t>
-            </w:r>
-          </w:p>
-          <w:p>
-            <w:pPr>
-              <w:widowControl w:val="0"/>
-              <w:jc w:val="both"/>
-              <w:rPr>
-                <w:rFonts w:hint="default" w:ascii="Times New Roman" w:hAnsi="Times New Roman"/>
-                <w:sz w:val="20"/>
-                <w:szCs w:val="20"/>
-                <w:vertAlign w:val="baseline"/>
-              </w:rPr>
-            </w:pPr>
-            <w:r>
-              <w:rPr>
-                <w:rFonts w:hint="default" w:ascii="Times New Roman" w:hAnsi="Times New Roman"/>
-                <w:sz w:val="20"/>
-                <w:szCs w:val="20"/>
-                <w:vertAlign w:val="baseline"/>
-              </w:rPr>
-              <w:t>rule_detector_class_hyn.optimize_thresholds(X_train_hyn, y_train_hyn)</w:t>
-            </w:r>
-          </w:p>
-          <w:p>
-            <w:pPr>
-              <w:widowControl w:val="0"/>
-              <w:jc w:val="both"/>
-              <w:rPr>
-                <w:rFonts w:hint="default" w:ascii="Times New Roman" w:hAnsi="Times New Roman"/>
-                <w:sz w:val="20"/>
-                <w:szCs w:val="20"/>
-                <w:vertAlign w:val="baseline"/>
-              </w:rPr>
-            </w:pPr>
-            <w:r>
-              <w:rPr>
-                <w:rFonts w:hint="default" w:ascii="Times New Roman" w:hAnsi="Times New Roman"/>
-                <w:sz w:val="20"/>
-                <w:szCs w:val="20"/>
-                <w:vertAlign w:val="baseline"/>
-              </w:rPr>
-              <w:t>rule_detector_metrics = rule_detector_class_hyn.evaluate(X_test_hyn, y_test_hyn)</w:t>
-            </w:r>
-          </w:p>
-          <w:p>
-            <w:pPr>
-              <w:widowControl w:val="0"/>
-              <w:jc w:val="both"/>
-              <w:rPr>
-                <w:rFonts w:hint="default" w:ascii="Times New Roman" w:hAnsi="Times New Roman" w:cs="Times New Roman"/>
-                <w:sz w:val="20"/>
-                <w:szCs w:val="20"/>
-                <w:vertAlign w:val="baseline"/>
-              </w:rPr>
-            </w:pPr>
-            <w:r>
-              <w:rPr>
-                <w:rFonts w:hint="default" w:ascii="Times New Roman" w:hAnsi="Times New Roman"/>
-                <w:sz w:val="20"/>
-                <w:szCs w:val="20"/>
-                <w:vertAlign w:val="baseline"/>
-              </w:rPr>
-              <w:t>rule_detector_class_hyn.save()</w:t>
-            </w:r>
-          </w:p>
-        </w:tc>
-      </w:tr>
-    </w:tbl>
     <w:p>
       <w:pPr>
         <w:pStyle w:val="4"/>
@@ -18536,306 +17725,6 @@
         <w:t>4.5 Machine Learning Detector</w:t>
       </w:r>
     </w:p>
-    <w:tbl>
-      <w:tblPr>
-        <w:tblStyle w:val="16"/>
-        <w:tblW w:w="0" w:type="auto"/>
-        <w:tblInd w:w="141" w:type="dxa"/>
-        <w:tblBorders>
-          <w:top w:val="single" w:color="auto" w:sz="4" w:space="0"/>
-          <w:left w:val="single" w:color="auto" w:sz="4" w:space="0"/>
-          <w:bottom w:val="single" w:color="auto" w:sz="4" w:space="0"/>
-          <w:right w:val="single" w:color="auto" w:sz="4" w:space="0"/>
-          <w:insideH w:val="single" w:color="auto" w:sz="4" w:space="0"/>
-          <w:insideV w:val="single" w:color="auto" w:sz="4" w:space="0"/>
-        </w:tblBorders>
-        <w:tblLayout w:type="autofit"/>
-        <w:tblCellMar>
-          <w:top w:w="0" w:type="dxa"/>
-          <w:left w:w="108" w:type="dxa"/>
-          <w:bottom w:w="0" w:type="dxa"/>
-          <w:right w:w="108" w:type="dxa"/>
-        </w:tblCellMar>
-      </w:tblPr>
-      <w:tblGrid>
-        <w:gridCol w:w="9214"/>
-      </w:tblGrid>
-      <w:tr>
-        <w:tblPrEx>
-          <w:tblBorders>
-            <w:top w:val="single" w:color="auto" w:sz="4" w:space="0"/>
-            <w:left w:val="single" w:color="auto" w:sz="4" w:space="0"/>
-            <w:bottom w:val="single" w:color="auto" w:sz="4" w:space="0"/>
-            <w:right w:val="single" w:color="auto" w:sz="4" w:space="0"/>
-            <w:insideH w:val="single" w:color="auto" w:sz="4" w:space="0"/>
-            <w:insideV w:val="single" w:color="auto" w:sz="4" w:space="0"/>
-          </w:tblBorders>
-          <w:tblCellMar>
-            <w:top w:w="0" w:type="dxa"/>
-            <w:left w:w="108" w:type="dxa"/>
-            <w:bottom w:w="0" w:type="dxa"/>
-            <w:right w:w="108" w:type="dxa"/>
-          </w:tblCellMar>
-        </w:tblPrEx>
-        <w:tc>
-          <w:tcPr>
-            <w:tcW w:w="9214" w:type="dxa"/>
-          </w:tcPr>
-          <w:p>
-            <w:pPr>
-              <w:widowControl w:val="0"/>
-              <w:jc w:val="both"/>
-              <w:rPr>
-                <w:rFonts w:hint="default" w:ascii="Times New Roman" w:hAnsi="Times New Roman"/>
-                <w:sz w:val="20"/>
-                <w:szCs w:val="20"/>
-                <w:vertAlign w:val="baseline"/>
-              </w:rPr>
-            </w:pPr>
-            <w:r>
-              <w:rPr>
-                <w:rFonts w:hint="default" w:ascii="Times New Roman" w:hAnsi="Times New Roman"/>
-                <w:sz w:val="20"/>
-                <w:szCs w:val="20"/>
-                <w:vertAlign w:val="baseline"/>
-              </w:rPr>
-              <w:t>userinput = int(input("Select option 1 or Option 2"))</w:t>
-            </w:r>
-          </w:p>
-          <w:p>
-            <w:pPr>
-              <w:widowControl w:val="0"/>
-              <w:jc w:val="both"/>
-              <w:rPr>
-                <w:rFonts w:hint="default" w:ascii="Times New Roman" w:hAnsi="Times New Roman"/>
-                <w:sz w:val="20"/>
-                <w:szCs w:val="20"/>
-                <w:vertAlign w:val="baseline"/>
-              </w:rPr>
-            </w:pPr>
-            <w:r>
-              <w:rPr>
-                <w:rFonts w:hint="default" w:ascii="Times New Roman" w:hAnsi="Times New Roman"/>
-                <w:sz w:val="20"/>
-                <w:szCs w:val="20"/>
-                <w:vertAlign w:val="baseline"/>
-              </w:rPr>
-              <w:t>if userinput == 1:</w:t>
-            </w:r>
-          </w:p>
-          <w:p>
-            <w:pPr>
-              <w:widowControl w:val="0"/>
-              <w:jc w:val="both"/>
-              <w:rPr>
-                <w:rFonts w:hint="default" w:ascii="Times New Roman" w:hAnsi="Times New Roman"/>
-                <w:sz w:val="20"/>
-                <w:szCs w:val="20"/>
-                <w:vertAlign w:val="baseline"/>
-              </w:rPr>
-            </w:pPr>
-            <w:r>
-              <w:rPr>
-                <w:rFonts w:hint="default" w:ascii="Times New Roman" w:hAnsi="Times New Roman"/>
-                <w:sz w:val="20"/>
-                <w:szCs w:val="20"/>
-                <w:vertAlign w:val="baseline"/>
-              </w:rPr>
-              <w:t xml:space="preserve">    print("\nTraining Random Forest classifier...")</w:t>
-            </w:r>
-          </w:p>
-          <w:p>
-            <w:pPr>
-              <w:widowControl w:val="0"/>
-              <w:jc w:val="both"/>
-              <w:rPr>
-                <w:rFonts w:hint="default" w:ascii="Times New Roman" w:hAnsi="Times New Roman"/>
-                <w:sz w:val="20"/>
-                <w:szCs w:val="20"/>
-                <w:vertAlign w:val="baseline"/>
-              </w:rPr>
-            </w:pPr>
-            <w:r>
-              <w:rPr>
-                <w:rFonts w:hint="default" w:ascii="Times New Roman" w:hAnsi="Times New Roman"/>
-                <w:sz w:val="20"/>
-                <w:szCs w:val="20"/>
-                <w:vertAlign w:val="baseline"/>
-              </w:rPr>
-              <w:t xml:space="preserve">    ml_detector_hyn = MLDetector(algorithm='Random Forest')</w:t>
-            </w:r>
-          </w:p>
-          <w:p>
-            <w:pPr>
-              <w:widowControl w:val="0"/>
-              <w:jc w:val="both"/>
-              <w:rPr>
-                <w:rFonts w:hint="default" w:ascii="Times New Roman" w:hAnsi="Times New Roman"/>
-                <w:sz w:val="20"/>
-                <w:szCs w:val="20"/>
-                <w:vertAlign w:val="baseline"/>
-              </w:rPr>
-            </w:pPr>
-            <w:r>
-              <w:rPr>
-                <w:rFonts w:hint="default" w:ascii="Times New Roman" w:hAnsi="Times New Roman"/>
-                <w:sz w:val="20"/>
-                <w:szCs w:val="20"/>
-                <w:vertAlign w:val="baseline"/>
-              </w:rPr>
-              <w:t xml:space="preserve">    ml_detector_hyn.train(X_train_scaledhyn, y_train_hyn, use_grid_search=True)</w:t>
-            </w:r>
-          </w:p>
-          <w:p>
-            <w:pPr>
-              <w:widowControl w:val="0"/>
-              <w:jc w:val="both"/>
-              <w:rPr>
-                <w:rFonts w:hint="default" w:ascii="Times New Roman" w:hAnsi="Times New Roman"/>
-                <w:sz w:val="20"/>
-                <w:szCs w:val="20"/>
-                <w:vertAlign w:val="baseline"/>
-              </w:rPr>
-            </w:pPr>
-            <w:r>
-              <w:rPr>
-                <w:rFonts w:hint="default" w:ascii="Times New Roman" w:hAnsi="Times New Roman"/>
-                <w:sz w:val="20"/>
-                <w:szCs w:val="20"/>
-                <w:vertAlign w:val="baseline"/>
-              </w:rPr>
-              <w:t xml:space="preserve">    ml_metricshyn = ml_detector_hyn.evaluate(X_test_scaledhyn, y_test_hyn)</w:t>
-            </w:r>
-          </w:p>
-          <w:p>
-            <w:pPr>
-              <w:widowControl w:val="0"/>
-              <w:jc w:val="both"/>
-              <w:rPr>
-                <w:rFonts w:hint="default" w:ascii="Times New Roman" w:hAnsi="Times New Roman"/>
-                <w:sz w:val="20"/>
-                <w:szCs w:val="20"/>
-                <w:vertAlign w:val="baseline"/>
-              </w:rPr>
-            </w:pPr>
-            <w:r>
-              <w:rPr>
-                <w:rFonts w:hint="default" w:ascii="Times New Roman" w:hAnsi="Times New Roman"/>
-                <w:sz w:val="20"/>
-                <w:szCs w:val="20"/>
-                <w:vertAlign w:val="baseline"/>
-              </w:rPr>
-              <w:t xml:space="preserve">    ml_detector_hyn.save()</w:t>
-            </w:r>
-          </w:p>
-          <w:p>
-            <w:pPr>
-              <w:widowControl w:val="0"/>
-              <w:jc w:val="both"/>
-              <w:rPr>
-                <w:rFonts w:hint="default" w:ascii="Times New Roman" w:hAnsi="Times New Roman"/>
-                <w:sz w:val="20"/>
-                <w:szCs w:val="20"/>
-                <w:vertAlign w:val="baseline"/>
-              </w:rPr>
-            </w:pPr>
-            <w:r>
-              <w:rPr>
-                <w:rFonts w:hint="default" w:ascii="Times New Roman" w:hAnsi="Times New Roman"/>
-                <w:sz w:val="20"/>
-                <w:szCs w:val="20"/>
-                <w:vertAlign w:val="baseline"/>
-              </w:rPr>
-              <w:t>elif userinput == 2:</w:t>
-            </w:r>
-          </w:p>
-          <w:p>
-            <w:pPr>
-              <w:widowControl w:val="0"/>
-              <w:jc w:val="both"/>
-              <w:rPr>
-                <w:rFonts w:hint="default" w:ascii="Times New Roman" w:hAnsi="Times New Roman"/>
-                <w:sz w:val="20"/>
-                <w:szCs w:val="20"/>
-                <w:vertAlign w:val="baseline"/>
-              </w:rPr>
-            </w:pPr>
-            <w:r>
-              <w:rPr>
-                <w:rFonts w:hint="default" w:ascii="Times New Roman" w:hAnsi="Times New Roman"/>
-                <w:sz w:val="20"/>
-                <w:szCs w:val="20"/>
-                <w:vertAlign w:val="baseline"/>
-              </w:rPr>
-              <w:t xml:space="preserve">    print("\nComparing multiple algorithms...")</w:t>
-            </w:r>
-          </w:p>
-          <w:p>
-            <w:pPr>
-              <w:widowControl w:val="0"/>
-              <w:jc w:val="both"/>
-              <w:rPr>
-                <w:rFonts w:hint="default" w:ascii="Times New Roman" w:hAnsi="Times New Roman"/>
-                <w:sz w:val="20"/>
-                <w:szCs w:val="20"/>
-                <w:vertAlign w:val="baseline"/>
-              </w:rPr>
-            </w:pPr>
-            <w:r>
-              <w:rPr>
-                <w:rFonts w:hint="default" w:ascii="Times New Roman" w:hAnsi="Times New Roman"/>
-                <w:sz w:val="20"/>
-                <w:szCs w:val="20"/>
-                <w:vertAlign w:val="baseline"/>
-              </w:rPr>
-              <w:t xml:space="preserve">    ml_detector_hyn = MLDetector()</w:t>
-            </w:r>
-          </w:p>
-          <w:p>
-            <w:pPr>
-              <w:widowControl w:val="0"/>
-              <w:jc w:val="both"/>
-              <w:rPr>
-                <w:rFonts w:hint="default" w:ascii="Times New Roman" w:hAnsi="Times New Roman"/>
-                <w:sz w:val="20"/>
-                <w:szCs w:val="20"/>
-                <w:vertAlign w:val="baseline"/>
-              </w:rPr>
-            </w:pPr>
-            <w:r>
-              <w:rPr>
-                <w:rFonts w:hint="default" w:ascii="Times New Roman" w:hAnsi="Times New Roman"/>
-                <w:sz w:val="20"/>
-                <w:szCs w:val="20"/>
-                <w:vertAlign w:val="baseline"/>
-              </w:rPr>
-              <w:t xml:space="preserve">    resultshyn, best_algohyn = compare_algorithms_all_hyn(X_train_scaledhyn, X_test_scaledhyn, y_train_hyn, y_test_hyn)</w:t>
-            </w:r>
-          </w:p>
-          <w:p>
-            <w:pPr>
-              <w:widowControl w:val="0"/>
-              <w:jc w:val="both"/>
-              <w:rPr>
-                <w:rFonts w:hint="default" w:ascii="Times New Roman" w:hAnsi="Times New Roman" w:cs="Times New Roman"/>
-                <w:sz w:val="20"/>
-                <w:szCs w:val="20"/>
-                <w:vertAlign w:val="baseline"/>
-              </w:rPr>
-            </w:pPr>
-            <w:r>
-              <w:rPr>
-                <w:rFonts w:hint="default" w:ascii="Times New Roman" w:hAnsi="Times New Roman"/>
-                <w:sz w:val="20"/>
-                <w:szCs w:val="20"/>
-                <w:vertAlign w:val="baseline"/>
-              </w:rPr>
-              <w:t xml:space="preserve">    ml_detector_hyn = resultshyn[best_algohyn]['detector']</w:t>
-            </w:r>
-          </w:p>
-        </w:tc>
-      </w:tr>
-    </w:tbl>
     <w:p>
       <w:pPr>
         <w:pStyle w:val="4"/>
@@ -19026,894 +17915,6 @@
         <w:t>.6 Hybrid Detection System</w:t>
       </w:r>
     </w:p>
-    <w:tbl>
-      <w:tblPr>
-        <w:tblStyle w:val="16"/>
-        <w:tblW w:w="0" w:type="auto"/>
-        <w:tblInd w:w="141" w:type="dxa"/>
-        <w:tblBorders>
-          <w:top w:val="single" w:color="auto" w:sz="4" w:space="0"/>
-          <w:left w:val="single" w:color="auto" w:sz="4" w:space="0"/>
-          <w:bottom w:val="single" w:color="auto" w:sz="4" w:space="0"/>
-          <w:right w:val="single" w:color="auto" w:sz="4" w:space="0"/>
-          <w:insideH w:val="single" w:color="auto" w:sz="4" w:space="0"/>
-          <w:insideV w:val="single" w:color="auto" w:sz="4" w:space="0"/>
-        </w:tblBorders>
-        <w:tblLayout w:type="autofit"/>
-        <w:tblCellMar>
-          <w:top w:w="0" w:type="dxa"/>
-          <w:left w:w="108" w:type="dxa"/>
-          <w:bottom w:w="0" w:type="dxa"/>
-          <w:right w:w="108" w:type="dxa"/>
-        </w:tblCellMar>
-      </w:tblPr>
-      <w:tblGrid>
-        <w:gridCol w:w="9214"/>
-      </w:tblGrid>
-      <w:tr>
-        <w:tblPrEx>
-          <w:tblBorders>
-            <w:top w:val="single" w:color="auto" w:sz="4" w:space="0"/>
-            <w:left w:val="single" w:color="auto" w:sz="4" w:space="0"/>
-            <w:bottom w:val="single" w:color="auto" w:sz="4" w:space="0"/>
-            <w:right w:val="single" w:color="auto" w:sz="4" w:space="0"/>
-            <w:insideH w:val="single" w:color="auto" w:sz="4" w:space="0"/>
-            <w:insideV w:val="single" w:color="auto" w:sz="4" w:space="0"/>
-          </w:tblBorders>
-          <w:tblCellMar>
-            <w:top w:w="0" w:type="dxa"/>
-            <w:left w:w="108" w:type="dxa"/>
-            <w:bottom w:w="0" w:type="dxa"/>
-            <w:right w:w="108" w:type="dxa"/>
-          </w:tblCellMar>
-        </w:tblPrEx>
-        <w:tc>
-          <w:tcPr>
-            <w:tcW w:w="9214" w:type="dxa"/>
-          </w:tcPr>
-          <w:p>
-            <w:pPr>
-              <w:widowControl w:val="0"/>
-              <w:jc w:val="both"/>
-              <w:rPr>
-                <w:rFonts w:hint="default" w:ascii="Times New Roman" w:hAnsi="Times New Roman"/>
-                <w:sz w:val="20"/>
-                <w:szCs w:val="20"/>
-                <w:vertAlign w:val="baseline"/>
-              </w:rPr>
-            </w:pPr>
-            <w:r>
-              <w:rPr>
-                <w:rFonts w:hint="default" w:ascii="Times New Roman" w:hAnsi="Times New Roman"/>
-                <w:sz w:val="20"/>
-                <w:szCs w:val="20"/>
-                <w:vertAlign w:val="baseline"/>
-              </w:rPr>
-              <w:t># ================================================================</w:t>
-            </w:r>
-          </w:p>
-          <w:p>
-            <w:pPr>
-              <w:widowControl w:val="0"/>
-              <w:jc w:val="both"/>
-              <w:rPr>
-                <w:rFonts w:hint="default" w:ascii="Times New Roman" w:hAnsi="Times New Roman"/>
-                <w:sz w:val="20"/>
-                <w:szCs w:val="20"/>
-                <w:vertAlign w:val="baseline"/>
-              </w:rPr>
-            </w:pPr>
-            <w:r>
-              <w:rPr>
-                <w:rFonts w:hint="default" w:ascii="Times New Roman" w:hAnsi="Times New Roman"/>
-                <w:sz w:val="20"/>
-                <w:szCs w:val="20"/>
-                <w:vertAlign w:val="baseline"/>
-              </w:rPr>
-              <w:t># STEP 6: HYBRID DETECTOR</w:t>
-            </w:r>
-          </w:p>
-          <w:p>
-            <w:pPr>
-              <w:widowControl w:val="0"/>
-              <w:jc w:val="both"/>
-              <w:rPr>
-                <w:rFonts w:hint="default" w:ascii="Times New Roman" w:hAnsi="Times New Roman"/>
-                <w:sz w:val="20"/>
-                <w:szCs w:val="20"/>
-                <w:vertAlign w:val="baseline"/>
-              </w:rPr>
-            </w:pPr>
-            <w:r>
-              <w:rPr>
-                <w:rFonts w:hint="default" w:ascii="Times New Roman" w:hAnsi="Times New Roman"/>
-                <w:sz w:val="20"/>
-                <w:szCs w:val="20"/>
-                <w:vertAlign w:val="baseline"/>
-              </w:rPr>
-              <w:t># ================================================================</w:t>
-            </w:r>
-          </w:p>
-          <w:p>
-            <w:pPr>
-              <w:widowControl w:val="0"/>
-              <w:jc w:val="both"/>
-              <w:rPr>
-                <w:rFonts w:hint="default" w:ascii="Times New Roman" w:hAnsi="Times New Roman"/>
-                <w:sz w:val="20"/>
-                <w:szCs w:val="20"/>
-                <w:vertAlign w:val="baseline"/>
-              </w:rPr>
-            </w:pPr>
-            <w:r>
-              <w:rPr>
-                <w:rFonts w:hint="default" w:ascii="Times New Roman" w:hAnsi="Times New Roman"/>
-                <w:sz w:val="20"/>
-                <w:szCs w:val="20"/>
-                <w:vertAlign w:val="baseline"/>
-              </w:rPr>
-              <w:t>print("\n" + "="*70)</w:t>
-            </w:r>
-          </w:p>
-          <w:p>
-            <w:pPr>
-              <w:widowControl w:val="0"/>
-              <w:jc w:val="both"/>
-              <w:rPr>
-                <w:rFonts w:hint="default" w:ascii="Times New Roman" w:hAnsi="Times New Roman"/>
-                <w:sz w:val="20"/>
-                <w:szCs w:val="20"/>
-                <w:vertAlign w:val="baseline"/>
-              </w:rPr>
-            </w:pPr>
-            <w:r>
-              <w:rPr>
-                <w:rFonts w:hint="default" w:ascii="Times New Roman" w:hAnsi="Times New Roman"/>
-                <w:sz w:val="20"/>
-                <w:szCs w:val="20"/>
-                <w:vertAlign w:val="baseline"/>
-              </w:rPr>
-              <w:t>print("STEP 6: HYBRID DETECTOR")</w:t>
-            </w:r>
-          </w:p>
-          <w:p>
-            <w:pPr>
-              <w:widowControl w:val="0"/>
-              <w:jc w:val="both"/>
-              <w:rPr>
-                <w:rFonts w:hint="default" w:ascii="Times New Roman" w:hAnsi="Times New Roman"/>
-                <w:sz w:val="20"/>
-                <w:szCs w:val="20"/>
-                <w:vertAlign w:val="baseline"/>
-              </w:rPr>
-            </w:pPr>
-            <w:r>
-              <w:rPr>
-                <w:rFonts w:hint="default" w:ascii="Times New Roman" w:hAnsi="Times New Roman"/>
-                <w:sz w:val="20"/>
-                <w:szCs w:val="20"/>
-                <w:vertAlign w:val="baseline"/>
-              </w:rPr>
-              <w:t>print("="*70)</w:t>
-            </w:r>
-          </w:p>
-          <w:p>
-            <w:pPr>
-              <w:widowControl w:val="0"/>
-              <w:jc w:val="both"/>
-              <w:rPr>
-                <w:rFonts w:hint="default" w:ascii="Times New Roman" w:hAnsi="Times New Roman"/>
-                <w:sz w:val="20"/>
-                <w:szCs w:val="20"/>
-                <w:vertAlign w:val="baseline"/>
-              </w:rPr>
-            </w:pPr>
-            <w:r>
-              <w:rPr>
-                <w:rFonts w:hint="default" w:ascii="Times New Roman" w:hAnsi="Times New Roman"/>
-                <w:sz w:val="20"/>
-                <w:szCs w:val="20"/>
-                <w:vertAlign w:val="baseline"/>
-              </w:rPr>
-              <w:t xml:space="preserve">from src.hybrid_detector_hy import HybridDetector </w:t>
-            </w:r>
-          </w:p>
-          <w:p>
-            <w:pPr>
-              <w:widowControl w:val="0"/>
-              <w:jc w:val="both"/>
-              <w:rPr>
-                <w:rFonts w:hint="default" w:ascii="Times New Roman" w:hAnsi="Times New Roman"/>
-                <w:sz w:val="20"/>
-                <w:szCs w:val="20"/>
-                <w:vertAlign w:val="baseline"/>
-              </w:rPr>
-            </w:pPr>
-            <w:r>
-              <w:rPr>
-                <w:rFonts w:hint="default" w:ascii="Times New Roman" w:hAnsi="Times New Roman"/>
-                <w:sz w:val="20"/>
-                <w:szCs w:val="20"/>
-                <w:vertAlign w:val="baseline"/>
-              </w:rPr>
-              <w:t>from src.ml_detector_hy import MLDetector</w:t>
-            </w:r>
-          </w:p>
-          <w:p>
-            <w:pPr>
-              <w:widowControl w:val="0"/>
-              <w:jc w:val="both"/>
-              <w:rPr>
-                <w:rFonts w:hint="default" w:ascii="Times New Roman" w:hAnsi="Times New Roman"/>
-                <w:sz w:val="20"/>
-                <w:szCs w:val="20"/>
-                <w:vertAlign w:val="baseline"/>
-              </w:rPr>
-            </w:pPr>
-            <w:r>
-              <w:rPr>
-                <w:rFonts w:hint="default" w:ascii="Times New Roman" w:hAnsi="Times New Roman"/>
-                <w:sz w:val="20"/>
-                <w:szCs w:val="20"/>
-                <w:vertAlign w:val="baseline"/>
-              </w:rPr>
-              <w:t>from src.rule_based_detector_hy import RuleBasedDetector</w:t>
-            </w:r>
-          </w:p>
-          <w:p>
-            <w:pPr>
-              <w:widowControl w:val="0"/>
-              <w:jc w:val="both"/>
-              <w:rPr>
-                <w:rFonts w:hint="default" w:ascii="Times New Roman" w:hAnsi="Times New Roman"/>
-                <w:sz w:val="20"/>
-                <w:szCs w:val="20"/>
-                <w:vertAlign w:val="baseline"/>
-              </w:rPr>
-            </w:pPr>
-            <w:r>
-              <w:rPr>
-                <w:rFonts w:hint="default" w:ascii="Times New Roman" w:hAnsi="Times New Roman"/>
-                <w:sz w:val="20"/>
-                <w:szCs w:val="20"/>
-                <w:vertAlign w:val="baseline"/>
-              </w:rPr>
-              <w:t>rule_based_detector_hy = RuleBasedDetector()</w:t>
-            </w:r>
-          </w:p>
-          <w:p>
-            <w:pPr>
-              <w:widowControl w:val="0"/>
-              <w:jc w:val="both"/>
-              <w:rPr>
-                <w:rFonts w:hint="default" w:ascii="Times New Roman" w:hAnsi="Times New Roman"/>
-                <w:sz w:val="20"/>
-                <w:szCs w:val="20"/>
-                <w:vertAlign w:val="baseline"/>
-              </w:rPr>
-            </w:pPr>
-            <w:r>
-              <w:rPr>
-                <w:rFonts w:hint="default" w:ascii="Times New Roman" w:hAnsi="Times New Roman"/>
-                <w:sz w:val="20"/>
-                <w:szCs w:val="20"/>
-                <w:vertAlign w:val="baseline"/>
-              </w:rPr>
-              <w:t>ml_detector_hy = MLDetector(algorithm='Random Forest')</w:t>
-            </w:r>
-          </w:p>
-          <w:p>
-            <w:pPr>
-              <w:widowControl w:val="0"/>
-              <w:jc w:val="both"/>
-              <w:rPr>
-                <w:rFonts w:hint="default" w:ascii="Times New Roman" w:hAnsi="Times New Roman"/>
-                <w:sz w:val="20"/>
-                <w:szCs w:val="20"/>
-                <w:vertAlign w:val="baseline"/>
-              </w:rPr>
-            </w:pPr>
-            <w:r>
-              <w:rPr>
-                <w:rFonts w:hint="default" w:ascii="Times New Roman" w:hAnsi="Times New Roman"/>
-                <w:sz w:val="20"/>
-                <w:szCs w:val="20"/>
-                <w:vertAlign w:val="baseline"/>
-              </w:rPr>
-              <w:t>ml_detector_hy.train(X_train_scaledhyn, y_train_hyn, use_grid_search=True)</w:t>
-            </w:r>
-          </w:p>
-          <w:p>
-            <w:pPr>
-              <w:widowControl w:val="0"/>
-              <w:jc w:val="both"/>
-              <w:rPr>
-                <w:rFonts w:hint="default" w:ascii="Times New Roman" w:hAnsi="Times New Roman"/>
-                <w:sz w:val="20"/>
-                <w:szCs w:val="20"/>
-                <w:vertAlign w:val="baseline"/>
-              </w:rPr>
-            </w:pPr>
-            <w:r>
-              <w:rPr>
-                <w:rFonts w:hint="default" w:ascii="Times New Roman" w:hAnsi="Times New Roman"/>
-                <w:sz w:val="20"/>
-                <w:szCs w:val="20"/>
-                <w:vertAlign w:val="baseline"/>
-              </w:rPr>
-              <w:t># Create validation set from training data for weight optimization</w:t>
-            </w:r>
-          </w:p>
-          <w:p>
-            <w:pPr>
-              <w:widowControl w:val="0"/>
-              <w:jc w:val="both"/>
-              <w:rPr>
-                <w:rFonts w:hint="default" w:ascii="Times New Roman" w:hAnsi="Times New Roman"/>
-                <w:sz w:val="20"/>
-                <w:szCs w:val="20"/>
-                <w:vertAlign w:val="baseline"/>
-              </w:rPr>
-            </w:pPr>
-            <w:r>
-              <w:rPr>
-                <w:rFonts w:hint="default" w:ascii="Times New Roman" w:hAnsi="Times New Roman"/>
-                <w:sz w:val="20"/>
-                <w:szCs w:val="20"/>
-                <w:vertAlign w:val="baseline"/>
-              </w:rPr>
-              <w:t>val_size_hyn = int(len(X_train_hyn) * 0.2)</w:t>
-            </w:r>
-          </w:p>
-          <w:p>
-            <w:pPr>
-              <w:widowControl w:val="0"/>
-              <w:jc w:val="both"/>
-              <w:rPr>
-                <w:rFonts w:hint="default" w:ascii="Times New Roman" w:hAnsi="Times New Roman"/>
-                <w:sz w:val="20"/>
-                <w:szCs w:val="20"/>
-                <w:vertAlign w:val="baseline"/>
-              </w:rPr>
-            </w:pPr>
-            <w:r>
-              <w:rPr>
-                <w:rFonts w:hint="default" w:ascii="Times New Roman" w:hAnsi="Times New Roman"/>
-                <w:sz w:val="20"/>
-                <w:szCs w:val="20"/>
-                <w:vertAlign w:val="baseline"/>
-              </w:rPr>
-              <w:t>X_val_hyn = X_train_hyn.iloc[-val_size_hyn:]</w:t>
-            </w:r>
-          </w:p>
-          <w:p>
-            <w:pPr>
-              <w:widowControl w:val="0"/>
-              <w:jc w:val="both"/>
-              <w:rPr>
-                <w:rFonts w:hint="default" w:ascii="Times New Roman" w:hAnsi="Times New Roman"/>
-                <w:sz w:val="20"/>
-                <w:szCs w:val="20"/>
-                <w:vertAlign w:val="baseline"/>
-              </w:rPr>
-            </w:pPr>
-            <w:r>
-              <w:rPr>
-                <w:rFonts w:hint="default" w:ascii="Times New Roman" w:hAnsi="Times New Roman"/>
-                <w:sz w:val="20"/>
-                <w:szCs w:val="20"/>
-                <w:vertAlign w:val="baseline"/>
-              </w:rPr>
-              <w:t>y_val_hyn = y_train_hyn.iloc[-val_size_hyn:]</w:t>
-            </w:r>
-          </w:p>
-          <w:p>
-            <w:pPr>
-              <w:widowControl w:val="0"/>
-              <w:jc w:val="both"/>
-              <w:rPr>
-                <w:rFonts w:hint="default" w:ascii="Times New Roman" w:hAnsi="Times New Roman"/>
-                <w:sz w:val="20"/>
-                <w:szCs w:val="20"/>
-                <w:vertAlign w:val="baseline"/>
-              </w:rPr>
-            </w:pPr>
-            <w:r>
-              <w:rPr>
-                <w:rFonts w:hint="default" w:ascii="Times New Roman" w:hAnsi="Times New Roman"/>
-                <w:sz w:val="20"/>
-                <w:szCs w:val="20"/>
-                <w:vertAlign w:val="baseline"/>
-              </w:rPr>
-              <w:t>X_val_scaledhyn = X_train_scaledhyn.iloc[-val_size_hyn:]</w:t>
-            </w:r>
-          </w:p>
-          <w:p>
-            <w:pPr>
-              <w:widowControl w:val="0"/>
-              <w:jc w:val="both"/>
-              <w:rPr>
-                <w:rFonts w:hint="default" w:ascii="Times New Roman" w:hAnsi="Times New Roman"/>
-                <w:sz w:val="20"/>
-                <w:szCs w:val="20"/>
-                <w:vertAlign w:val="baseline"/>
-              </w:rPr>
-            </w:pPr>
-            <w:r>
-              <w:rPr>
-                <w:rFonts w:hint="default" w:ascii="Times New Roman" w:hAnsi="Times New Roman"/>
-                <w:sz w:val="20"/>
-                <w:szCs w:val="20"/>
-                <w:vertAlign w:val="baseline"/>
-              </w:rPr>
-              <w:t># Try different strategies</w:t>
-            </w:r>
-          </w:p>
-          <w:p>
-            <w:pPr>
-              <w:widowControl w:val="0"/>
-              <w:jc w:val="both"/>
-              <w:rPr>
-                <w:rFonts w:hint="default" w:ascii="Times New Roman" w:hAnsi="Times New Roman"/>
-                <w:sz w:val="20"/>
-                <w:szCs w:val="20"/>
-                <w:vertAlign w:val="baseline"/>
-              </w:rPr>
-            </w:pPr>
-            <w:r>
-              <w:rPr>
-                <w:rFonts w:hint="default" w:ascii="Times New Roman" w:hAnsi="Times New Roman"/>
-                <w:sz w:val="20"/>
-                <w:szCs w:val="20"/>
-                <w:vertAlign w:val="baseline"/>
-              </w:rPr>
-              <w:t>strategies = ['weighted', 'voting', 'cascade']</w:t>
-            </w:r>
-          </w:p>
-          <w:p>
-            <w:pPr>
-              <w:widowControl w:val="0"/>
-              <w:jc w:val="both"/>
-              <w:rPr>
-                <w:rFonts w:hint="default" w:ascii="Times New Roman" w:hAnsi="Times New Roman"/>
-                <w:sz w:val="20"/>
-                <w:szCs w:val="20"/>
-                <w:vertAlign w:val="baseline"/>
-              </w:rPr>
-            </w:pPr>
-            <w:r>
-              <w:rPr>
-                <w:rFonts w:hint="default" w:ascii="Times New Roman" w:hAnsi="Times New Roman"/>
-                <w:sz w:val="20"/>
-                <w:szCs w:val="20"/>
-                <w:vertAlign w:val="baseline"/>
-              </w:rPr>
-              <w:t>best_strategy = None</w:t>
-            </w:r>
-          </w:p>
-          <w:p>
-            <w:pPr>
-              <w:widowControl w:val="0"/>
-              <w:jc w:val="both"/>
-              <w:rPr>
-                <w:rFonts w:hint="default" w:ascii="Times New Roman" w:hAnsi="Times New Roman"/>
-                <w:sz w:val="20"/>
-                <w:szCs w:val="20"/>
-                <w:vertAlign w:val="baseline"/>
-              </w:rPr>
-            </w:pPr>
-            <w:r>
-              <w:rPr>
-                <w:rFonts w:hint="default" w:ascii="Times New Roman" w:hAnsi="Times New Roman"/>
-                <w:sz w:val="20"/>
-                <w:szCs w:val="20"/>
-                <w:vertAlign w:val="baseline"/>
-              </w:rPr>
-              <w:t>best_f1 = 0</w:t>
-            </w:r>
-          </w:p>
-          <w:p>
-            <w:pPr>
-              <w:widowControl w:val="0"/>
-              <w:jc w:val="both"/>
-              <w:rPr>
-                <w:rFonts w:hint="default" w:ascii="Times New Roman" w:hAnsi="Times New Roman"/>
-                <w:sz w:val="20"/>
-                <w:szCs w:val="20"/>
-                <w:vertAlign w:val="baseline"/>
-              </w:rPr>
-            </w:pPr>
-            <w:r>
-              <w:rPr>
-                <w:rFonts w:hint="default" w:ascii="Times New Roman" w:hAnsi="Times New Roman"/>
-                <w:sz w:val="20"/>
-                <w:szCs w:val="20"/>
-                <w:vertAlign w:val="baseline"/>
-              </w:rPr>
-              <w:t>best_hybrid_hyn = None</w:t>
-            </w:r>
-          </w:p>
-          <w:p>
-            <w:pPr>
-              <w:widowControl w:val="0"/>
-              <w:jc w:val="both"/>
-              <w:rPr>
-                <w:rFonts w:hint="default" w:ascii="Times New Roman" w:hAnsi="Times New Roman"/>
-                <w:sz w:val="20"/>
-                <w:szCs w:val="20"/>
-                <w:vertAlign w:val="baseline"/>
-              </w:rPr>
-            </w:pPr>
-            <w:r>
-              <w:rPr>
-                <w:rFonts w:hint="default" w:ascii="Times New Roman" w:hAnsi="Times New Roman"/>
-                <w:sz w:val="20"/>
-                <w:szCs w:val="20"/>
-                <w:vertAlign w:val="baseline"/>
-              </w:rPr>
-              <w:t>for strategy in strategies:</w:t>
-            </w:r>
-          </w:p>
-          <w:p>
-            <w:pPr>
-              <w:widowControl w:val="0"/>
-              <w:jc w:val="both"/>
-              <w:rPr>
-                <w:rFonts w:hint="default" w:ascii="Times New Roman" w:hAnsi="Times New Roman"/>
-                <w:sz w:val="20"/>
-                <w:szCs w:val="20"/>
-                <w:vertAlign w:val="baseline"/>
-              </w:rPr>
-            </w:pPr>
-            <w:r>
-              <w:rPr>
-                <w:rFonts w:hint="default" w:ascii="Times New Roman" w:hAnsi="Times New Roman"/>
-                <w:sz w:val="20"/>
-                <w:szCs w:val="20"/>
-                <w:vertAlign w:val="baseline"/>
-              </w:rPr>
-              <w:t xml:space="preserve">    print(f"\n{'='*70}")</w:t>
-            </w:r>
-          </w:p>
-          <w:p>
-            <w:pPr>
-              <w:widowControl w:val="0"/>
-              <w:jc w:val="both"/>
-              <w:rPr>
-                <w:rFonts w:hint="default" w:ascii="Times New Roman" w:hAnsi="Times New Roman"/>
-                <w:sz w:val="20"/>
-                <w:szCs w:val="20"/>
-                <w:vertAlign w:val="baseline"/>
-              </w:rPr>
-            </w:pPr>
-            <w:r>
-              <w:rPr>
-                <w:rFonts w:hint="default" w:ascii="Times New Roman" w:hAnsi="Times New Roman"/>
-                <w:sz w:val="20"/>
-                <w:szCs w:val="20"/>
-                <w:vertAlign w:val="baseline"/>
-              </w:rPr>
-              <w:t xml:space="preserve">    print(f"Testing Hybrid Strategy: {strategy.upper()}")</w:t>
-            </w:r>
-          </w:p>
-          <w:p>
-            <w:pPr>
-              <w:widowControl w:val="0"/>
-              <w:jc w:val="both"/>
-              <w:rPr>
-                <w:rFonts w:hint="default" w:ascii="Times New Roman" w:hAnsi="Times New Roman"/>
-                <w:sz w:val="20"/>
-                <w:szCs w:val="20"/>
-                <w:vertAlign w:val="baseline"/>
-              </w:rPr>
-            </w:pPr>
-            <w:r>
-              <w:rPr>
-                <w:rFonts w:hint="default" w:ascii="Times New Roman" w:hAnsi="Times New Roman"/>
-                <w:sz w:val="20"/>
-                <w:szCs w:val="20"/>
-                <w:vertAlign w:val="baseline"/>
-              </w:rPr>
-              <w:t xml:space="preserve">    print(f"{'='*70}")</w:t>
-            </w:r>
-          </w:p>
-          <w:p>
-            <w:pPr>
-              <w:widowControl w:val="0"/>
-              <w:jc w:val="both"/>
-              <w:rPr>
-                <w:rFonts w:hint="default" w:ascii="Times New Roman" w:hAnsi="Times New Roman"/>
-                <w:sz w:val="20"/>
-                <w:szCs w:val="20"/>
-                <w:vertAlign w:val="baseline"/>
-              </w:rPr>
-            </w:pPr>
-            <w:r>
-              <w:rPr>
-                <w:rFonts w:hint="default" w:ascii="Times New Roman" w:hAnsi="Times New Roman"/>
-                <w:sz w:val="20"/>
-                <w:szCs w:val="20"/>
-                <w:vertAlign w:val="baseline"/>
-              </w:rPr>
-              <w:t xml:space="preserve">    hybrid = HybridDetector(rule_based_detector_hy, ml_detector_hy, strategy=strategy)</w:t>
-            </w:r>
-          </w:p>
-          <w:p>
-            <w:pPr>
-              <w:widowControl w:val="0"/>
-              <w:jc w:val="both"/>
-              <w:rPr>
-                <w:rFonts w:hint="default" w:ascii="Times New Roman" w:hAnsi="Times New Roman"/>
-                <w:sz w:val="20"/>
-                <w:szCs w:val="20"/>
-                <w:vertAlign w:val="baseline"/>
-              </w:rPr>
-            </w:pPr>
-            <w:r>
-              <w:rPr>
-                <w:rFonts w:hint="default" w:ascii="Times New Roman" w:hAnsi="Times New Roman"/>
-                <w:sz w:val="20"/>
-                <w:szCs w:val="20"/>
-                <w:vertAlign w:val="baseline"/>
-              </w:rPr>
-              <w:t xml:space="preserve">    if strategy == 'weighted':</w:t>
-            </w:r>
-          </w:p>
-          <w:p>
-            <w:pPr>
-              <w:widowControl w:val="0"/>
-              <w:jc w:val="both"/>
-              <w:rPr>
-                <w:rFonts w:hint="default" w:ascii="Times New Roman" w:hAnsi="Times New Roman"/>
-                <w:sz w:val="20"/>
-                <w:szCs w:val="20"/>
-                <w:vertAlign w:val="baseline"/>
-              </w:rPr>
-            </w:pPr>
-            <w:r>
-              <w:rPr>
-                <w:rFonts w:hint="default" w:ascii="Times New Roman" w:hAnsi="Times New Roman"/>
-                <w:sz w:val="20"/>
-                <w:szCs w:val="20"/>
-                <w:vertAlign w:val="baseline"/>
-              </w:rPr>
-              <w:t xml:space="preserve">        hybrid.optimize_weights(X_val_scaledhyn, y_val_hyn)</w:t>
-            </w:r>
-          </w:p>
-          <w:p>
-            <w:pPr>
-              <w:widowControl w:val="0"/>
-              <w:jc w:val="both"/>
-              <w:rPr>
-                <w:rFonts w:hint="default" w:ascii="Times New Roman" w:hAnsi="Times New Roman"/>
-                <w:sz w:val="20"/>
-                <w:szCs w:val="20"/>
-                <w:vertAlign w:val="baseline"/>
-              </w:rPr>
-            </w:pPr>
-            <w:r>
-              <w:rPr>
-                <w:rFonts w:hint="default" w:ascii="Times New Roman" w:hAnsi="Times New Roman"/>
-                <w:sz w:val="20"/>
-                <w:szCs w:val="20"/>
-                <w:vertAlign w:val="baseline"/>
-              </w:rPr>
-              <w:t xml:space="preserve">    metrics = hybrid.evaluate(X_test_scaledhyn, y_test_hyn, show_comparison=True)</w:t>
-            </w:r>
-          </w:p>
-          <w:p>
-            <w:pPr>
-              <w:widowControl w:val="0"/>
-              <w:jc w:val="both"/>
-              <w:rPr>
-                <w:rFonts w:hint="default" w:ascii="Times New Roman" w:hAnsi="Times New Roman"/>
-                <w:sz w:val="20"/>
-                <w:szCs w:val="20"/>
-                <w:vertAlign w:val="baseline"/>
-              </w:rPr>
-            </w:pPr>
-            <w:r>
-              <w:rPr>
-                <w:rFonts w:hint="default" w:ascii="Times New Roman" w:hAnsi="Times New Roman"/>
-                <w:sz w:val="20"/>
-                <w:szCs w:val="20"/>
-                <w:vertAlign w:val="baseline"/>
-              </w:rPr>
-              <w:t xml:space="preserve">    if metrics['f1_score'] &gt; best_f1:</w:t>
-            </w:r>
-          </w:p>
-          <w:p>
-            <w:pPr>
-              <w:widowControl w:val="0"/>
-              <w:jc w:val="both"/>
-              <w:rPr>
-                <w:rFonts w:hint="default" w:ascii="Times New Roman" w:hAnsi="Times New Roman"/>
-                <w:sz w:val="20"/>
-                <w:szCs w:val="20"/>
-                <w:vertAlign w:val="baseline"/>
-              </w:rPr>
-            </w:pPr>
-            <w:r>
-              <w:rPr>
-                <w:rFonts w:hint="default" w:ascii="Times New Roman" w:hAnsi="Times New Roman"/>
-                <w:sz w:val="20"/>
-                <w:szCs w:val="20"/>
-                <w:vertAlign w:val="baseline"/>
-              </w:rPr>
-              <w:t xml:space="preserve">        best_f1 = metrics['f1_score']</w:t>
-            </w:r>
-          </w:p>
-          <w:p>
-            <w:pPr>
-              <w:widowControl w:val="0"/>
-              <w:jc w:val="both"/>
-              <w:rPr>
-                <w:rFonts w:hint="default" w:ascii="Times New Roman" w:hAnsi="Times New Roman"/>
-                <w:sz w:val="20"/>
-                <w:szCs w:val="20"/>
-                <w:vertAlign w:val="baseline"/>
-              </w:rPr>
-            </w:pPr>
-            <w:r>
-              <w:rPr>
-                <w:rFonts w:hint="default" w:ascii="Times New Roman" w:hAnsi="Times New Roman"/>
-                <w:sz w:val="20"/>
-                <w:szCs w:val="20"/>
-                <w:vertAlign w:val="baseline"/>
-              </w:rPr>
-              <w:t xml:space="preserve">        best_strategy = strategy</w:t>
-            </w:r>
-          </w:p>
-          <w:p>
-            <w:pPr>
-              <w:widowControl w:val="0"/>
-              <w:jc w:val="both"/>
-              <w:rPr>
-                <w:rFonts w:hint="default" w:ascii="Times New Roman" w:hAnsi="Times New Roman"/>
-                <w:sz w:val="20"/>
-                <w:szCs w:val="20"/>
-                <w:vertAlign w:val="baseline"/>
-              </w:rPr>
-            </w:pPr>
-            <w:r>
-              <w:rPr>
-                <w:rFonts w:hint="default" w:ascii="Times New Roman" w:hAnsi="Times New Roman"/>
-                <w:sz w:val="20"/>
-                <w:szCs w:val="20"/>
-                <w:vertAlign w:val="baseline"/>
-              </w:rPr>
-              <w:t xml:space="preserve">        best_hybrid_hyn = hybrid</w:t>
-            </w:r>
-          </w:p>
-          <w:p>
-            <w:pPr>
-              <w:widowControl w:val="0"/>
-              <w:jc w:val="both"/>
-              <w:rPr>
-                <w:rFonts w:hint="default" w:ascii="Times New Roman" w:hAnsi="Times New Roman"/>
-                <w:sz w:val="20"/>
-                <w:szCs w:val="20"/>
-                <w:vertAlign w:val="baseline"/>
-              </w:rPr>
-            </w:pPr>
-            <w:r>
-              <w:rPr>
-                <w:rFonts w:hint="default" w:ascii="Times New Roman" w:hAnsi="Times New Roman"/>
-                <w:sz w:val="20"/>
-                <w:szCs w:val="20"/>
-                <w:vertAlign w:val="baseline"/>
-              </w:rPr>
-              <w:t>print(f"\n{'='*70}")</w:t>
-            </w:r>
-          </w:p>
-          <w:p>
-            <w:pPr>
-              <w:widowControl w:val="0"/>
-              <w:jc w:val="both"/>
-              <w:rPr>
-                <w:rFonts w:hint="default" w:ascii="Times New Roman" w:hAnsi="Times New Roman"/>
-                <w:sz w:val="20"/>
-                <w:szCs w:val="20"/>
-                <w:vertAlign w:val="baseline"/>
-              </w:rPr>
-            </w:pPr>
-            <w:r>
-              <w:rPr>
-                <w:rFonts w:hint="default" w:ascii="Times New Roman" w:hAnsi="Times New Roman"/>
-                <w:sz w:val="20"/>
-                <w:szCs w:val="20"/>
-                <w:vertAlign w:val="baseline"/>
-              </w:rPr>
-              <w:t>print(f"BEST HYBRID STRATEGY: {best_strategy.upper()}")</w:t>
-            </w:r>
-          </w:p>
-          <w:p>
-            <w:pPr>
-              <w:widowControl w:val="0"/>
-              <w:jc w:val="both"/>
-              <w:rPr>
-                <w:rFonts w:hint="default" w:ascii="Times New Roman" w:hAnsi="Times New Roman"/>
-                <w:sz w:val="20"/>
-                <w:szCs w:val="20"/>
-                <w:vertAlign w:val="baseline"/>
-              </w:rPr>
-            </w:pPr>
-            <w:r>
-              <w:rPr>
-                <w:rFonts w:hint="default" w:ascii="Times New Roman" w:hAnsi="Times New Roman"/>
-                <w:sz w:val="20"/>
-                <w:szCs w:val="20"/>
-                <w:vertAlign w:val="baseline"/>
-              </w:rPr>
-              <w:t>print(f"F1-Score: {best_f1:.4f}")</w:t>
-            </w:r>
-          </w:p>
-          <w:p>
-            <w:pPr>
-              <w:widowControl w:val="0"/>
-              <w:jc w:val="both"/>
-              <w:rPr>
-                <w:rFonts w:hint="default" w:ascii="Times New Roman" w:hAnsi="Times New Roman"/>
-                <w:sz w:val="20"/>
-                <w:szCs w:val="20"/>
-                <w:vertAlign w:val="baseline"/>
-              </w:rPr>
-            </w:pPr>
-            <w:r>
-              <w:rPr>
-                <w:rFonts w:hint="default" w:ascii="Times New Roman" w:hAnsi="Times New Roman"/>
-                <w:sz w:val="20"/>
-                <w:szCs w:val="20"/>
-                <w:vertAlign w:val="baseline"/>
-              </w:rPr>
-              <w:t>print(f"{'='*70}")</w:t>
-            </w:r>
-          </w:p>
-          <w:p>
-            <w:pPr>
-              <w:widowControl w:val="0"/>
-              <w:jc w:val="both"/>
-              <w:rPr>
-                <w:rFonts w:hint="default" w:ascii="Times New Roman" w:hAnsi="Times New Roman"/>
-                <w:sz w:val="20"/>
-                <w:szCs w:val="20"/>
-                <w:vertAlign w:val="baseline"/>
-              </w:rPr>
-            </w:pPr>
-            <w:r>
-              <w:rPr>
-                <w:rFonts w:hint="default" w:ascii="Times New Roman" w:hAnsi="Times New Roman"/>
-                <w:sz w:val="20"/>
-                <w:szCs w:val="20"/>
-                <w:vertAlign w:val="baseline"/>
-              </w:rPr>
-              <w:t># Save best hybrid detector</w:t>
-            </w:r>
-          </w:p>
-          <w:p>
-            <w:pPr>
-              <w:widowControl w:val="0"/>
-              <w:jc w:val="both"/>
-              <w:rPr>
-                <w:rFonts w:hint="default" w:ascii="Times New Roman" w:hAnsi="Times New Roman" w:cs="Times New Roman"/>
-                <w:sz w:val="20"/>
-                <w:szCs w:val="20"/>
-                <w:vertAlign w:val="baseline"/>
-              </w:rPr>
-            </w:pPr>
-            <w:r>
-              <w:rPr>
-                <w:rFonts w:hint="default" w:ascii="Times New Roman" w:hAnsi="Times New Roman"/>
-                <w:sz w:val="20"/>
-                <w:szCs w:val="20"/>
-                <w:vertAlign w:val="baseline"/>
-              </w:rPr>
-              <w:t>best_hybrid_hyn.save()</w:t>
-            </w:r>
-          </w:p>
-        </w:tc>
-      </w:tr>
-    </w:tbl>
     <w:p>
       <w:pPr>
         <w:pStyle w:val="4"/>
@@ -20244,76 +18245,6 @@
         <w:rPr>
           <w:rFonts w:hint="default" w:ascii="Times New Roman" w:hAnsi="Times New Roman" w:cs="Times New Roman"/>
           <w:color w:val="auto"/>
-        </w:rPr>
-      </w:pPr>
-    </w:p>
-    <w:p>
-      <w:pPr>
-        <w:jc w:val="left"/>
-        <w:rPr>
-          <w:rFonts w:hint="default" w:ascii="Times New Roman" w:hAnsi="Times New Roman" w:eastAsia="Arial" w:cs="Times New Roman"/>
-          <w:b/>
-          <w:bCs/>
-          <w:color w:val="auto"/>
-          <w:sz w:val="28"/>
-          <w:szCs w:val="28"/>
-          <w:lang w:val="en-GB"/>
-        </w:rPr>
-      </w:pPr>
-    </w:p>
-    <w:p>
-      <w:pPr>
-        <w:jc w:val="left"/>
-        <w:rPr>
-          <w:rFonts w:hint="default" w:ascii="Times New Roman" w:hAnsi="Times New Roman" w:eastAsia="Arial" w:cs="Times New Roman"/>
-          <w:b/>
-          <w:bCs/>
-          <w:color w:val="auto"/>
-          <w:sz w:val="28"/>
-          <w:szCs w:val="28"/>
-          <w:lang w:val="en-GB"/>
-        </w:rPr>
-      </w:pPr>
-    </w:p>
-    <w:p>
-      <w:pPr>
-        <w:jc w:val="left"/>
-        <w:rPr>
-          <w:rFonts w:hint="default" w:ascii="Times New Roman" w:hAnsi="Times New Roman" w:eastAsia="Arial" w:cs="Times New Roman"/>
-          <w:b/>
-          <w:bCs/>
-          <w:color w:val="auto"/>
-          <w:sz w:val="28"/>
-          <w:szCs w:val="28"/>
-          <w:lang w:val="en-GB"/>
-        </w:rPr>
-      </w:pPr>
-    </w:p>
-    <w:p>
-      <w:pPr>
-        <w:jc w:val="left"/>
-        <w:rPr>
-          <w:rFonts w:hint="default" w:ascii="Times New Roman" w:hAnsi="Times New Roman" w:eastAsia="Arial" w:cs="Times New Roman"/>
-          <w:b/>
-          <w:bCs/>
-          <w:color w:val="auto"/>
-          <w:sz w:val="28"/>
-          <w:szCs w:val="28"/>
-          <w:lang w:val="en-GB"/>
-        </w:rPr>
-      </w:pPr>
-    </w:p>
-    <w:p>
-      <w:pPr>
-        <w:jc w:val="left"/>
-        <w:rPr>
-          <w:rFonts w:hint="default" w:ascii="Times New Roman" w:hAnsi="Times New Roman" w:eastAsia="Arial" w:cs="Times New Roman"/>
-          <w:b/>
-          <w:bCs/>
-          <w:color w:val="auto"/>
-          <w:sz w:val="28"/>
-          <w:szCs w:val="28"/>
-          <w:lang w:val="en-GB"/>
         </w:rPr>
       </w:pPr>
     </w:p>
@@ -26300,12 +24231,6 @@
             <w:insideH w:val="single" w:color="auto" w:sz="4" w:space="0"/>
             <w:insideV w:val="single" w:color="auto" w:sz="4" w:space="0"/>
           </w:tblBorders>
-          <w:tblCellMar>
-            <w:top w:w="0" w:type="dxa"/>
-            <w:left w:w="10" w:type="dxa"/>
-            <w:bottom w:w="0" w:type="dxa"/>
-            <w:right w:w="10" w:type="dxa"/>
-          </w:tblCellMar>
         </w:tblPrEx>
         <w:tc>
           <w:tcPr>
@@ -43512,7 +41437,6 @@
                 <w:lang w:val="en-GB"/>
               </w:rPr>
             </w:pPr>
-            <w:bookmarkStart w:id="0" w:name="_GoBack"/>
             <w:r>
               <w:rPr>
                 <w:rFonts w:hint="default" w:ascii="Times New Roman" w:hAnsi="Times New Roman" w:cs="Times New Roman"/>
@@ -43523,7 +41447,6 @@
               </w:rPr>
               <w:t>17</w:t>
             </w:r>
-            <w:bookmarkEnd w:id="0"/>
           </w:p>
         </w:tc>
         <w:tc>
@@ -45340,6 +43263,71 @@
           <w:b/>
           <w:bCs/>
           <w:color w:val="1F3864"/>
+          <w:sz w:val="22"/>
+          <w:szCs w:val="22"/>
+        </w:rPr>
+      </w:pPr>
+    </w:p>
+    <w:p>
+      <w:pPr>
+        <w:spacing w:before="80" w:after="40"/>
+        <w:rPr>
+          <w:rFonts w:hint="default" w:ascii="Times New Roman" w:hAnsi="Times New Roman" w:eastAsia="Arial" w:cs="Times New Roman"/>
+          <w:b/>
+          <w:bCs/>
+          <w:color w:val="auto"/>
+          <w:sz w:val="22"/>
+          <w:szCs w:val="22"/>
+        </w:rPr>
+      </w:pPr>
+    </w:p>
+    <w:p>
+      <w:pPr>
+        <w:spacing w:before="80" w:after="40"/>
+        <w:rPr>
+          <w:rFonts w:hint="default" w:ascii="Times New Roman" w:hAnsi="Times New Roman" w:eastAsia="Arial" w:cs="Times New Roman"/>
+          <w:b/>
+          <w:bCs/>
+          <w:color w:val="auto"/>
+          <w:sz w:val="22"/>
+          <w:szCs w:val="22"/>
+        </w:rPr>
+      </w:pPr>
+    </w:p>
+    <w:p>
+      <w:pPr>
+        <w:spacing w:before="80" w:after="40"/>
+        <w:rPr>
+          <w:rFonts w:hint="default" w:ascii="Times New Roman" w:hAnsi="Times New Roman" w:eastAsia="Arial" w:cs="Times New Roman"/>
+          <w:b/>
+          <w:bCs/>
+          <w:color w:val="auto"/>
+          <w:sz w:val="22"/>
+          <w:szCs w:val="22"/>
+        </w:rPr>
+      </w:pPr>
+    </w:p>
+    <w:p>
+      <w:pPr>
+        <w:spacing w:before="80" w:after="40"/>
+        <w:rPr>
+          <w:rFonts w:hint="default" w:ascii="Times New Roman" w:hAnsi="Times New Roman" w:eastAsia="Arial" w:cs="Times New Roman"/>
+          <w:b/>
+          <w:bCs/>
+          <w:color w:val="auto"/>
+          <w:sz w:val="22"/>
+          <w:szCs w:val="22"/>
+        </w:rPr>
+      </w:pPr>
+    </w:p>
+    <w:p>
+      <w:pPr>
+        <w:spacing w:before="80" w:after="40"/>
+        <w:rPr>
+          <w:rFonts w:hint="default" w:ascii="Times New Roman" w:hAnsi="Times New Roman" w:eastAsia="Arial" w:cs="Times New Roman"/>
+          <w:b/>
+          <w:bCs/>
+          <w:color w:val="auto"/>
           <w:sz w:val="22"/>
           <w:szCs w:val="22"/>
         </w:rPr>
@@ -47521,7 +45509,7 @@
       <w:footerReference r:id="rId5" w:type="default"/>
       <w:pgSz w:w="12240" w:h="15840"/>
       <w:pgMar w:top="1440" w:right="1440" w:bottom="1440" w:left="1440" w:header="720" w:footer="720" w:gutter="0"/>
-      <w:pgNumType w:start="2"/>
+      <w:pgNumType w:start="1"/>
       <w:cols w:space="720" w:num="1"/>
       <w:docGrid w:linePitch="360" w:charSpace="0"/>
     </w:sectPr>
@@ -49164,9 +47152,7 @@
 
 <file path=customXml/item1.xml><?xml version="1.0" encoding="utf-8"?>
 <s:customData xmlns="http://www.wps.cn/officeDocument/2013/wpsCustomData" xmlns:s="http://www.wps.cn/officeDocument/2013/wpsCustomData">
-  <customSectProps>
-    <customSectPr/>
-  </customSectProps>
+  <customSectProps/>
   <customShpExts>
     <customShpInfo spid="_x0000_s1026" textRotate="1"/>
   </customShpExts>

</xml_diff>